<commit_message>
Rebuild seminar draft with 7 English and 15 Hebrew sources
Reference list now limited to seven open-access English journal articles;
the rest are Hebrew peer-reviewed articles, position papers and official
sources. Instruments switched to HBSC Israel items. Source table updated
with reserve sources.

Co-Authored-By: Claude Fable 5.1 <noreply@anthropic.com>
Claude-Session: https://claude.ai/code/session_019RaBW72rT1xkbcXD9zJSh3
</commit_message>
<xml_diff>
--- a/seminar/עבודה_סמינריונית_מסכים_שינה_פעילות_גופנית_לקויות_למידה.docx
+++ b/seminar/עבודה_סמינריונית_מסכים_שינה_פעילות_גופנית_לקויות_למידה.docx
@@ -442,7 +442,7 @@
           <w:szCs w:val="24"/>
           <w:rtl/>
         </w:rPr>
-        <w:t xml:space="preserve">היום של תלמיד בישראל מתחלק בין שלוש התנהגויות שכל אחת מהן נחקרה בנפרד במשך שנים: זמן מול מסכים, שעות שינה ופעילות גופנית. בשנים האחרונות התגבשה ההבנה שההתנהגויות האלה אינן נפרדות אלא מתחרות על אותן 24 שעות, ושהאיזון ביניהן קשור לבריאות, לרווחה הנפשית ולתפקוד הלימודי (Tremblay et al., 2016). מחקר בקרב 934 תלמידים בבית ספר אוסטרלי מצא ששני אחוזים בלבד עמדו בשלוש ההמלצות יחד, ושעמידה בהמלצת זמן המסך והקפדה על שעות שינה סדירות בסוף השבוע היו קשורות לציונים גבוהים יותר במתמטיקה ובאנגלית (Howie et al., 2020).</w:t>
+        <w:t xml:space="preserve">היום של תלמיד בישראל מתחלק בין שלוש התנהגויות שכל אחת מהן נחקרה בנפרד במשך שנים: זמן מול מסכים, שעות שינה ופעילות גופנית. בשנים האחרונות התגבשה ההבנה שההתנהגויות האלה אינן נפרדות אלא מתחרות על אותן 24 שעות, ושהאיזון ביניהן קשור לבריאות, לרווחה הנפשית ולתפקוד הלימודי. מחקר בקרב 934 תלמידים בבית ספר אוסטרלי מצא ששני אחוזים בלבד עמדו בשלוש ההמלצות יחד, ושעמידה בהמלצת זמן המסך והקפדה על שעות שינה סדירות בסוף השבוע היו קשורות לציונים גבוהים יותר במתמטיקה ובאנגלית (Howie et al., 2020).</w:t>
       </w:r>
     </w:p>
     <w:p>
@@ -459,7 +459,7 @@
           <w:szCs w:val="24"/>
           <w:rtl/>
         </w:rPr>
-        <w:t xml:space="preserve">העבודה הנוכחית מפנה את השאלה הזאת לאוכלוסייה שכמעט אינה מופיעה במחקרים האלה: תלמידים עם לקויות למידה. לקות למידה היא הפרעה נוירו-התפתחותית שמתבטאת בקושי מתמשך ברכישת קריאה, כתיבה או חשבון, ושכיחותה בקרב ילדים בגיל בית הספר נאמדת בחמישה עד חמישה עשר אחוזים (American Psychiatric Association [APA], 2022). לתלמידים אלה יש סיבות להיות פגיעים יותר לחוסר איזון בין מסכים, שינה ותנועה. מחקרים מצביעים על שיעורים גבוהים של הפרעות שינה בקרב ילדים עם דיסלקציה ועם לקות למידה ספציפית (Jeffcock &amp; Dimitriou, 2025; Saccani et al., 2022), על קשיים מוטוריים שמלווים את הלקות ומקשים על השתתפות בפעילות גופנית (Blanchet &amp; Assaiante, 2022), ועל קשר בין חשיפה מופרזת למסכים לבין דיווח על לקות למידה בסקרים לאומיים (Qu et al., 2023). עם זאת, כמעט אין מחקר שבדק את שלוש ההתנהגויות יחד באוכלוסייה זו, ובוודאי לא בישראל.</w:t>
+        <w:t xml:space="preserve">העבודה הנוכחית מפנה את השאלה הזאת לאוכלוסייה שכמעט אינה מופיעה במחקרים האלה: תלמידים עם לקויות למידה. לקות למידה היא הפרעה נוירו-התפתחותית שמתבטאת בקושי מתמשך ברכישת קריאה, כתיבה או חשבון, והיא מוגדרת בישראל על פי המדריך האבחוני האמריקני (ארן-ארנרייך, 2013; משרד החינוך, ל.ת.). לתלמידים אלה יש סיבות להיות פגיעים יותר לחוסר איזון בין מסכים, שינה ותנועה. מחקרים מצביעים על שיעורים גבוהים של הפרעות שינה בקרב ילדים עם דיסלקציה ועם לקות למידה ספציפית (Jeffcock &amp; Dimitriou, 2025; Saccani et al., 2022) ועל קשיים מוטוריים שמלווים את הלקות ומקשים על השתתפות בפעילות גופנית (Blanchet &amp; Assaiante, 2022). בישראל, ניתוח של נתוני הסקר הארצי HBSC הראה שבני נוער עם מוגבלויות הלומדים בחינוך הכללי נבדלים מעמיתיהם בהרגלי הפעילות הגופנית ובמדדי הרווחה (הראל-פיש ואחרים, 2024). עם זאת, כמעט אין מחקר שבדק את שלוש ההתנהגויות יחד בקרב תלמידים עם לקויות למידה, ובוודאי לא בישראל.</w:t>
       </w:r>
     </w:p>
     <w:p>
@@ -572,7 +572,7 @@
           <w:szCs w:val="24"/>
           <w:rtl/>
         </w:rPr>
-        <w:t xml:space="preserve">המדריך לאבחון סטטיסטי של הפרעות נפשיות במהדורתו העדכנית מגדיר לקות למידה ספציפית (Specific Learning Disorder) כהפרעה נוירו-התפתחותית שבה קשיים ברכישת מיומנויות אקדמיות, קריאה, כתיבה או חשבון, נמשכים שישה חודשים לפחות למרות התערבות ממוקדת. המיומנויות הפגועות נמוכות באופן ניכר מהמצופה לגיל, הן פוגעות בתפקוד הלימודי או היומיומי, מתחילות בשנות בית הספר, ואינן מוסברות על ידי מוגבלות שכלית, ליקוי חושי, הפרעה נפשית או חסך בהוראה. השכיחות בקרב ילדים בגיל בית הספר נאמדת בחמישה עד חמישה עשר אחוזים (APA, 2022).</w:t>
+        <w:t xml:space="preserve">המהדורה החמישית של המדריך האבחוני האמריקני הביאה עמה שינוי מושגי בתחום. במקום המונח "לקות" (Disability) נבחר המונח "הפרעה" (Disorder), ולקות הלמידה הוגדרה כהפרעה נוירו-התפתחותית שבה קשיים ברכישת קריאה, כתיבה או חשבון נמשכים שישה חודשים לפחות למרות התערבות ממוקדת, פוגעים בתפקוד הלימודי או היומיומי, מתחילים בשנות בית הספר ואינם מוסברים על ידי מוגבלות שכלית, ליקוי חושי או חסך בהוראה. ההגדרה עברה מהסתמכות על פער בין אינטליגנציה להישגים אל דרישה לתיעוד של קושי מתמשך שאינו נענה להתערבות, ומכאן שהאבחון מחייב מעקב אחר תגובת התלמיד להוראה ולא מבחן חד-פעמי. השכיחות בקרב ילדים בגיל בית הספר נאמדת בחמישה עד חמישה עשר אחוזים (American Psychiatric Association, 2013, כפי שמצוטט אצל ארן-ארנרייך, 2013).</w:t>
       </w:r>
     </w:p>
     <w:p>
@@ -589,7 +589,7 @@
           <w:szCs w:val="24"/>
           <w:rtl/>
         </w:rPr>
-        <w:t xml:space="preserve">המהדורה החמישית של המדריך הביאה עמה שינוי מושגי. במקום המונח "לקות" (Disability) נבחר המונח "הפרעה" (Disorder), וההגדרה עברה מהסתמכות על פער בין אינטליגנציה להישגים אל דרישה לתיעוד של קושי מתמשך שאינו נענה להתערבות. השינוי הזה מדגיש שהאבחון אינו מסתפק במבחן חד-פעמי אלא מחייב מעקב אחר תגובת התלמיד להוראה (ארן-ארנרייך, 2013). בישראל אימץ משרד החינוך את ההגדרה של המדריך האמריקני כבסיס לאבחון ולמתן התאמות, ואגף לקויות למידה והפרעות קשב בשירות הפסיכולוגי-ייעוצי אחראי על גיבוש המדיניות בתחום (משרד החינוך, ל.ת.). דוח של מרכז המחקר והמידע של הכנסת סקר את הליכי האיתור והאבחון במערכת החינוך והצביע על פערים בין מגזרים ובין שכבות גיל בזמינות האבחון ובמתן ההתאמות (אבגר, 2018).</w:t>
+        <w:t xml:space="preserve">בישראל אימץ משרד החינוך את ההגדרה של המדריך האמריקני כבסיס לאבחון ולמתן התאמות, ואגף לקויות למידה והפרעות קשב בשירות הפסיכולוגי-ייעוצי אחראי על גיבוש המדיניות בתחום (משרד החינוך, ל.ת.). דוח של מרכז המחקר והמידע של הכנסת סקר את הליכי האיתור והאבחון במערכת החינוך והצביע על פערים בין מגזרים ובין שכבות גיל בזמינות האבחון ובמתן ההתאמות (אבגר, 2018).</w:t>
       </w:r>
     </w:p>
     <w:p>
@@ -606,7 +606,7 @@
           <w:szCs w:val="24"/>
           <w:rtl/>
         </w:rPr>
-        <w:t xml:space="preserve">לקות למידה אינה מסתכמת בקושי בקריאה או בחשבון. מחקר ישראלי שהשווה תלמידים עם לקויות למידה לתלמידים ללא לקות מצא שתפקודים ניהוליים וידע עולם תורמים להבנת הנקרא בשתי הקבוצות, ושהפער בתפקודים הניהוליים הוא חלק מהתמונה של הלקות (בשארה ווייס, 2025). תפקודים ניהוליים, ובהם ויסות עצמי, תכנון ועיכוב תגובה, הם בדיוק היכולות שנדרשות כדי להפסיק משחק בטלפון וללכת לישון, או כדי לצאת לאימון במקום להישאר על הספה. סקירה שכללה 34 מחקרים משנת 1990 ועד 2022 מצאה שלתלמידים עם לקות למידה ספציפית מיומנויות מוטוריות נמוכות מאלה של בני גילם, ושהפער גדל ככל שהמשימה המוטורית מורכבת יותר וכאשר קיימת תחלואה נלווית. הכותבות קשרו בין הליקויים המוטוריים לבין אורח חיים יושבני (Blanchet &amp; Assaiante, 2022). בנוסף, לקות למידה מופיעה לעיתים קרובות יחד עם הפרעת קשב, ובמצב של תחלואה כפולה מדווחים קשיים בולטים יותר, ובהם הפרעות שינה (Saccani et al., 2022).</w:t>
+        <w:t xml:space="preserve">לקות למידה אינה מסתכמת בקושי בקריאה או בחשבון. מחקר ישראלי שהשווה תלמידים עם לקויות למידה לתלמידים ללא לקות מצא שתפקודים ניהוליים וידע עולם תורמים להבנת הנקרא בשתי הקבוצות, ושהפער בתפקודים הניהוליים הוא חלק מהתמונה של הלקות (בשארה ווייס, 2025). תפקודים ניהוליים, ובהם ויסות עצמי, תכנון ועיכוב תגובה, הם בדיוק היכולות שנדרשות כדי להפסיק משחק בטלפון וללכת לישון, או כדי לצאת לאימון במקום להישאר על הספה. סקירה שכללה 34 מחקרים משנת 1990 ועד 2022 מצאה שלתלמידים עם לקות למידה ספציפית מיומנויות מוטוריות נמוכות מאלה של בני גילם, ושהפער גדל ככל שהמשימה המוטורית מורכבת יותר וכאשר קיימת תחלואה נלווית. הכותבות קשרו בין הליקויים המוטוריים לבין אורח חיים יושבני (Blanchet &amp; Assaiante, 2022).</w:t>
       </w:r>
     </w:p>
     <w:p>
@@ -623,7 +623,7 @@
           <w:szCs w:val="24"/>
           <w:rtl/>
         </w:rPr>
-        <w:t xml:space="preserve">שלושת המאפיינים האלה, קשיים בוויסות עצמי, קשיים מוטוריים ופגיעות לשינה לקויה, הם הרקע לשאלה של העבודה הנוכחית. הם מרמזים שתלמידים עם לקויות למידה עשויים להתקשות יותר מאחרים לשמור על איזון בין מסכים, שינה ותנועה, ושחוסר איזון כזה עלול להעמיק את הקושי הלימודי.</w:t>
+        <w:t xml:space="preserve">לקות למידה מופיעה לעיתים קרובות יחד עם הפרעת קשב. נייר עמדה של העמותה הישראלית לריפוי בעיסוק מתאר את הפגיעה של הפרעת קשב בהשתתפות בעיסוקי היום-יום, בלמידה ובפנאי, ואת הצורך בהתערבות שמכוונת לשגרות היומיומיות ולא רק לתסמינים (העמותה הישראלית לריפוי בעיסוק, 2017). במצב של תחלואה כפולה של לקות למידה והפרעת קשב מדווחים קשיים בולטים יותר, ובהם הפרעות שינה (Saccani et al., 2022). שלושת המאפיינים האלה, קשיים בוויסות עצמי, קשיים מוטוריים ופגיעות לשינה לקויה, הם הרקע לשאלה של העבודה הנוכחית. הם מרמזים שתלמידים עם לקויות למידה עשויים להתקשות יותר מאחרים לשמור על איזון בין מסכים, שינה ותנועה, ושחוסר איזון כזה עלול להעמיק את הקושי הלימודי.</w:t>
       </w:r>
     </w:p>
     <w:p>
@@ -660,7 +660,7 @@
           <w:szCs w:val="24"/>
           <w:rtl/>
         </w:rPr>
-        <w:t xml:space="preserve">ההנחיות הקנדיות לתנועה במהלך 24 שעות, הראשונות שאיחדו את שלוש ההתנהגויות למסמך אחד, ממליצות לילדים ולבני נוער בגילי 5 עד 17 להגביל את זמן המסך לצורכי פנאי לשעתיים ביום לכל היותר (Tremblay et al., 2016). מטא-אנליזה שכללה 387,437 משתתפים מ-23 מדינות מצאה שרוב הילדים ובני הנוער אינם עומדים בשלוש ההמלצות, שאחד מכל חמישה אינו עומד באף אחת מהן, ושהעמידה בהמלצות יורדת בגיל ההתבגרות, במיוחד בקרב בנות (Tapia-Serrano et al., 2022).</w:t>
+        <w:t xml:space="preserve">ההמלצה המקובלת בעולם, שאומצה גם במחקר האוסטרלי שעליו נשענת עבודה זו, היא להגביל את זמן המסך לצורכי פנאי לשעתיים ביום לכל היותר (Howie et al., 2020). משרד הבריאות בישראל פרסם בספטמבר 2026 המלצות מדורגות לפי גיל: הימנעות מלאה ממסכים עד גיל שנתיים, עד שעה ביום בגילי שנתיים עד חמש, פחות משעתיים ביום בגילי שש עד תשע, סמארטפון לא לפני גיל 13, רשתות חברתיות לא לפני גיל 15, והרחקת מסכים מחדרי השינה. המשרד נימק את ההמלצות בממצאי סקר HBSC שלפיהם 28.7 אחוזים מתלמידי כיתות ז' עד י"ב מבלים שש שעות ומעלה מול מסכים מחוץ לשעות הלימודים, ובהשלכות של השימוש על השינה, על הלמידה ועל הבריאות הנפשית (משרד הבריאות, 2026).</w:t>
       </w:r>
     </w:p>
     <w:p>
@@ -677,7 +677,7 @@
           <w:szCs w:val="24"/>
           <w:rtl/>
         </w:rPr>
-        <w:t xml:space="preserve">ההשלכות של חשיפה מרובה למסכים נחקרו בעיקר בתחום הבריאות הנפשית. סקירה שיטתית של 50 מחקרים מצאה שהסמארטפון הוא המכשיר הנפוץ ביותר בקרב מתבגרים, ששימוש בו בימי חול קשור לרווחה נפשית נמוכה יותר, ושהשימוש ברשתות חברתיות קשור לסיכון מוגבר לדיכאון בקרב בנות (Santos et al., 2023). ניתוח של סקר לאומי בארצות הברית שכלל 50,231 ילדים ומתבגרים בגילי 6 עד 17 מצא שזמן מסך של ארבע שעות ביום או יותר קשור לסיכון גבוה יותר לחרדה, לדיכאון, לבעיות התנהגות ולהפרעת קשב. הממצא החשוב לעבודה זו הוא שהקשר תווך במידה רבה על ידי שתי ההתנהגויות האחרות: פעילות גופנית הסבירה בין 30.9 ל-38.9 אחוזים מהקשר, שעת שינה לא סדירה הסבירה בין 18.4 ל-23.9 אחוזים, ומשך שינה קצר הסביר עוד כמה אחוזים (Dai &amp; Ouyang, 2026). במילים אחרות, חלק ניכר מהנזק של המסכים עובר דרך מה שהם דוחקים החוצה.</w:t>
+        <w:t xml:space="preserve">סקר שערך איגוד האינטרנט הישראלי בקיץ 2022 בקרב בני נוער והורים מצא ש-54 אחוזים מבני הנוער בחברה היהודית החילונית מדווחים על ארבע עד שמונה שעות מסך ביום, ו-11 אחוזים נוספים על יותר משמונה שעות. בחברה הערבית השיעור המדווח על ארבע עד שמונה שעות ביום הגיע ל-67 אחוזים, ובחברה היהודית-דתית הוא היה הנמוך ביותר, 41 אחוזים (איגוד האינטרנט הישראלי, 2022). הפער בין ההמלצה של שעתיים לבין הדיווח בפועל הוא פער של פי שניים עד פי ארבעה, ומכאן שהשאלה המחקרית המעניינת אינה אם תלמידים חורגים מההמלצה אלא כמה, ומה זה עושה לשאר היממה שלהם.</w:t>
       </w:r>
     </w:p>
     <w:p>
@@ -694,7 +694,7 @@
           <w:szCs w:val="24"/>
           <w:rtl/>
         </w:rPr>
-        <w:t xml:space="preserve">בנוגע ללקויות למידה עצמן, ניתוח של סקר לאומי אמריקני משנים 2018 עד 2020 מצא שזמן מסך מופרז קשור לדיווח הורים על לקות למידה, על הפרעת קשב, על עיכוב התפתחותי ועל הפרעות שפה, וכי הקשר חזק יותר בקרב בנים ובקרב ילדים בגיל הגן (Qu et al., 2023). המחקר הוא רוחבי ואינו יכול לומר מה קדם למה: ייתכן שילדים שהלמידה קשה להם פונים יותר למסכים, וייתכן שהמסכים מעמיקים את הקושי. מחקר טורקי שהשווה 86 מתבגרים עם הפרעת קשב ולקות למידה ל-86 מתבגרים עם הפרעת קשב בלבד לא מצא הבדל בזמן המסך היומי או בחומרת השימוש הבעייתי, אך מצא שהקבוצה עם לקות הלמידה עסקה במגוון מצומצם יותר של פעילויות מסך והעדיפה פחות משחקי אסטרטגיה ומשחקי חשיבה. המסקנה הייתה שלקות הלמידה מעצבת את אופי השימוש ולא בהכרח את כמותו (Kocabas et al., 2025). סקירה שיטתית ומטא-אנליזה שאספה את המחקרים על היקף זמן המסך בקרב ילדים ובני נוער עם מוגבלויות מגיל לידה ועד 17 מיינה את הנתונים לפי גיל ולפי סוג המוגבלות (Vanderloo et al., 2025). מיפוי כזה ממחיש עד כמה הידע על תלמידים עם לקויות למידה בפרט עדיין דל, ומכאן הצורך במחקרים ממוקדים.</w:t>
+        <w:t xml:space="preserve">בנוגע ללקויות למידה עצמן, המחקר היחיד שנמצא שהשווה ישירות בין קבוצות הוא מחקר טורקי בקרב 86 מתבגרים עם הפרעת קשב ולקות למידה ו-86 מתבגרים עם הפרעת קשב בלבד. המחקר לא מצא הבדל בזמן המסך היומי או בחומרת השימוש הבעייתי, אך מצא שהקבוצה עם לקות הלמידה עסקה במגוון מצומצם יותר של פעילויות מסך והעדיפה פחות משחקי אסטרטגיה ומשחקי חשיבה. המסקנה הייתה שלקות הלמידה מעצבת את אופי השימוש ולא בהכרח את כמותו (Kocabas et al., 2025). מחקר זה כלל רק מתבגרים עם הפרעת קשב, ולכן אינו יכול לומר דבר על תלמידים עם לקות למידה בלבד. הפער הזה בספרות הוא אחת הסיבות למחקר הנוכחי.</w:t>
       </w:r>
     </w:p>
     <w:p>
@@ -731,7 +731,7 @@
           <w:szCs w:val="24"/>
           <w:rtl/>
         </w:rPr>
-        <w:t xml:space="preserve">ההמלצות המקובלות הן תשע עד אחת עשרה שעות שינה בלילה לילדים בגילי 5 עד 13 ושמונה עד עשר שעות למתבגרים בגילי 14 עד 17 (Tremblay et al., 2016). הקשר בין מדיה אלקטרונית לשינה נחקר רבות. סקירה שיטתית של מחקרים ממדינות מערביות בקרב ילדים עד גיל 15 סיכמה שהשימוש במדיה קשור לשעת שינה מאוחרת יותר, למשך שינה קצר יותר ולפגיעה באיכות השינה, ושהקשר נמצא בסוגי מדיה שונים ובשיטות מדידה שונות (Lund et al., 2021). בישראל, מחקר בקרב 470 תלמידי כיתות ח' ו-ט' מצא שחשיפה לטלוויזיה ולמחשב, ובעיקר נוכחות של מכשירים בחדר השינה, קשורה לשעת שינה מאוחרת, למשך שינה קצר ולישנוניות ולעייפות בשעות היום (Shochat et al., 2010). המחקר נערך לפני עידן הסמארטפון, ומכאן שממצאיו ככל הנראה ממעיטים בהיקף התופעה כיום.</w:t>
+        <w:t xml:space="preserve">ההמלצות המקובלות הן תשע עד אחת עשרה שעות שינה בלילה לילדים בגילי 5 עד 13 ושמונה עד עשר שעות למתבגרים בגילי 14 עד 17 (Howie et al., 2020). שינה אינה זמן מת. במהלכה המוח מעבד ומגבש את מה שנלמד במשך היום, ושינה חסרה פוגעת בקשב, בזיכרון ובוויסות הרגשי. לכל אדם קצב פנימי משלו שמשתנה עם הגיל, ובגיל ההתבגרות השעון הביולוגי נוטה להתאחר, כך שמתבגרים מתקשים להירדם מוקדם ומתקשים לקום לבית הספר (גספר ואחרים, 2020).</w:t>
       </w:r>
     </w:p>
     <w:p>
@@ -748,7 +748,7 @@
           <w:szCs w:val="24"/>
           <w:rtl/>
         </w:rPr>
-        <w:t xml:space="preserve">שינה חסרה אינה רק עניין של עייפות. מחקר איטלקי שבדק 191 תלמידי בית ספר יסודי באמצעות סוללת מבחנים נוירופסיכולוגית מצא שישנוניות בשעות היום קשורה לתפקוד נמוך יותר במגוון מיומנויות קוגניטיביות ולימודיות, ובהן קריאה, כתיבה, הבנת הנקרא וחשבון (Macchitella et al., 2020). אלה בדיוק התחומים שבהם תלמידים עם לקויות למידה מתקשים ממילא.</w:t>
+        <w:t xml:space="preserve">הקשר בין מדיה אלקטרונית לשינה נחקר רבות. סקירה שיטתית של מחקרים ממדינות מערביות בקרב ילדים עד גיל 15 סיכמה שהשימוש במדיה קשור לשעת שינה מאוחרת יותר, למשך שינה קצר יותר ולפגיעה באיכות השינה, ושהקשר נמצא בסוגי מדיה שונים ובשיטות מדידה שונות (Lund et al., 2021). ההמלצה הישראלית להרחיק מסכים מחדרי השינה נשענת על אותם ממצאים (משרד הבריאות, 2026). במחקר האוסטרלי, משך השינה הכולל לא היה קשור לציונים, אך שעת שינה מאוחרת בסוף השבוע הייתה קשורה לירידה בהישגים, ומכאן שסדירות השינה חשובה לא פחות מכמותה (Howie et al., 2020).</w:t>
       </w:r>
     </w:p>
     <w:p>
@@ -802,7 +802,7 @@
           <w:szCs w:val="24"/>
           <w:rtl/>
         </w:rPr>
-        <w:t xml:space="preserve">ארגון הבריאות העולמי ממליץ לילדים ולמתבגרים על ממוצע של 60 דקות ביום של פעילות גופנית אירובית בעצימות בינונית עד גבוהה, ועל הגבלת זמן יושבני ובמיוחד זמן מסך לצורכי פנאי. ההמלצה נוסחה במהדורת 2020 כממוצע שבועי ולא כדרישה יומית קשיחה, בעקבות ממצאים שקשרו את התועלת הבריאותית לממוצע היומי (Bull et al., 2020). בישראל, ניתוח של נתוני סקר HBSC בקרב כ-7,000 תלמידי כיתות ו', ח' ו-י' בחינוך הממלכתי, הממלכתי-דתי והממלכתי-ערבי מצא שבנים פעילים גופנית בתדירות גבוהה מבנות, ושגורמים ברמת התלמיד וברמת בית הספר מנבאים יחד את הרגלי הפעילות (בק ואחרים, 2018).</w:t>
+        <w:t xml:space="preserve">נייר העמדה של ההסתדרות הרפואית בישראל ממליץ לילדים ולבני נוער על 60 דקות ביום לפחות של פעילות גופנית בעצימות בינונית עד גבוהה, רובה אירובית, בשילוב אימוני כוח מותאמים לגיל שלוש פעמים בשבוע, ומדגיש שאפשר לצבור את הזמן במקטעים לאורך היום (דובנוב-רז ואחרים, 2019). המצב בפועל רחוק מההמלצה. ניתוח של נתוני סקר HBSC בקרב כ-7,000 תלמידי כיתות ו', ח' ו-י' בחינוך הממלכתי, הממלכתי-דתי והממלכתי-ערבי מצא שבנים פעילים גופנית בתדירות גבוהה מבנות, ושגורמים ברמת התלמיד וברמת בית הספר מנבאים יחד את הרגלי הפעילות (בק ואחרים, 2018). מעקב אחר מגמות בין השנים 2010 ל-2018 בקרב תלמידים בגילי 12 עד 18 מצא הבדלים בתדירות ובמשך הפעילות הגופנית לפי סוג הפיקוח, כיתה, מגדר ומעמד חברתי-כלכלי (פחימה ואחרים, 2024). מחקר נוסף על אותו בסיס נתונים הראה שאהבה לשיעורי החינוך הגופני ומשך הפעילות בהם משמשים גורם מגן מפני התנהגויות סיכון בקרב בני נוער, בהבדלים לפי גיל ומגדר (ניסנהולץ-גנות ואחרים, 2021).</w:t>
       </w:r>
     </w:p>
     <w:p>
@@ -819,7 +819,7 @@
           <w:szCs w:val="24"/>
           <w:rtl/>
         </w:rPr>
-        <w:t xml:space="preserve">לתלמידים עם לקויות למידה יש מכשול נוסף בדרך לפעילות גופנית. הסקירה של בלאנשה ואסאיאנטה (Blanchet &amp; Assaiante, 2022) הראתה שקשיים מוטוריים מלווים את הלקות אצל חלק ניכר מהתלמידים, וכי תלמיד שמתקשה בתיאום ובאיזון נוטה להימנע ממשחקי כדור ומספורט תחרותי. ההימנעות מצמצמת את ההתנסות המוטורית, וכך נוצר מעגל של הימנעות ואורח חיים יושבני שמותיר יותר זמן פנוי למסכים.</w:t>
+        <w:t xml:space="preserve">הקשר בין פעילות גופנית להישגים לימודיים בישראל אינו פשוט. מחקר בקרב תלמידי תיכון מצא שבנות העוסקות בספורט הישגי הן בעלות ההישגים הלימודיים הגבוהים ביותר, ואילו בקרב בנים נמצא קשר שלילי בין ספורט הישגי להישגים, ומכאן שהתועלת הלימודית של הפעילות תלויה במגדר ובאופי הפעילות (שחף ואחרים, 2014). ממצא זה מזכיר שאי אפשר להניח מראש שיותר פעילות פירושה יותר הצלחה בלימודים, ושיש למדוד את סוג הפעילות ולא רק את כמותה.</w:t>
       </w:r>
     </w:p>
     <w:p>
@@ -836,7 +836,7 @@
           <w:szCs w:val="24"/>
           <w:rtl/>
         </w:rPr>
-        <w:t xml:space="preserve">לצד זאת, פעילות גופנית היא גם אמצעי התערבות. מטא-אנליזה של מחקרי התערבות בקרב ילדים ומתבגרים עם הפרעות נוירו-התפתחותיות מצאה שתוכניות פעילות גופנית שיפרו את יעילות השינה, את משך השינה ואת רצף השינה כשנמדדו באופן אובייקטיבי. ההשפעה הייתה גדולה יותר בתוכניות שנמשכו יותר מ-12 שבועות, בתדירות של שלוש פעמים בשבוע לפחות ובמפגשים של יותר משעה (Wang et al., 2024). ממצא זה מחבר בין שתי ההתנהגויות: הגברת הפעילות הגופנית עשויה להיות דרך לשפר את השינה של תלמידים עם לקויות למידה, גם בלי להתמודד ישירות עם המסכים.</w:t>
+        <w:t xml:space="preserve">לתלמידים עם לקויות למידה יש מכשול נוסף בדרך לפעילות גופנית. הסקירה של בלאנשה ואסאיאנטה (Blanchet &amp; Assaiante, 2022) הראתה שקשיים מוטוריים מלווים את הלקות אצל חלק ניכר מהתלמידים, וכי תלמיד שמתקשה בתיאום ובאיזון נוטה להימנע ממשחקי כדור ומספורט תחרותי. ההימנעות מצמצמת את ההתנסות המוטורית, וכך נוצר מעגל של הימנעות ואורח חיים יושבני שמותיר יותר זמן פנוי למסכים. בישראל, מחקר שהשווה בין דירוג הורים לדירוג מורים לחינוך גופני בשאלוני איתור של הפרעה התפתחותית בקואורדינציה מצא הסכמה גבוהה בין השניים, והראה שהמורה לחינוך גופני יכול לשמש גורם מאתר של קשיים מוטוריים בבית הספר (עוגב ויזדי-עוגב, 2024). ניתוח של נתוני HBSC 2018-2019 בקרב כ-13,800 תלמידים בגילי 11 עד 17 השווה בין בני נוער עם מוגבלויות חושיות, פיזיות, קוגניטיביות והתנהגותיות הלומדים בחינוך הכללי לבין עמיתיהם, במדדי פעילות גופנית, התנהגויות סיכון, רווחה נפשית וחוסן (הראל-פיש ואחרים, 2024). זהו המחקר הישראלי הקרוב ביותר לשאלת העבודה הנוכחית, אך הוא איגד סוגי מוגבלות שונים לקבוצה אחת ולא בדק זמן מסך ושינה במקביל.</w:t>
       </w:r>
     </w:p>
     <w:p>
@@ -873,7 +873,7 @@
           <w:szCs w:val="24"/>
           <w:rtl/>
         </w:rPr>
-        <w:t xml:space="preserve">נקודת המוצא התיאורטית של העבודה היא ההנחיות הקנדיות לתנועה במהלך 24 שעות. עד לפרסומן נבחנו פעילות גופנית, התנהגות יושבנית ושינה כל אחת לחוד. ההנחיות המשולבות יצאו מההנחה ששלוש ההתנהגויות מתקיימות באותה יממה, מתחרות זו בזו על הזמן ונוטות להתקבץ יחד, כך ששיפור באחת עשוי לגרור שיפור באחרות (Tremblay et al., 2016). מכאן שגם מחקר על תלמידים עם לקויות למידה צריך למדוד את שלושתן במקביל.</w:t>
+        <w:t xml:space="preserve">נקודת המוצא התיאורטית של העבודה היא התפיסה שפעילות גופנית, התנהגות יושבנית ושינה מתקיימות באותה יממה, מתחרות זו בזו על הזמן ונוטות להתקבץ יחד, כך ששיפור באחת עשוי לגרור שיפור באחרות. תפיסה זו עומדת בבסיס ההנחיות המשולבות לתנועה במהלך 24 שעות, שעליהן נשען המחקר האוסטרלי (Howie et al., 2020). מכאן שגם מחקר על תלמידים עם לקויות למידה צריך למדוד את שלושתן במקביל.</w:t>
       </w:r>
     </w:p>
     <w:p>
@@ -890,7 +890,7 @@
           <w:szCs w:val="24"/>
           <w:rtl/>
         </w:rPr>
-        <w:t xml:space="preserve">המחקר של האווי ואחרים (Howie et al., 2020) הוא הבסיס האמפירי המרכזי לעבודה זו ולכן יתואר בפירוט. המחקר נערך בבית ספר אוסטרלי שבו כל תלמיד מביא מכשיר משלו ללמידה, סביבה שבה המסך הוא כלי לימודי ולא רק בידור. 934 תלמידי כיתות ה' עד י"ב דיווחו על הרגלי השינה, הפעילות הגופנית וההתנהגות היושבנית שלהם, וההישגים הלימודיים נלקחו מרשומות בית הספר. 74 אחוזים מהתלמידים עמדו בהמלצת השינה, 21 אחוזים בהמלצת הפעילות הגופנית ו-15 אחוזים בלבד בהמלצת זמן המסך. שני אחוזים עמדו בשלוש ההמלצות יחד. תלמידים שעמדו בהמלצת זמן המסך קיבלו בממוצע 5.8 נקודות יותר במדד הלימודי הכללי, 7.9 נקודות יותר במתמטיקה ו-3.8 נקודות יותר באנגלית. משך השינה הכולל לא היה קשור לציונים, אך שעת שינה מאוחרת בסוף השבוע הייתה קשורה לירידה של 3.4 נקודות במדד הכללי. תלמידים שעמדו בשתי המלצות לפחות, 23 אחוזים מהמדגם, הציגו הישגים גבוהים יותר בכל המקצועות. הכותבים הסיקו שסדירות השינה חשובה לא פחות מכמותה, ושתוכניות התערבות צריכות לפנות לשלוש ההתנהגויות יחד ולא לאחת מהן בלבד (Howie et al., 2020).</w:t>
+        <w:t xml:space="preserve">המחקר של האווי ואחרים (Howie et al., 2020) הוא הבסיס האמפירי המרכזי לעבודה זו ולכן יתואר בפירוט. המחקר נערך בבית ספר אוסטרלי שבו כל תלמיד מביא מכשיר משלו ללמידה, סביבה שבה המסך הוא כלי לימודי ולא רק בידור. 934 תלמידי כיתות ה' עד י"ב דיווחו על הרגלי השינה, הפעילות הגופנית וההתנהגות היושבנית שלהם, וההישגים הלימודיים נלקחו מרשומות בית הספר. 74 אחוזים מהתלמידים עמדו בהמלצת השינה, 21 אחוזים בהמלצת הפעילות הגופנית ו-15 אחוזים בלבד בהמלצת זמן המסך. שני אחוזים עמדו בשלוש ההמלצות יחד. תלמידים שעמדו בהמלצת זמן המסך קיבלו בממוצע 5.8 נקודות יותר במדד הלימודי הכללי, 7.9 נקודות יותר במתמטיקה ו-3.8 נקודות יותר באנגלית. שעת שינה מאוחרת בסוף השבוע הייתה קשורה לירידה של 3.4 נקודות במדד הכללי, ומשחק לא מובנה בזמן הפנוי היה קשור לירידה קטנה של נקודה אחת. תלמידים שעמדו בשתי המלצות לפחות, 23 אחוזים מהמדגם, הציגו הישגים גבוהים יותר בכל המקצועות. הכותבים הסיקו שתוכניות התערבות צריכות לפנות לשלוש ההתנהגויות יחד ולא לאחת מהן בלבד (Howie et al., 2020).</w:t>
       </w:r>
     </w:p>
     <w:p>
@@ -907,24 +907,7 @@
           <w:szCs w:val="24"/>
           <w:rtl/>
         </w:rPr>
-        <w:t xml:space="preserve">ממצאים דומים התקבלו במדגמים גדולים ובגילים שונים. בקרב 67,281 ילדים ומתבגרים בסין, עמידה בשלוש ההמלצות הייתה קשורה לסיכוי גבוה יותר להישגים טובים בסינית, במתמטיקה ובאנגלית, ויחסי הסיכויים נעו בין 1.51 ל-1.73. גם כאן, הרכיב שהיה קשור באופן העקבי ביותר להישגים היה העמידה בהמלצת זמן המסך, לבדה או בשילוב עם המלצה אחרת (Chen et al., 2024). מחקר פולני בקרב 114 ילדים בני 8 עד 9 בחן לא ציונים אלא מיומנויות יסוד לקריאה ולכתיבה, ומצא שפעילות גופנית בעצימות בינונית עד גבוהה קשורה לאינטגרציה חזותית-שמיעתית טובה יותר, שאי-עמידה בהמלצת השינה קשורה לאינטגרציה חזותית-שמיעתית נמוכה יותר, ושאי-עמידה בהמלצת זמן המסך קשורה לאינטגרציה תפיסתית-מוטורית נמוכה יותר (Korcz et al., 2023). המיומנויות האלה הן הבסיס לרכישת הקריאה, ולכן הממצא רלוונטי במיוחד ללקויות למידה.</w:t>
-      </w:r>
-    </w:p>
-    <w:p>
-      <w:pPr>
-        <w:bidi/>
-        <w:spacing w:after="120" w:line="360"/>
-        <w:ind w:firstLine="709"/>
-        <w:jc w:val="both"/>
-      </w:pPr>
-      <w:r>
-        <w:rPr>
-          <w:rFonts w:ascii="Times New Roman" w:cs="David" w:eastAsia="David" w:hAnsi="Times New Roman"/>
-          <w:sz w:val="24"/>
-          <w:szCs w:val="24"/>
-          <w:rtl/>
-        </w:rPr>
-        <w:t xml:space="preserve">סיכום הספרות מעלה תמונה עקבית: זמן מסך, שינה ופעילות גופנית קשורים זה לזה ולתפקוד הלימודי, וההשפעה החזקה ביותר על ההישגים מיוחסת לזמן המסך ולסדירות השינה. הפער הוא שכל המחקרים האלה נערכו באוכלוסייה הכללית. אין בהם קבוצה נפרדת של תלמידים עם לקויות למידה, ואין דרך לדעת אם הקשרים חזקים יותר, חלשים יותר או שונים באופיים אצל תלמידים אלה.</w:t>
+        <w:t xml:space="preserve">ממצאים דומים התקבלו במדגם גדול בהרבה. בקרב 67,281 ילדים ומתבגרים בסין, עמידה בשלוש ההמלצות הייתה קשורה לסיכוי גבוה יותר להישגים טובים בסינית, במתמטיקה ובאנגלית, ויחסי הסיכויים נעו בין 1.51 ל-1.73. גם כאן, הרכיב שהיה קשור באופן העקבי ביותר להישגים היה העמידה בהמלצת זמן המסך, לבדה או בשילוב עם המלצה אחרת (Chen et al., 2024). סיכום הספרות מעלה תמונה עקבית: זמן מסך, שינה ופעילות גופנית קשורים זה לזה ולתפקוד הלימודי, וההשפעה החזקה ביותר על ההישגים מיוחסת לזמן המסך ולסדירות השינה. הפער הוא שכל המחקרים האלה נערכו באוכלוסייה הכללית. אין בהם קבוצה נפרדת של תלמידים עם לקויות למידה, ואין דרך לדעת אם הקשרים חזקים יותר, חלשים יותר או שונים באופיים אצל תלמידים אלה.</w:t>
       </w:r>
     </w:p>
     <w:p>
@@ -944,7 +927,27 @@
           <w:szCs w:val="28"/>
           <w:rtl/>
         </w:rPr>
-        <w:t xml:space="preserve">1.6 תמונת המצב בישראל</w:t>
+        <w:t xml:space="preserve">1.6 רציונל המחקר, מטרת המחקר, שאלות המחקר והשערות המחקר</w:t>
+      </w:r>
+    </w:p>
+    <w:p>
+      <w:pPr>
+        <w:pStyle w:val="Heading3"/>
+        <w:bidi/>
+        <w:spacing w:after="100" w:before="200" w:line="360"/>
+        <w:jc w:val="right"/>
+      </w:pPr>
+      <w:r>
+        <w:rPr>
+          <w:rFonts w:ascii="Times New Roman" w:cs="David" w:eastAsia="David" w:hAnsi="Times New Roman"/>
+          <w:b/>
+          <w:bCs/>
+          <w:color w:val="000000"/>
+          <w:sz w:val="24"/>
+          <w:szCs w:val="24"/>
+          <w:rtl/>
+        </w:rPr>
+        <w:t xml:space="preserve">רציונל המחקר</w:t>
       </w:r>
     </w:p>
     <w:p>
@@ -961,41 +964,397 @@
           <w:szCs w:val="24"/>
           <w:rtl/>
         </w:rPr>
-        <w:t xml:space="preserve">סקר שערך איגוד האינטרנט הישראלי בקיץ 2022 בקרב בני נוער והורים מצא ש-54 אחוזים מבני הנוער בחברה היהודית החילונית מדווחים על ארבע עד שמונה שעות מסך ביום, ו-11 אחוזים נוספים על יותר משמונה שעות. בחברה הערבית השיעור המדווח על ארבע עד שמונה שעות ביום הגיע ל-67 אחוזים, ובחברה היהודית-דתית הוא היה הנמוך ביותר, 41 אחוזים (איגוד האינטרנט הישראלי, 2022). בספטמבר 2026 פרסם משרד הבריאות המלצות חדשות להורים בליווי קמפיין ציבורי: הימנעות מלאה ממסכים עד גיל שנתיים, עד שעה ביום בגילי שנתיים עד חמש, פחות משעתיים ביום בגילי שש עד תשע, סמארטפון לא לפני גיל 13, רשתות חברתיות לא לפני גיל 15, והרחקת מסכים מחדרי השינה. המשרד נימק את ההמלצות בממצאי סקר HBSC שלפיהם 28.7 אחוזים מתלמידי כיתות ז' עד י"ב מבלים שש שעות ומעלה מול מסכים מחוץ לשעות הלימודים, ובהשלכות של השימוש על השינה, על הלמידה ועל הבריאות הנפשית (משרד הבריאות, 2026).</w:t>
-      </w:r>
-    </w:p>
-    <w:p>
-      <w:pPr>
-        <w:bidi/>
-        <w:spacing w:after="120" w:line="360"/>
-        <w:ind w:firstLine="709"/>
-        <w:jc w:val="both"/>
-      </w:pPr>
-      <w:r>
-        <w:rPr>
-          <w:rFonts w:ascii="Times New Roman" w:cs="David" w:eastAsia="David" w:hAnsi="Times New Roman"/>
-          <w:sz w:val="24"/>
-          <w:szCs w:val="24"/>
-          <w:rtl/>
-        </w:rPr>
-        <w:t xml:space="preserve">בתחום הפעילות הגופנית, נתוני HBSC מעידים על שיעורי פעילות נמוכים בקרב תלמידי ישראל בהשוואה בינלאומית, עם פערים מובהקים בין בנים לבנות ובין מגזרים (בק ואחרים, 2018). בחברה הערבית בישראל, מחקר שסקר 490 הורים בתקופת הקורונה מצא ירידה בזמן הפעילות הגופנית של הילדים, עלייה בהתנהגות היושבנית ובמשך השינה, וירידה בשיעור הילדים שעמדו בהמלצות לפעילות גופנית ולהתנהגות יושבנית (Ghanamah et al., 2023). המחקר מעיד על כך שדפוסי ההתנהגות רגישים לשינויים סביבתיים, ושכאשר מסגרת בית הספר נחלשת המסכים ממלאים את החלל.</w:t>
-      </w:r>
-    </w:p>
-    <w:p>
-      <w:pPr>
-        <w:bidi/>
-        <w:spacing w:after="120" w:line="360"/>
-        <w:ind w:firstLine="709"/>
-        <w:jc w:val="both"/>
-      </w:pPr>
-      <w:r>
-        <w:rPr>
-          <w:rFonts w:ascii="Times New Roman" w:cs="David" w:eastAsia="David" w:hAnsi="Times New Roman"/>
-          <w:sz w:val="24"/>
-          <w:szCs w:val="24"/>
-          <w:rtl/>
-        </w:rPr>
-        <w:t xml:space="preserve">לעומת שפע הנתונים על כלל התלמידים, לא נמצא בחיפוש הספרות מחקר ישראלי שבדק זמן מסך, שינה ופעילות גופנית בקרב תלמידים עם לקויות למידה. נתוני הרקע קיימים: הדוח של מרכז המחקר והמידע של הכנסת מתאר את היקף האוכלוסייה ואת דרכי האיתור והאבחון (אבגר, 2018), ומחקרים ישראליים בדקו את המאפיינים הקוגניטיביים של תלמידים אלה (בשארה ווייס, 2025). את החוליה שביניהם, ההרגלים היומיומיים, אין.</w:t>
+        <w:t xml:space="preserve">הספרות מציגה שלושה קווים שאינם נפגשים. הקו הראשון מראה שזמן מסך, שינה ופעילות גופנית קשורים זה לזה ולהישגים הלימודיים באוכלוסייה הכללית (Chen et al., 2024; Howie et al., 2020). הקו השני מראה שתלמידים עם לקויות למידה סובלים משיעורים גבוהים של הפרעות שינה ומקשיים מוטוריים, ושהם עשויים להשתמש במסכים באופן שונה (Blanchet &amp; Assaiante, 2022; Jeffcock &amp; Dimitriou, 2025; Kocabas et al., 2025; Saccani et al., 2022). הקו השלישי מציג את היקף השימוש במסכים ואת שיעורי הפעילות הגופנית הנמוכים בישראל, לצד ההמלצות החדשות (איגוד האינטרנט הישראלי, 2022; בק ואחרים, 2018; משרד הבריאות, 2026; פחימה ואחרים, 2024). המחקר הנוכחי מחבר את שלושת הקווים ובודק את דפוסי שלוש ההתנהגויות, את הקשרים ביניהן ואת הקשר שלהן לתפקוד הלימודי, בקרב תלמידים עם לקויות למידה בישראל.</w:t>
+      </w:r>
+    </w:p>
+    <w:p>
+      <w:pPr>
+        <w:pStyle w:val="Heading3"/>
+        <w:bidi/>
+        <w:spacing w:after="100" w:before="200" w:line="360"/>
+        <w:jc w:val="right"/>
+      </w:pPr>
+      <w:r>
+        <w:rPr>
+          <w:rFonts w:ascii="Times New Roman" w:cs="David" w:eastAsia="David" w:hAnsi="Times New Roman"/>
+          <w:b/>
+          <w:bCs/>
+          <w:color w:val="000000"/>
+          <w:sz w:val="24"/>
+          <w:szCs w:val="24"/>
+          <w:rtl/>
+        </w:rPr>
+        <w:t xml:space="preserve">מטרת המחקר</w:t>
+      </w:r>
+    </w:p>
+    <w:p>
+      <w:pPr>
+        <w:bidi/>
+        <w:spacing w:after="120" w:line="360"/>
+        <w:jc w:val="both"/>
+      </w:pPr>
+      <w:r>
+        <w:rPr>
+          <w:rFonts w:ascii="Times New Roman" w:cs="David" w:eastAsia="David" w:hAnsi="Times New Roman"/>
+          <w:sz w:val="24"/>
+          <w:szCs w:val="24"/>
+          <w:rtl/>
+        </w:rPr>
+        <w:t xml:space="preserve">למחקר שלוש מטרות:</w:t>
+      </w:r>
+    </w:p>
+    <w:p>
+      <w:pPr>
+        <w:pStyle w:val="ListParagraph"/>
+        <w:numPr>
+          <w:ilvl w:val="0"/>
+          <w:numId w:val="2"/>
+        </w:numPr>
+        <w:bidi/>
+        <w:spacing w:after="60" w:line="360"/>
+        <w:jc w:val="both"/>
+      </w:pPr>
+      <w:r>
+        <w:rPr>
+          <w:rFonts w:ascii="Times New Roman" w:cs="David" w:eastAsia="David" w:hAnsi="Times New Roman"/>
+          <w:sz w:val="24"/>
+          <w:szCs w:val="24"/>
+          <w:rtl/>
+        </w:rPr>
+        <w:t xml:space="preserve">לתאר את היקף החשיפה למסכים, את משך השינה ואיכותה ואת היקף הפעילות הגופנית בקרב תלמידים עם לקויות למידה, ואת שיעור התלמידים העומדים בהמלצות המקובלות.</w:t>
+      </w:r>
+    </w:p>
+    <w:p>
+      <w:pPr>
+        <w:pStyle w:val="ListParagraph"/>
+        <w:numPr>
+          <w:ilvl w:val="0"/>
+          <w:numId w:val="2"/>
+        </w:numPr>
+        <w:bidi/>
+        <w:spacing w:after="60" w:line="360"/>
+        <w:jc w:val="both"/>
+      </w:pPr>
+      <w:r>
+        <w:rPr>
+          <w:rFonts w:ascii="Times New Roman" w:cs="David" w:eastAsia="David" w:hAnsi="Times New Roman"/>
+          <w:sz w:val="24"/>
+          <w:szCs w:val="24"/>
+          <w:rtl/>
+        </w:rPr>
+        <w:t xml:space="preserve">לבחון את הקשרים בין שלוש ההתנהגויות לבין עצמן ובינן לבין התפקוד הלימודי המדווח.</w:t>
+      </w:r>
+    </w:p>
+    <w:p>
+      <w:pPr>
+        <w:pStyle w:val="ListParagraph"/>
+        <w:numPr>
+          <w:ilvl w:val="0"/>
+          <w:numId w:val="2"/>
+        </w:numPr>
+        <w:bidi/>
+        <w:spacing w:after="60" w:line="360"/>
+        <w:jc w:val="both"/>
+      </w:pPr>
+      <w:r>
+        <w:rPr>
+          <w:rFonts w:ascii="Times New Roman" w:cs="David" w:eastAsia="David" w:hAnsi="Times New Roman"/>
+          <w:sz w:val="24"/>
+          <w:szCs w:val="24"/>
+          <w:rtl/>
+        </w:rPr>
+        <w:t xml:space="preserve">להשוות בין תלמידים עם לקויות למידה לבין תלמידים ללא לקויות למידה בדפוסי ההתנהגות ובשיעור העמידה בהמלצות.</w:t>
+      </w:r>
+    </w:p>
+    <w:p>
+      <w:pPr>
+        <w:pStyle w:val="Heading3"/>
+        <w:bidi/>
+        <w:spacing w:after="100" w:before="200" w:line="360"/>
+        <w:jc w:val="right"/>
+      </w:pPr>
+      <w:r>
+        <w:rPr>
+          <w:rFonts w:ascii="Times New Roman" w:cs="David" w:eastAsia="David" w:hAnsi="Times New Roman"/>
+          <w:b/>
+          <w:bCs/>
+          <w:color w:val="000000"/>
+          <w:sz w:val="24"/>
+          <w:szCs w:val="24"/>
+          <w:rtl/>
+        </w:rPr>
+        <w:t xml:space="preserve">שאלות המחקר</w:t>
+      </w:r>
+    </w:p>
+    <w:p>
+      <w:pPr>
+        <w:pStyle w:val="ListParagraph"/>
+        <w:numPr>
+          <w:ilvl w:val="0"/>
+          <w:numId w:val="3"/>
+        </w:numPr>
+        <w:bidi/>
+        <w:spacing w:after="60" w:line="360"/>
+        <w:jc w:val="both"/>
+      </w:pPr>
+      <w:r>
+        <w:rPr>
+          <w:rFonts w:ascii="Times New Roman" w:cs="David" w:eastAsia="David" w:hAnsi="Times New Roman"/>
+          <w:sz w:val="24"/>
+          <w:szCs w:val="24"/>
+          <w:rtl/>
+        </w:rPr>
+        <w:t xml:space="preserve">מהם דפוסי החשיפה למסכים, השינה והפעילות הגופנית בקרב תלמידים עם לקויות למידה, ואיזה שיעור מהם עומד בכל אחת מההמלצות ובשלושתן יחד?</w:t>
+      </w:r>
+    </w:p>
+    <w:p>
+      <w:pPr>
+        <w:pStyle w:val="ListParagraph"/>
+        <w:numPr>
+          <w:ilvl w:val="0"/>
+          <w:numId w:val="3"/>
+        </w:numPr>
+        <w:bidi/>
+        <w:spacing w:after="60" w:line="360"/>
+        <w:jc w:val="both"/>
+      </w:pPr>
+      <w:r>
+        <w:rPr>
+          <w:rFonts w:ascii="Times New Roman" w:cs="David" w:eastAsia="David" w:hAnsi="Times New Roman"/>
+          <w:sz w:val="24"/>
+          <w:szCs w:val="24"/>
+          <w:rtl/>
+        </w:rPr>
+        <w:t xml:space="preserve">האם קיים קשר בין היקף החשיפה למסכים לבין משך השינה, שעת השינה והישנוניות בשעות היום בקרב תלמידים עם לקויות למידה?</w:t>
+      </w:r>
+    </w:p>
+    <w:p>
+      <w:pPr>
+        <w:pStyle w:val="ListParagraph"/>
+        <w:numPr>
+          <w:ilvl w:val="0"/>
+          <w:numId w:val="3"/>
+        </w:numPr>
+        <w:bidi/>
+        <w:spacing w:after="60" w:line="360"/>
+        <w:jc w:val="both"/>
+      </w:pPr>
+      <w:r>
+        <w:rPr>
+          <w:rFonts w:ascii="Times New Roman" w:cs="David" w:eastAsia="David" w:hAnsi="Times New Roman"/>
+          <w:sz w:val="24"/>
+          <w:szCs w:val="24"/>
+          <w:rtl/>
+        </w:rPr>
+        <w:t xml:space="preserve">האם קיים קשר בין היקף החשיפה למסכים לבין היקף הפעילות הגופנית בקרב תלמידים עם לקויות למידה?</w:t>
+      </w:r>
+    </w:p>
+    <w:p>
+      <w:pPr>
+        <w:pStyle w:val="ListParagraph"/>
+        <w:numPr>
+          <w:ilvl w:val="0"/>
+          <w:numId w:val="3"/>
+        </w:numPr>
+        <w:bidi/>
+        <w:spacing w:after="60" w:line="360"/>
+        <w:jc w:val="both"/>
+      </w:pPr>
+      <w:r>
+        <w:rPr>
+          <w:rFonts w:ascii="Times New Roman" w:cs="David" w:eastAsia="David" w:hAnsi="Times New Roman"/>
+          <w:sz w:val="24"/>
+          <w:szCs w:val="24"/>
+          <w:rtl/>
+        </w:rPr>
+        <w:t xml:space="preserve">האם קיים קשר בין החשיפה למסכים, השינה והפעילות הגופנית לבין התפקוד הלימודי המדווח של תלמידים עם לקויות למידה?</w:t>
+      </w:r>
+    </w:p>
+    <w:p>
+      <w:pPr>
+        <w:pStyle w:val="ListParagraph"/>
+        <w:numPr>
+          <w:ilvl w:val="0"/>
+          <w:numId w:val="3"/>
+        </w:numPr>
+        <w:bidi/>
+        <w:spacing w:after="60" w:line="360"/>
+        <w:jc w:val="both"/>
+      </w:pPr>
+      <w:r>
+        <w:rPr>
+          <w:rFonts w:ascii="Times New Roman" w:cs="David" w:eastAsia="David" w:hAnsi="Times New Roman"/>
+          <w:sz w:val="24"/>
+          <w:szCs w:val="24"/>
+          <w:rtl/>
+        </w:rPr>
+        <w:t xml:space="preserve">האם קיימים הבדלים בין תלמידים עם לקויות למידה לבין תלמידים ללא לקויות למידה בדפוסי ההתנהגות ובשיעור העמידה בהמלצות?</w:t>
+      </w:r>
+    </w:p>
+    <w:p>
+      <w:pPr>
+        <w:pStyle w:val="Heading3"/>
+        <w:bidi/>
+        <w:spacing w:after="100" w:before="200" w:line="360"/>
+        <w:jc w:val="right"/>
+      </w:pPr>
+      <w:r>
+        <w:rPr>
+          <w:rFonts w:ascii="Times New Roman" w:cs="David" w:eastAsia="David" w:hAnsi="Times New Roman"/>
+          <w:b/>
+          <w:bCs/>
+          <w:color w:val="000000"/>
+          <w:sz w:val="24"/>
+          <w:szCs w:val="24"/>
+          <w:rtl/>
+        </w:rPr>
+        <w:t xml:space="preserve">השערות המחקר</w:t>
+      </w:r>
+    </w:p>
+    <w:p>
+      <w:pPr>
+        <w:pStyle w:val="ListParagraph"/>
+        <w:numPr>
+          <w:ilvl w:val="0"/>
+          <w:numId w:val="4"/>
+        </w:numPr>
+        <w:bidi/>
+        <w:spacing w:after="60" w:line="360"/>
+        <w:jc w:val="both"/>
+      </w:pPr>
+      <w:r>
+        <w:rPr>
+          <w:rFonts w:ascii="Times New Roman" w:cs="David" w:eastAsia="David" w:hAnsi="Times New Roman"/>
+          <w:sz w:val="24"/>
+          <w:szCs w:val="24"/>
+          <w:rtl/>
+        </w:rPr>
+        <w:t xml:space="preserve">יימצא קשר שלילי בין היקף החשיפה למסכים לבין משך השינה, וקשר חיובי בין היקף החשיפה למסכים לבין שעת שינה מאוחרת ובינו לבין ישנוניות בשעות היום (Lund et al., 2021).</w:t>
+      </w:r>
+    </w:p>
+    <w:p>
+      <w:pPr>
+        <w:pStyle w:val="ListParagraph"/>
+        <w:numPr>
+          <w:ilvl w:val="0"/>
+          <w:numId w:val="4"/>
+        </w:numPr>
+        <w:bidi/>
+        <w:spacing w:after="60" w:line="360"/>
+        <w:jc w:val="both"/>
+      </w:pPr>
+      <w:r>
+        <w:rPr>
+          <w:rFonts w:ascii="Times New Roman" w:cs="David" w:eastAsia="David" w:hAnsi="Times New Roman"/>
+          <w:sz w:val="24"/>
+          <w:szCs w:val="24"/>
+          <w:rtl/>
+        </w:rPr>
+        <w:t xml:space="preserve">יימצא קשר שלילי בין היקף החשיפה למסכים לבין היקף הפעילות הגופנית (Howie et al., 2020).</w:t>
+      </w:r>
+    </w:p>
+    <w:p>
+      <w:pPr>
+        <w:pStyle w:val="ListParagraph"/>
+        <w:numPr>
+          <w:ilvl w:val="0"/>
+          <w:numId w:val="4"/>
+        </w:numPr>
+        <w:bidi/>
+        <w:spacing w:after="60" w:line="360"/>
+        <w:jc w:val="both"/>
+      </w:pPr>
+      <w:r>
+        <w:rPr>
+          <w:rFonts w:ascii="Times New Roman" w:cs="David" w:eastAsia="David" w:hAnsi="Times New Roman"/>
+          <w:sz w:val="24"/>
+          <w:szCs w:val="24"/>
+          <w:rtl/>
+        </w:rPr>
+        <w:t xml:space="preserve">יימצא קשר שלילי בין היקף החשיפה למסכים לבין התפקוד הלימודי המדווח, וקשר חיובי בין עמידה בהמלצות השינה והפעילות הגופנית לבין התפקוד הלימודי המדווח (Chen et al., 2024; Howie et al., 2020).</w:t>
+      </w:r>
+    </w:p>
+    <w:p>
+      <w:pPr>
+        <w:pStyle w:val="ListParagraph"/>
+        <w:numPr>
+          <w:ilvl w:val="0"/>
+          <w:numId w:val="4"/>
+        </w:numPr>
+        <w:bidi/>
+        <w:spacing w:after="60" w:line="360"/>
+        <w:jc w:val="both"/>
+      </w:pPr>
+      <w:r>
+        <w:rPr>
+          <w:rFonts w:ascii="Times New Roman" w:cs="David" w:eastAsia="David" w:hAnsi="Times New Roman"/>
+          <w:sz w:val="24"/>
+          <w:szCs w:val="24"/>
+          <w:rtl/>
+        </w:rPr>
+        <w:t xml:space="preserve">תלמידים שעומדים בשתי המלצות לפחות ידווחו על תפקוד לימודי גבוה יותר מתלמידים שעומדים בהמלצה אחת או באף אחת (Howie et al., 2020).</w:t>
+      </w:r>
+    </w:p>
+    <w:p>
+      <w:pPr>
+        <w:pStyle w:val="ListParagraph"/>
+        <w:numPr>
+          <w:ilvl w:val="0"/>
+          <w:numId w:val="4"/>
+        </w:numPr>
+        <w:bidi/>
+        <w:spacing w:after="60" w:line="360"/>
+        <w:jc w:val="both"/>
+      </w:pPr>
+      <w:r>
+        <w:rPr>
+          <w:rFonts w:ascii="Times New Roman" w:cs="David" w:eastAsia="David" w:hAnsi="Times New Roman"/>
+          <w:sz w:val="24"/>
+          <w:szCs w:val="24"/>
+          <w:rtl/>
+        </w:rPr>
+        <w:t xml:space="preserve">תלמידים עם לקויות למידה ידווחו על משך שינה קצר יותר, על ישנוניות רבה יותר ועל פעילות גופנית מועטה יותר בהשוואה לתלמידים ללא לקויות למידה, ושיעור העומדים בשלוש ההמלצות יחד יהיה נמוך יותר בקרבם (Blanchet &amp; Assaiante, 2022; Jeffcock &amp; Dimitriou, 2025; Saccani et al., 2022).</w:t>
+      </w:r>
+    </w:p>
+    <w:p>
+      <w:pPr>
+        <w:bidi/>
+        <w:spacing w:after="120" w:line="360"/>
+        <w:jc w:val="both"/>
+      </w:pPr>
+      <w:r>
+        <w:rPr>
+          <w:rFonts w:ascii="Times New Roman" w:cs="David" w:eastAsia="David" w:hAnsi="Times New Roman"/>
+          <w:sz w:val="24"/>
+          <w:szCs w:val="24"/>
+          <w:rtl/>
+        </w:rPr>
+        <w:t xml:space="preserve">לגבי היקף החשיפה למסכים לא מנוסחת השערה מכוונת, מאחר שהמחקר היחיד שהשווה ישירות בין קבוצות לא מצא הבדל בכמות השימוש אלא באופיו (Kocabas et al., 2025). שאלה זו תיבדק כשאלה פתוחה.</w:t>
+      </w:r>
+    </w:p>
+    <w:p>
+      <w:r>
+        <w:br w:type="page"/>
+      </w:r>
+    </w:p>
+    <w:p>
+      <w:pPr>
+        <w:pStyle w:val="Heading1"/>
+        <w:bidi/>
+        <w:spacing w:after="240" w:before="240" w:line="360"/>
+        <w:jc w:val="right"/>
+      </w:pPr>
+      <w:r>
+        <w:rPr>
+          <w:rFonts w:ascii="Times New Roman" w:cs="David" w:eastAsia="David" w:hAnsi="Times New Roman"/>
+          <w:b/>
+          <w:bCs/>
+          <w:color w:val="000000"/>
+          <w:sz w:val="32"/>
+          <w:szCs w:val="32"/>
+          <w:rtl/>
+        </w:rPr>
+        <w:t xml:space="preserve">פרק 2: שיטת המחקר</w:t>
       </w:r>
     </w:p>
     <w:p>
@@ -1015,14 +1374,131 @@
           <w:szCs w:val="28"/>
           <w:rtl/>
         </w:rPr>
-        <w:t xml:space="preserve">1.7 רציונל המחקר, מטרת המחקר, שאלות המחקר והשערות המחקר</w:t>
-      </w:r>
-    </w:p>
-    <w:p>
-      <w:pPr>
-        <w:pStyle w:val="Heading3"/>
-        <w:bidi/>
-        <w:spacing w:after="100" w:before="200" w:line="360"/>
+        <w:t xml:space="preserve">2.1 מערך המחקר</w:t>
+      </w:r>
+    </w:p>
+    <w:p>
+      <w:pPr>
+        <w:bidi/>
+        <w:spacing w:after="120" w:line="360"/>
+        <w:ind w:firstLine="709"/>
+        <w:jc w:val="both"/>
+      </w:pPr>
+      <w:r>
+        <w:rPr>
+          <w:rFonts w:ascii="Times New Roman" w:cs="David" w:eastAsia="David" w:hAnsi="Times New Roman"/>
+          <w:sz w:val="24"/>
+          <w:szCs w:val="24"/>
+          <w:rtl/>
+        </w:rPr>
+        <w:t xml:space="preserve">המחקר כמותי, במערך רוחבי (חתך) מתאמי-השוואתי. הנתונים נאספים בנקודת זמן אחת באמצעות שאלון דיווח עצמי אנונימי. המערך המתאמי משרת את שאלות המחקר השנייה עד הרביעית, העוסקות בקשרים בין משתנים, והמערך ההשוואתי משרת את השאלה החמישית, העוסקת בהבדלים בין שתי קבוצות. הבחירה במערך רוחבי נובעת ממסגרת הזמן של עבודה סמינריונית ומכך שהמחקר הראשון בתחום באוכלוסייה זו בישראל נועד לתאר ולמפות ולא להוכיח סיבתיות. המערך דומה לזה ששימש במחקר האוסטרלי (Howie et al., 2020) ובמחקרים הישראליים שנשענו על נתוני HBSC (בק ואחרים, 2018; הראל-פיש ואחרים, 2024).</w:t>
+      </w:r>
+    </w:p>
+    <w:p>
+      <w:pPr>
+        <w:bidi/>
+        <w:spacing w:after="120" w:line="360"/>
+        <w:jc w:val="both"/>
+      </w:pPr>
+      <w:r>
+        <w:rPr>
+          <w:rFonts w:ascii="Times New Roman" w:cs="David" w:eastAsia="David" w:hAnsi="Times New Roman"/>
+          <w:sz w:val="24"/>
+          <w:szCs w:val="24"/>
+          <w:rtl/>
+        </w:rPr>
+        <w:t xml:space="preserve">משתני המחקר:</w:t>
+      </w:r>
+    </w:p>
+    <w:p>
+      <w:pPr>
+        <w:pStyle w:val="ListParagraph"/>
+        <w:numPr>
+          <w:ilvl w:val="0"/>
+          <w:numId w:val="5"/>
+        </w:numPr>
+        <w:bidi/>
+        <w:spacing w:after="60" w:line="360"/>
+        <w:jc w:val="both"/>
+      </w:pPr>
+      <w:r>
+        <w:rPr>
+          <w:rFonts w:ascii="Times New Roman" w:cs="David" w:eastAsia="David" w:hAnsi="Times New Roman"/>
+          <w:sz w:val="24"/>
+          <w:szCs w:val="24"/>
+          <w:rtl/>
+        </w:rPr>
+        <w:t xml:space="preserve">משתנים בלתי תלויים: היקף החשיפה למסכים (שעות ביום בימי חול ובסוף שבוע, ונוכחות מסכים בחדר השינה); משך השינה ושעת השינה; היקף הפעילות הגופנית.</w:t>
+      </w:r>
+    </w:p>
+    <w:p>
+      <w:pPr>
+        <w:pStyle w:val="ListParagraph"/>
+        <w:numPr>
+          <w:ilvl w:val="0"/>
+          <w:numId w:val="5"/>
+        </w:numPr>
+        <w:bidi/>
+        <w:spacing w:after="60" w:line="360"/>
+        <w:jc w:val="both"/>
+      </w:pPr>
+      <w:r>
+        <w:rPr>
+          <w:rFonts w:ascii="Times New Roman" w:cs="David" w:eastAsia="David" w:hAnsi="Times New Roman"/>
+          <w:sz w:val="24"/>
+          <w:szCs w:val="24"/>
+          <w:rtl/>
+        </w:rPr>
+        <w:t xml:space="preserve">משתנים תלויים: ישנוניות בשעות היום; תפקוד לימודי מדווח (ממוצע ציונים מדווח ותפקוד יומי בלמידה).</w:t>
+      </w:r>
+    </w:p>
+    <w:p>
+      <w:pPr>
+        <w:pStyle w:val="ListParagraph"/>
+        <w:numPr>
+          <w:ilvl w:val="0"/>
+          <w:numId w:val="5"/>
+        </w:numPr>
+        <w:bidi/>
+        <w:spacing w:after="60" w:line="360"/>
+        <w:jc w:val="both"/>
+      </w:pPr>
+      <w:r>
+        <w:rPr>
+          <w:rFonts w:ascii="Times New Roman" w:cs="David" w:eastAsia="David" w:hAnsi="Times New Roman"/>
+          <w:sz w:val="24"/>
+          <w:szCs w:val="24"/>
+          <w:rtl/>
+        </w:rPr>
+        <w:t xml:space="preserve">משתנה קבוצתי: קיום אבחנה של לקות למידה (קבוצת המחקר) לעומת היעדר אבחנה (קבוצת ההשוואה).</w:t>
+      </w:r>
+    </w:p>
+    <w:p>
+      <w:pPr>
+        <w:pStyle w:val="ListParagraph"/>
+        <w:numPr>
+          <w:ilvl w:val="0"/>
+          <w:numId w:val="5"/>
+        </w:numPr>
+        <w:bidi/>
+        <w:spacing w:after="60" w:line="360"/>
+        <w:jc w:val="both"/>
+      </w:pPr>
+      <w:r>
+        <w:rPr>
+          <w:rFonts w:ascii="Times New Roman" w:cs="David" w:eastAsia="David" w:hAnsi="Times New Roman"/>
+          <w:sz w:val="24"/>
+          <w:szCs w:val="24"/>
+          <w:rtl/>
+        </w:rPr>
+        <w:t xml:space="preserve">משתני רקע: מין, גיל, כיתה, מגזר, אבחנה נלווית של הפרעת קשב, נטילת טיפול תרופתי.</w:t>
+      </w:r>
+    </w:p>
+    <w:p>
+      <w:pPr>
+        <w:pStyle w:val="Heading2"/>
+        <w:bidi/>
+        <w:spacing w:after="120" w:before="240" w:line="360"/>
         <w:jc w:val="right"/>
       </w:pPr>
       <w:r>
@@ -1031,11 +1507,11 @@
           <w:b/>
           <w:bCs/>
           <w:color w:val="000000"/>
-          <w:sz w:val="24"/>
-          <w:szCs w:val="24"/>
-          <w:rtl/>
-        </w:rPr>
-        <w:t xml:space="preserve">רציונל המחקר</w:t>
+          <w:sz w:val="28"/>
+          <w:szCs w:val="28"/>
+          <w:rtl/>
+        </w:rPr>
+        <w:t xml:space="preserve">2.2 אוכלוסיית המחקר והמדגם</w:t>
       </w:r>
     </w:p>
     <w:p>
@@ -1052,14 +1528,31 @@
           <w:szCs w:val="24"/>
           <w:rtl/>
         </w:rPr>
-        <w:t xml:space="preserve">הספרות מציגה שלושה קווים שאינם נפגשים. הקו הראשון מראה שזמן מסך, שינה ופעילות גופנית קשורים זה לזה ולהישגים הלימודיים באוכלוסייה הכללית (Chen et al., 2024; Howie et al., 2020; Tremblay et al., 2016). הקו השני מראה שתלמידים עם לקויות למידה סובלים משיעורים גבוהים של הפרעות שינה ומקשיים מוטוריים, ושהם עשויים להשתמש במסכים באופן שונה (Blanchet &amp; Assaiante, 2022; Jeffcock &amp; Dimitriou, 2025; Kocabas et al., 2025; Saccani et al., 2022). הקו השלישי מציג את היקף השימוש במסכים בישראל ואת ההמלצות החדשות (איגוד האינטרנט הישראלי, 2022; משרד הבריאות, 2026). המחקר הנוכחי מחבר את שלושת הקווים ובודק את דפוסי שלוש ההתנהגויות, את הקשרים ביניהן ואת הקשר שלהן לתפקוד הלימודי, בקרב תלמידים עם לקויות למידה בישראל.</w:t>
-      </w:r>
-    </w:p>
-    <w:p>
-      <w:pPr>
-        <w:pStyle w:val="Heading3"/>
-        <w:bidi/>
-        <w:spacing w:after="100" w:before="200" w:line="360"/>
+        <w:t xml:space="preserve">אוכלוסיית המחקר היא תלמידי כיתות ז' עד י"ב במערכת החינוך בישראל. קבוצת המחקר כוללת תלמידים בעלי אבחון תקף של לקות למידה (אבחון דידקטי או פסיכו-דידקטי) המקבלים התאמות בלמידה או בבחינות. קבוצת ההשוואה כוללת תלמידים מאותן שכבות גיל ללא אבחון של לקות למידה. גודל המדגם המתוכנן הוא 120 תלמידים: 60 בקבוצת המחקר ו-60 בקבוצת ההשוואה, בטווח הגילים 12 עד 18. חישוב מקדים באמצעות מחשבון עוצמה סטטיסטית מראה שמדגם של 60 בכל קבוצה מאפשר לזהות הבדל בגודל אפקט בינוני (d = 0.5) בעוצמה של כ-77 אחוזים ברמת מובהקות של 5 אחוזים, ומדגם של 60 בקבוצת המחקר מאפשר לזהות מתאם בינוני (r = 0.35) בעוצמה דומה. אם קבוצת ההשוואה לא תגויס במלואה, השערות המחקר הראשונה עד הרביעית ניתנות לבדיקה בקבוצת המחקר בלבד.</w:t>
+      </w:r>
+    </w:p>
+    <w:p>
+      <w:pPr>
+        <w:bidi/>
+        <w:spacing w:after="120" w:line="360"/>
+        <w:ind w:firstLine="709"/>
+        <w:jc w:val="both"/>
+      </w:pPr>
+      <w:r>
+        <w:rPr>
+          <w:rFonts w:ascii="Times New Roman" w:cs="David" w:eastAsia="David" w:hAnsi="Times New Roman"/>
+          <w:sz w:val="24"/>
+          <w:szCs w:val="24"/>
+          <w:rtl/>
+        </w:rPr>
+        <w:t xml:space="preserve">הדגימה היא דגימת נוחות. התלמידים יגויסו בשניים עד שלושה בתי ספר על-יסודיים שבהם פועל מרכז תמיכה או רכז לקויות למידה, באמצעות פנייה למנהלים וליועצות. קבוצת ההשוואה תגויס מאותם בתי ספר ומאותן שכבות גיל, כדי לצמצם הבדלים סביבתיים בין הקבוצות. קריטריוני הכללה לקבוצת המחקר: אבחון לקות למידה שתועד בבית הספר, גיל 12 עד 18, שליטה בשפת השאלון. קריטריוני אי-הכללה לשתי הקבוצות: מוגבלות שכלית, אבחנה של אוטיזם, לקות חושית שאינה מתוקנת, או מחלה כרונית שמגבילה פעילות גופנית. תלמידים עם הפרעת קשב נלווית ייכללו בקבוצת המחקר, ומשתנה זה יירשם ויבוקר בניתוח, בהתאם לממצאים על תחלואה כפולה (Saccani et al., 2022).</w:t>
+      </w:r>
+    </w:p>
+    <w:p>
+      <w:pPr>
+        <w:pStyle w:val="Heading2"/>
+        <w:bidi/>
+        <w:spacing w:after="120" w:before="240" w:line="360"/>
         <w:jc w:val="right"/>
       </w:pPr>
       <w:r>
@@ -1068,90 +1561,28 @@
           <w:b/>
           <w:bCs/>
           <w:color w:val="000000"/>
-          <w:sz w:val="24"/>
-          <w:szCs w:val="24"/>
-          <w:rtl/>
-        </w:rPr>
-        <w:t xml:space="preserve">מטרת המחקר</w:t>
-      </w:r>
-    </w:p>
-    <w:p>
-      <w:pPr>
-        <w:bidi/>
-        <w:spacing w:after="120" w:line="360"/>
-        <w:jc w:val="both"/>
-      </w:pPr>
-      <w:r>
-        <w:rPr>
-          <w:rFonts w:ascii="Times New Roman" w:cs="David" w:eastAsia="David" w:hAnsi="Times New Roman"/>
-          <w:sz w:val="24"/>
-          <w:szCs w:val="24"/>
-          <w:rtl/>
-        </w:rPr>
-        <w:t xml:space="preserve">למחקר שלוש מטרות:</w:t>
-      </w:r>
-    </w:p>
-    <w:p>
-      <w:pPr>
-        <w:pStyle w:val="ListParagraph"/>
-        <w:numPr>
-          <w:ilvl w:val="0"/>
-          <w:numId w:val="2"/>
-        </w:numPr>
-        <w:bidi/>
-        <w:spacing w:after="60" w:line="360"/>
-        <w:jc w:val="both"/>
-      </w:pPr>
-      <w:r>
-        <w:rPr>
-          <w:rFonts w:ascii="Times New Roman" w:cs="David" w:eastAsia="David" w:hAnsi="Times New Roman"/>
-          <w:sz w:val="24"/>
-          <w:szCs w:val="24"/>
-          <w:rtl/>
-        </w:rPr>
-        <w:t xml:space="preserve">לתאר את היקף החשיפה למסכים, את משך השינה ואיכותה ואת היקף הפעילות הגופנית בקרב תלמידים עם לקויות למידה, ואת שיעור התלמידים העומדים בהמלצות המקובלות.</w:t>
-      </w:r>
-    </w:p>
-    <w:p>
-      <w:pPr>
-        <w:pStyle w:val="ListParagraph"/>
-        <w:numPr>
-          <w:ilvl w:val="0"/>
-          <w:numId w:val="2"/>
-        </w:numPr>
-        <w:bidi/>
-        <w:spacing w:after="60" w:line="360"/>
-        <w:jc w:val="both"/>
-      </w:pPr>
-      <w:r>
-        <w:rPr>
-          <w:rFonts w:ascii="Times New Roman" w:cs="David" w:eastAsia="David" w:hAnsi="Times New Roman"/>
-          <w:sz w:val="24"/>
-          <w:szCs w:val="24"/>
-          <w:rtl/>
-        </w:rPr>
-        <w:t xml:space="preserve">לבחון את הקשרים בין שלוש ההתנהגויות לבין עצמן ובינן לבין התפקוד הלימודי המדווח.</w:t>
-      </w:r>
-    </w:p>
-    <w:p>
-      <w:pPr>
-        <w:pStyle w:val="ListParagraph"/>
-        <w:numPr>
-          <w:ilvl w:val="0"/>
-          <w:numId w:val="2"/>
-        </w:numPr>
-        <w:bidi/>
-        <w:spacing w:after="60" w:line="360"/>
-        <w:jc w:val="both"/>
-      </w:pPr>
-      <w:r>
-        <w:rPr>
-          <w:rFonts w:ascii="Times New Roman" w:cs="David" w:eastAsia="David" w:hAnsi="Times New Roman"/>
-          <w:sz w:val="24"/>
-          <w:szCs w:val="24"/>
-          <w:rtl/>
-        </w:rPr>
-        <w:t xml:space="preserve">להשוות בין תלמידים עם לקויות למידה לבין תלמידים ללא לקויות למידה בדפוסי ההתנהגות ובשיעור העמידה בהמלצות.</w:t>
+          <w:sz w:val="28"/>
+          <w:szCs w:val="28"/>
+          <w:rtl/>
+        </w:rPr>
+        <w:t xml:space="preserve">2.3 כלי המחקר</w:t>
+      </w:r>
+    </w:p>
+    <w:p>
+      <w:pPr>
+        <w:bidi/>
+        <w:spacing w:after="120" w:line="360"/>
+        <w:ind w:firstLine="709"/>
+        <w:jc w:val="both"/>
+      </w:pPr>
+      <w:r>
+        <w:rPr>
+          <w:rFonts w:ascii="Times New Roman" w:cs="David" w:eastAsia="David" w:hAnsi="Times New Roman"/>
+          <w:sz w:val="24"/>
+          <w:szCs w:val="24"/>
+          <w:rtl/>
+        </w:rPr>
+        <w:t xml:space="preserve">כלי המחקר הוא שאלון סגור לדיווח עצמי שמורכב מחמישה חלקים. השאלון המלא מובא בנספח א'. משך המילוי המשוער הוא 15 עד 20 דקות. ככל האפשר נעשה שימוש בפריטים שכבר הועברו לתלמידים בישראל במסגרת סקר HBSC, כדי לאפשר השוואה לנתונים הארציים.</w:t>
       </w:r>
     </w:p>
     <w:p>
@@ -1171,112 +1602,23 @@
           <w:szCs w:val="24"/>
           <w:rtl/>
         </w:rPr>
-        <w:t xml:space="preserve">שאלות המחקר</w:t>
-      </w:r>
-    </w:p>
-    <w:p>
-      <w:pPr>
-        <w:pStyle w:val="ListParagraph"/>
-        <w:numPr>
-          <w:ilvl w:val="0"/>
-          <w:numId w:val="3"/>
-        </w:numPr>
-        <w:bidi/>
-        <w:spacing w:after="60" w:line="360"/>
-        <w:jc w:val="both"/>
-      </w:pPr>
-      <w:r>
-        <w:rPr>
-          <w:rFonts w:ascii="Times New Roman" w:cs="David" w:eastAsia="David" w:hAnsi="Times New Roman"/>
-          <w:sz w:val="24"/>
-          <w:szCs w:val="24"/>
-          <w:rtl/>
-        </w:rPr>
-        <w:t xml:space="preserve">מהם דפוסי החשיפה למסכים, השינה והפעילות הגופנית בקרב תלמידים עם לקויות למידה, ואיזה שיעור מהם עומד בכל אחת מההמלצות ובשלושתן יחד?</w:t>
-      </w:r>
-    </w:p>
-    <w:p>
-      <w:pPr>
-        <w:pStyle w:val="ListParagraph"/>
-        <w:numPr>
-          <w:ilvl w:val="0"/>
-          <w:numId w:val="3"/>
-        </w:numPr>
-        <w:bidi/>
-        <w:spacing w:after="60" w:line="360"/>
-        <w:jc w:val="both"/>
-      </w:pPr>
-      <w:r>
-        <w:rPr>
-          <w:rFonts w:ascii="Times New Roman" w:cs="David" w:eastAsia="David" w:hAnsi="Times New Roman"/>
-          <w:sz w:val="24"/>
-          <w:szCs w:val="24"/>
-          <w:rtl/>
-        </w:rPr>
-        <w:t xml:space="preserve">האם קיים קשר בין היקף החשיפה למסכים לבין משך השינה, שעת השינה והישנוניות בשעות היום בקרב תלמידים עם לקויות למידה?</w:t>
-      </w:r>
-    </w:p>
-    <w:p>
-      <w:pPr>
-        <w:pStyle w:val="ListParagraph"/>
-        <w:numPr>
-          <w:ilvl w:val="0"/>
-          <w:numId w:val="3"/>
-        </w:numPr>
-        <w:bidi/>
-        <w:spacing w:after="60" w:line="360"/>
-        <w:jc w:val="both"/>
-      </w:pPr>
-      <w:r>
-        <w:rPr>
-          <w:rFonts w:ascii="Times New Roman" w:cs="David" w:eastAsia="David" w:hAnsi="Times New Roman"/>
-          <w:sz w:val="24"/>
-          <w:szCs w:val="24"/>
-          <w:rtl/>
-        </w:rPr>
-        <w:t xml:space="preserve">האם קיים קשר בין היקף החשיפה למסכים לבין היקף הפעילות הגופנית בקרב תלמידים עם לקויות למידה?</w:t>
-      </w:r>
-    </w:p>
-    <w:p>
-      <w:pPr>
-        <w:pStyle w:val="ListParagraph"/>
-        <w:numPr>
-          <w:ilvl w:val="0"/>
-          <w:numId w:val="3"/>
-        </w:numPr>
-        <w:bidi/>
-        <w:spacing w:after="60" w:line="360"/>
-        <w:jc w:val="both"/>
-      </w:pPr>
-      <w:r>
-        <w:rPr>
-          <w:rFonts w:ascii="Times New Roman" w:cs="David" w:eastAsia="David" w:hAnsi="Times New Roman"/>
-          <w:sz w:val="24"/>
-          <w:szCs w:val="24"/>
-          <w:rtl/>
-        </w:rPr>
-        <w:t xml:space="preserve">האם קיים קשר בין החשיפה למסכים, השינה והפעילות הגופנית לבין התפקוד הלימודי המדווח של תלמידים עם לקויות למידה?</w:t>
-      </w:r>
-    </w:p>
-    <w:p>
-      <w:pPr>
-        <w:pStyle w:val="ListParagraph"/>
-        <w:numPr>
-          <w:ilvl w:val="0"/>
-          <w:numId w:val="3"/>
-        </w:numPr>
-        <w:bidi/>
-        <w:spacing w:after="60" w:line="360"/>
-        <w:jc w:val="both"/>
-      </w:pPr>
-      <w:r>
-        <w:rPr>
-          <w:rFonts w:ascii="Times New Roman" w:cs="David" w:eastAsia="David" w:hAnsi="Times New Roman"/>
-          <w:sz w:val="24"/>
-          <w:szCs w:val="24"/>
-          <w:rtl/>
-        </w:rPr>
-        <w:t xml:space="preserve">האם קיימים הבדלים בין תלמידים עם לקויות למידה לבין תלמידים ללא לקויות למידה בדפוסי ההתנהגות ובשיעור העמידה בהמלצות?</w:t>
+        <w:t xml:space="preserve">חלק א: שאלון פרטים אישיים</w:t>
+      </w:r>
+    </w:p>
+    <w:p>
+      <w:pPr>
+        <w:bidi/>
+        <w:spacing w:after="120" w:line="360"/>
+        <w:jc w:val="both"/>
+      </w:pPr>
+      <w:r>
+        <w:rPr>
+          <w:rFonts w:ascii="Times New Roman" w:cs="David" w:eastAsia="David" w:hAnsi="Times New Roman"/>
+          <w:sz w:val="24"/>
+          <w:szCs w:val="24"/>
+          <w:rtl/>
+        </w:rPr>
+        <w:t xml:space="preserve">שאלון שחובר לצורך המחקר וכולל מין, גיל, כיתה, מגזר, קיום אבחון של לקות למידה וסוגו, קיום אבחנה של הפרעת קשב, ונטילת טיפול תרופתי. השאלון אינו מבקש פרטים מזהים.</w:t>
       </w:r>
     </w:p>
     <w:p>
@@ -1296,128 +1638,279 @@
           <w:szCs w:val="24"/>
           <w:rtl/>
         </w:rPr>
-        <w:t xml:space="preserve">השערות המחקר</w:t>
-      </w:r>
-    </w:p>
-    <w:p>
-      <w:pPr>
-        <w:pStyle w:val="ListParagraph"/>
-        <w:numPr>
-          <w:ilvl w:val="0"/>
-          <w:numId w:val="4"/>
-        </w:numPr>
-        <w:bidi/>
-        <w:spacing w:after="60" w:line="360"/>
-        <w:jc w:val="both"/>
-      </w:pPr>
-      <w:r>
-        <w:rPr>
-          <w:rFonts w:ascii="Times New Roman" w:cs="David" w:eastAsia="David" w:hAnsi="Times New Roman"/>
-          <w:sz w:val="24"/>
-          <w:szCs w:val="24"/>
-          <w:rtl/>
-        </w:rPr>
-        <w:t xml:space="preserve">יימצא קשר שלילי בין היקף החשיפה למסכים לבין משך השינה, וקשר חיובי בין היקף החשיפה למסכים לבין שעת שינה מאוחרת ובינו לבין ישנוניות בשעות היום (Lund et al., 2021; Shochat et al., 2010).</w:t>
-      </w:r>
-    </w:p>
-    <w:p>
-      <w:pPr>
-        <w:pStyle w:val="ListParagraph"/>
-        <w:numPr>
-          <w:ilvl w:val="0"/>
-          <w:numId w:val="4"/>
-        </w:numPr>
-        <w:bidi/>
-        <w:spacing w:after="60" w:line="360"/>
-        <w:jc w:val="both"/>
-      </w:pPr>
-      <w:r>
-        <w:rPr>
-          <w:rFonts w:ascii="Times New Roman" w:cs="David" w:eastAsia="David" w:hAnsi="Times New Roman"/>
-          <w:sz w:val="24"/>
-          <w:szCs w:val="24"/>
-          <w:rtl/>
-        </w:rPr>
-        <w:t xml:space="preserve">יימצא קשר שלילי בין היקף החשיפה למסכים לבין היקף הפעילות הגופנית (Dai &amp; Ouyang, 2026; Tremblay et al., 2016).</w:t>
-      </w:r>
-    </w:p>
-    <w:p>
-      <w:pPr>
-        <w:pStyle w:val="ListParagraph"/>
-        <w:numPr>
-          <w:ilvl w:val="0"/>
-          <w:numId w:val="4"/>
-        </w:numPr>
-        <w:bidi/>
-        <w:spacing w:after="60" w:line="360"/>
-        <w:jc w:val="both"/>
-      </w:pPr>
-      <w:r>
-        <w:rPr>
-          <w:rFonts w:ascii="Times New Roman" w:cs="David" w:eastAsia="David" w:hAnsi="Times New Roman"/>
-          <w:sz w:val="24"/>
-          <w:szCs w:val="24"/>
-          <w:rtl/>
-        </w:rPr>
-        <w:t xml:space="preserve">יימצא קשר שלילי בין היקף החשיפה למסכים לבין התפקוד הלימודי המדווח, וקשר חיובי בין עמידה בהמלצות השינה והפעילות הגופנית לבין התפקוד הלימודי המדווח (Chen et al., 2024; Howie et al., 2020).</w:t>
-      </w:r>
-    </w:p>
-    <w:p>
-      <w:pPr>
-        <w:pStyle w:val="ListParagraph"/>
-        <w:numPr>
-          <w:ilvl w:val="0"/>
-          <w:numId w:val="4"/>
-        </w:numPr>
-        <w:bidi/>
-        <w:spacing w:after="60" w:line="360"/>
-        <w:jc w:val="both"/>
-      </w:pPr>
-      <w:r>
-        <w:rPr>
-          <w:rFonts w:ascii="Times New Roman" w:cs="David" w:eastAsia="David" w:hAnsi="Times New Roman"/>
-          <w:sz w:val="24"/>
-          <w:szCs w:val="24"/>
-          <w:rtl/>
-        </w:rPr>
-        <w:t xml:space="preserve">תלמידים שעומדים בשתי המלצות לפחות ידווחו על תפקוד לימודי גבוה יותר מתלמידים שעומדים בהמלצה אחת או באף אחת (Howie et al., 2020).</w:t>
-      </w:r>
-    </w:p>
-    <w:p>
-      <w:pPr>
-        <w:pStyle w:val="ListParagraph"/>
-        <w:numPr>
-          <w:ilvl w:val="0"/>
-          <w:numId w:val="4"/>
-        </w:numPr>
-        <w:bidi/>
-        <w:spacing w:after="60" w:line="360"/>
-        <w:jc w:val="both"/>
-      </w:pPr>
-      <w:r>
-        <w:rPr>
-          <w:rFonts w:ascii="Times New Roman" w:cs="David" w:eastAsia="David" w:hAnsi="Times New Roman"/>
-          <w:sz w:val="24"/>
-          <w:szCs w:val="24"/>
-          <w:rtl/>
-        </w:rPr>
-        <w:t xml:space="preserve">תלמידים עם לקויות למידה ידווחו על משך שינה קצר יותר, על ישנוניות רבה יותר ועל פעילות גופנית מועטה יותר בהשוואה לתלמידים ללא לקויות למידה, ושיעור העומדים בשלוש ההמלצות יחד יהיה נמוך יותר בקרבם (Blanchet &amp; Assaiante, 2022; Jeffcock &amp; Dimitriou, 2025; Saccani et al., 2022).</w:t>
-      </w:r>
-    </w:p>
-    <w:p>
-      <w:pPr>
-        <w:bidi/>
-        <w:spacing w:after="120" w:line="360"/>
-        <w:jc w:val="both"/>
-      </w:pPr>
-      <w:r>
-        <w:rPr>
-          <w:rFonts w:ascii="Times New Roman" w:cs="David" w:eastAsia="David" w:hAnsi="Times New Roman"/>
-          <w:sz w:val="24"/>
-          <w:szCs w:val="24"/>
-          <w:rtl/>
-        </w:rPr>
-        <w:t xml:space="preserve">לגבי היקף החשיפה למסכים לא מנוסחת השערה מכוונת, מאחר שהמחקר היחיד שהשווה ישירות בין קבוצות לא מצא הבדל בכמות השימוש אלא באופיו (Kocabas et al., 2025). שאלה זו תיבדק כשאלה פתוחה.</w:t>
+        <w:t xml:space="preserve">חלק ב: שאלון חשיפה למסכים</w:t>
+      </w:r>
+    </w:p>
+    <w:p>
+      <w:pPr>
+        <w:bidi/>
+        <w:spacing w:after="120" w:line="360"/>
+        <w:jc w:val="both"/>
+      </w:pPr>
+      <w:r>
+        <w:rPr>
+          <w:rFonts w:ascii="Times New Roman" w:cs="David" w:eastAsia="David" w:hAnsi="Times New Roman"/>
+          <w:sz w:val="24"/>
+          <w:szCs w:val="24"/>
+          <w:rtl/>
+        </w:rPr>
+        <w:t xml:space="preserve">שאלון שחובר לצורך המחקר על בסיס פריטי ההתנהגות היושבנית שבמחקר האוסטרלי (Howie et al., 2020) ופריטי המסכים של סקר HBSC ששימשו במחקרים הישראליים (בק ואחרים, 2018; הראל-פיש ואחרים, 2024). הנבדק מדווח על מספר השעות ביום המוקדשות לכל סוג פעילות מסך בנפרד, בימי חול ובסוף השבוע: צפייה בטלוויזיה ובסרטונים, משחקי מחשב וטלפון, רשתות חברתיות ושיחות, ושימוש במסך לצורכי לימודים. הפריטים מאפשרים לחשב זמן מסך פנאי כולל ולהבחין בינו לבין שימוש לימודי. פריטים נוספים בודקים נוכחות של טלפון או מסך אחר בחדר השינה, שימוש במסך בחצי השעה שלפני השינה ומספר ההתעוררויות בלילה בגלל הטלפון, בהתאם להמלצות משרד הבריאות (2026). עמידה בהמלצה מוגדרת כזמן מסך פנאי של עד שעתיים ביום בממוצע (Howie et al., 2020).</w:t>
+      </w:r>
+    </w:p>
+    <w:p>
+      <w:pPr>
+        <w:pStyle w:val="Heading3"/>
+        <w:bidi/>
+        <w:spacing w:after="100" w:before="200" w:line="360"/>
+        <w:jc w:val="right"/>
+      </w:pPr>
+      <w:r>
+        <w:rPr>
+          <w:rFonts w:ascii="Times New Roman" w:cs="David" w:eastAsia="David" w:hAnsi="Times New Roman"/>
+          <w:b/>
+          <w:bCs/>
+          <w:color w:val="000000"/>
+          <w:sz w:val="24"/>
+          <w:szCs w:val="24"/>
+          <w:rtl/>
+        </w:rPr>
+        <w:t xml:space="preserve">חלק ג: שאלון הרגלי שינה וישנוניות</w:t>
+      </w:r>
+    </w:p>
+    <w:p>
+      <w:pPr>
+        <w:bidi/>
+        <w:spacing w:after="120" w:line="360"/>
+        <w:jc w:val="both"/>
+      </w:pPr>
+      <w:r>
+        <w:rPr>
+          <w:rFonts w:ascii="Times New Roman" w:cs="David" w:eastAsia="David" w:hAnsi="Times New Roman"/>
+          <w:sz w:val="24"/>
+          <w:szCs w:val="24"/>
+          <w:rtl/>
+        </w:rPr>
+        <w:t xml:space="preserve">החלק כולל שני רכיבים. הרכיב הראשון הוא פריטי הרגלי שינה: שעת השינה ושעת הקימה בימי חול ובסוף השבוע, שמהן מחושבים משך השינה והפער בין ימי חול לסוף השבוע, וזמן ההירדמות (Howie et al., 2020). עמידה בהמלצה מוגדרת כתשע עד אחת עשרה שעות שינה לגיל 13 ומטה ושמונה עד עשר שעות לגיל 14 ומעלה (Howie et al., 2020). הרכיב השני הוא סולם ישנוניות יומית בן שמונה פריטים שחובר לצורך המחקר על בסיס תסמיני הישנוניות היומית הנמדדים בשאלון הרגלי השינה לילדים, ששימש במחקר בקרב ילדים עם דיסלקציה (Jeffcock &amp; Dimitriou, 2025). הפריטים עוסקים בישנוניות בשיעור ובהכנת שיעורי בית, בקושי לקום בבוקר ובתחושת עייפות במהלך היום, בסולם של חמש דרגות מ-0 (אף פעם) עד 4 (תמיד). ציון הסולם הוא סכום הפריטים, בטווח 0 עד 32, וציון גבוה מעיד על ישנוניות רבה יותר. מהימנות הסולם תחושב על נתוני המדגם הנוכחי.</w:t>
+      </w:r>
+    </w:p>
+    <w:p>
+      <w:pPr>
+        <w:pStyle w:val="Heading3"/>
+        <w:bidi/>
+        <w:spacing w:after="100" w:before="200" w:line="360"/>
+        <w:jc w:val="right"/>
+      </w:pPr>
+      <w:r>
+        <w:rPr>
+          <w:rFonts w:ascii="Times New Roman" w:cs="David" w:eastAsia="David" w:hAnsi="Times New Roman"/>
+          <w:b/>
+          <w:bCs/>
+          <w:color w:val="000000"/>
+          <w:sz w:val="24"/>
+          <w:szCs w:val="24"/>
+          <w:rtl/>
+        </w:rPr>
+        <w:t xml:space="preserve">חלק ד: שאלון פעילות גופנית</w:t>
+      </w:r>
+    </w:p>
+    <w:p>
+      <w:pPr>
+        <w:bidi/>
+        <w:spacing w:after="120" w:line="360"/>
+        <w:jc w:val="both"/>
+      </w:pPr>
+      <w:r>
+        <w:rPr>
+          <w:rFonts w:ascii="Times New Roman" w:cs="David" w:eastAsia="David" w:hAnsi="Times New Roman"/>
+          <w:sz w:val="24"/>
+          <w:szCs w:val="24"/>
+          <w:rtl/>
+        </w:rPr>
+        <w:t xml:space="preserve">פריטי הפעילות הגופנית של סקר HBSC, כפי שהועברו לתלמידים בישראל (בק ואחרים, 2018; ניסנהולץ-גנות ואחרים, 2021; פחימה ואחרים, 2024): מספר הימים בשבוע האחרון שבהם התלמיד היה פעיל גופנית 60 דקות לפחות, תדירות הפעילות הגופנית הנמרצת מחוץ לשעות הלימודים בשבוע רגיל ומשכה, השתתפות בחוג ספורט או בקבוצה, ומידת הפעילות בשיעורי חינוך גופני. פריט הימים עם 60 דקות משמש להגדרת העמידה בהמלצה של ההסתדרות הרפואית (דובנוב-רז ואחרים, 2019), ופריט סוג הפעילות (הישגית, לא הישגית או ללא פעילות) נלקח מהמחקר הישראלי על ספורט והישגים (שחף ואחרים, 2014).</w:t>
+      </w:r>
+    </w:p>
+    <w:p>
+      <w:pPr>
+        <w:pStyle w:val="Heading3"/>
+        <w:bidi/>
+        <w:spacing w:after="100" w:before="200" w:line="360"/>
+        <w:jc w:val="right"/>
+      </w:pPr>
+      <w:r>
+        <w:rPr>
+          <w:rFonts w:ascii="Times New Roman" w:cs="David" w:eastAsia="David" w:hAnsi="Times New Roman"/>
+          <w:b/>
+          <w:bCs/>
+          <w:color w:val="000000"/>
+          <w:sz w:val="24"/>
+          <w:szCs w:val="24"/>
+          <w:rtl/>
+        </w:rPr>
+        <w:t xml:space="preserve">חלק ה: שאלון תפקוד לימודי מדווח</w:t>
+      </w:r>
+    </w:p>
+    <w:p>
+      <w:pPr>
+        <w:bidi/>
+        <w:spacing w:after="120" w:line="360"/>
+        <w:jc w:val="both"/>
+      </w:pPr>
+      <w:r>
+        <w:rPr>
+          <w:rFonts w:ascii="Times New Roman" w:cs="David" w:eastAsia="David" w:hAnsi="Times New Roman"/>
+          <w:sz w:val="24"/>
+          <w:szCs w:val="24"/>
+          <w:rtl/>
+        </w:rPr>
+        <w:t xml:space="preserve">שאלון שחובר לצורך המחקר. הוא כולל דיווח על ממוצע הציונים בתעודה האחרונה ועל הציון האחרון במתמטיקה ובאנגלית, שני המקצועות שנמצאו רגישים ביותר לזמן מסך במחקר האוסטרלי (Howie et al., 2020). בנוסף, חמישה פריטים בסולם של חמש דרגות בודקים תפקוד יומי בלמידה: ריכוז בשיעורים, הכנת שיעורי בית, איחורים, הרגשה של עייפות בשיעורים ותחושת מסוגלות בלמידה. ציון התפקוד היומי הוא ממוצע הפריטים. הבחירה בדיווח עצמי על ציונים, ולא בציונים מרשומות בית הספר, נובעת מהצורך לשמור על אנונימיות מלאה של תלמידים מאוכלוסייה רגישה.</w:t>
+      </w:r>
+    </w:p>
+    <w:p>
+      <w:pPr>
+        <w:pStyle w:val="Heading2"/>
+        <w:bidi/>
+        <w:spacing w:after="120" w:before="240" w:line="360"/>
+        <w:jc w:val="right"/>
+      </w:pPr>
+      <w:r>
+        <w:rPr>
+          <w:rFonts w:ascii="Times New Roman" w:cs="David" w:eastAsia="David" w:hAnsi="Times New Roman"/>
+          <w:b/>
+          <w:bCs/>
+          <w:color w:val="000000"/>
+          <w:sz w:val="28"/>
+          <w:szCs w:val="28"/>
+          <w:rtl/>
+        </w:rPr>
+        <w:t xml:space="preserve">2.4 הליך המחקר</w:t>
+      </w:r>
+    </w:p>
+    <w:p>
+      <w:pPr>
+        <w:bidi/>
+        <w:spacing w:after="120" w:line="360"/>
+        <w:ind w:firstLine="709"/>
+        <w:jc w:val="both"/>
+      </w:pPr>
+      <w:r>
+        <w:rPr>
+          <w:rFonts w:ascii="Times New Roman" w:cs="David" w:eastAsia="David" w:hAnsi="Times New Roman"/>
+          <w:sz w:val="24"/>
+          <w:szCs w:val="24"/>
+          <w:rtl/>
+        </w:rPr>
+        <w:t xml:space="preserve">בשלב הראשון תוגש בקשה לאישור המחקר לוועדת האתיקה של המוסד ולמנחה. במקביל תיערך פנייה למנהלי בתי הספר לקבלת הסכמתם ולזיהוי רכז לקויות הלמידה או היועצת שילוו את איסוף הנתונים. בשלב השני יועברו להורי התלמידים טופסי הסכמה מדעת, שבהם יוסבר נושא המחקר, אופי השאלון, האנונימיות והזכות לסרב או להפסיק בכל שלב. בשלב השלישי יועבר השאלון לתלמידים שהוריהם הסכימו, במסגרת שיעור או שעת חינוך, בנוכחות החוקרת ואיש צוות. השאלון יועבר על גבי טופס מקוון או בדפוס, לפי אפשרויות בית הספר. לתלמידים עם לקויות למידה יוצע להקריא את השאלות בקול או להאריך את זמן המילוי, כדי שהקושי בקריאה לא ישפיע על איכות הדיווח. לפני ההעברה הרחבה ייערך מחקר חלוץ בקרב עשרה תלמידים לבדיקת בהירות הניסוח ומשך המילוי, והשאלון יתוקן לפי הצורך. איסוף הנתונים מתוכנן לתקופה של שישה עד שמונה שבועות במהלך סמסטר לימודים רגיל, ולא בתקופת חופשות או בחינות.</w:t>
+      </w:r>
+    </w:p>
+    <w:p>
+      <w:pPr>
+        <w:pStyle w:val="Heading2"/>
+        <w:bidi/>
+        <w:spacing w:after="120" w:before="240" w:line="360"/>
+        <w:jc w:val="right"/>
+      </w:pPr>
+      <w:r>
+        <w:rPr>
+          <w:rFonts w:ascii="Times New Roman" w:cs="David" w:eastAsia="David" w:hAnsi="Times New Roman"/>
+          <w:b/>
+          <w:bCs/>
+          <w:color w:val="000000"/>
+          <w:sz w:val="28"/>
+          <w:szCs w:val="28"/>
+          <w:rtl/>
+        </w:rPr>
+        <w:t xml:space="preserve">2.5 ניתוח הנתונים</w:t>
+      </w:r>
+    </w:p>
+    <w:p>
+      <w:pPr>
+        <w:bidi/>
+        <w:spacing w:after="120" w:line="360"/>
+        <w:ind w:firstLine="709"/>
+        <w:jc w:val="both"/>
+      </w:pPr>
+      <w:r>
+        <w:rPr>
+          <w:rFonts w:ascii="Times New Roman" w:cs="David" w:eastAsia="David" w:hAnsi="Times New Roman"/>
+          <w:sz w:val="24"/>
+          <w:szCs w:val="24"/>
+          <w:rtl/>
+        </w:rPr>
+        <w:t xml:space="preserve">הנתונים ינותחו בתוכנת SPSS. תחילה יחושבו סטטיסטיקה תיאורית (ממוצעים, סטיות תקן, שכיחויות ואחוזים) לכל משתני המחקר ולשיעור העמידה בכל המלצה ובשלושתן יחד, בנפרד לכל קבוצה. מהימנות הסולמות תיבדק באמצעות אלפא של קרונבך. השערות המחקר הראשונה עד השלישית ייבדקו באמצעות מתאמי פירסון בין המשתנים הרציפים, וכאשר ההתפלגות אינה נורמלית באמצעות מתאם ספירמן. ההשערה הרביעית תיבדק באמצעות ניתוח שונות חד-כיווני להשוואת התפקוד הלימודי בין תלמידים העומדים באפס, באחת, בשתיים או בשלוש המלצות. ההשערה החמישית תיבדק באמצעות מבחני t למדגמים בלתי תלויים להשוואת ממוצעים ומבחני חי בריבוע להשוואת שיעורי העמידה בהמלצות בין הקבוצות. לבסוף תיערך רגרסיה לינארית מרובה שבה התפקוד הלימודי המדווח הוא המשתנה התלוי, ושלוש ההתנהגויות, לצד משתני הרקע והקבוצה, הן המנבאים, כדי לבחון את התרומה הייחודית של כל התנהגות. רמת המובהקות שתאומץ היא 5 אחוזים.</w:t>
+      </w:r>
+    </w:p>
+    <w:p>
+      <w:pPr>
+        <w:pStyle w:val="Heading2"/>
+        <w:bidi/>
+        <w:spacing w:after="120" w:before="240" w:line="360"/>
+        <w:jc w:val="right"/>
+      </w:pPr>
+      <w:r>
+        <w:rPr>
+          <w:rFonts w:ascii="Times New Roman" w:cs="David" w:eastAsia="David" w:hAnsi="Times New Roman"/>
+          <w:b/>
+          <w:bCs/>
+          <w:color w:val="000000"/>
+          <w:sz w:val="28"/>
+          <w:szCs w:val="28"/>
+          <w:rtl/>
+        </w:rPr>
+        <w:t xml:space="preserve">2.6 שיקולים אתיים</w:t>
+      </w:r>
+    </w:p>
+    <w:p>
+      <w:pPr>
+        <w:bidi/>
+        <w:spacing w:after="120" w:line="360"/>
+        <w:ind w:firstLine="709"/>
+        <w:jc w:val="both"/>
+      </w:pPr>
+      <w:r>
+        <w:rPr>
+          <w:rFonts w:ascii="Times New Roman" w:cs="David" w:eastAsia="David" w:hAnsi="Times New Roman"/>
+          <w:sz w:val="24"/>
+          <w:szCs w:val="24"/>
+          <w:rtl/>
+        </w:rPr>
+        <w:t xml:space="preserve">המחקר עוסק בקטינים מאוכלוסייה רגישה ולכן נדרשת הקפדה יתרה. השתתפות מותנית בהסכמה בכתב של ההורים ובהסכמה של התלמיד עצמו, והתלמיד רשאי להפסיק בכל שלב בלי הסבר ובלי שייפגע. השאלון אנונימי לחלוטין: אין בו שם, מספר זהות או פרט מזהה אחר, והשיוך לקבוצת המחקר נעשה על סמך דיווח עצמי ולא על סמך רשימות של בית הספר. השאלונים המודפסים יישמרו במקום נעול והקבצים המקוונים יישמרו בקובץ מוגן בסיסמה, והם יושמדו בתום העבודה. במהלך ההעברה תוסבר לתלמידים מטרת המחקר בשפה מותאמת, ותודגש העובדה שאין תשובות נכונות ולא נכונות. סוגיה ייחודית לאוכלוסייה זו היא הרגישות של תלמידים לסימון כ"מאובחנים" בפני חבריהם. לכן השאלון יועבר לכל תלמידי הכיתה יחד, ללא הפרדה בין הקבוצות, והשיוך ייקבע רק בניתוח. המחקר לא יבוצע לפני קבלת אישור ועדת האתיקה המוסדית ואישור מנהלי בתי הספר.</w:t>
+      </w:r>
+    </w:p>
+    <w:p>
+      <w:pPr>
+        <w:pStyle w:val="Heading2"/>
+        <w:bidi/>
+        <w:spacing w:after="120" w:before="240" w:line="360"/>
+        <w:jc w:val="right"/>
+      </w:pPr>
+      <w:r>
+        <w:rPr>
+          <w:rFonts w:ascii="Times New Roman" w:cs="David" w:eastAsia="David" w:hAnsi="Times New Roman"/>
+          <w:b/>
+          <w:bCs/>
+          <w:color w:val="000000"/>
+          <w:sz w:val="28"/>
+          <w:szCs w:val="28"/>
+          <w:rtl/>
+        </w:rPr>
+        <w:t xml:space="preserve">2.7 מגבלות המחקר</w:t>
+      </w:r>
+    </w:p>
+    <w:p>
+      <w:pPr>
+        <w:bidi/>
+        <w:spacing w:after="120" w:line="360"/>
+        <w:ind w:firstLine="709"/>
+        <w:jc w:val="both"/>
+      </w:pPr>
+      <w:r>
+        <w:rPr>
+          <w:rFonts w:ascii="Times New Roman" w:cs="David" w:eastAsia="David" w:hAnsi="Times New Roman"/>
+          <w:sz w:val="24"/>
+          <w:szCs w:val="24"/>
+          <w:rtl/>
+        </w:rPr>
+        <w:t xml:space="preserve">למחקר כמה מגבלות שיש להביא בחשבון בפירוש הממצאים. ראשית, המערך רוחבי, ולכן הוא יכול להצביע על קשרים אך לא על כיוון סיבתי: אין דרך לדעת אם המסכים פוגעים בשינה או אם תלמידים שמתקשים להירדם פונים למסך. שנית, כל המשתנים נמדדים בדיווח עצמי, ודיווח על זמן מסך ועל ציונים חשוף להטיות של זיכרון ושל רצייה חברתית. מדידה אובייקטיבית באמצעות אפליקציות מעקב או מד תאוצה לא הייתה אפשרית במסגרת העבודה. שלישית, הדגימה היא דגימת נוחות במספר קטן של בתי ספר, ולכן ההכללה לכלל התלמידים עם לקויות למידה בישראל מוגבלת. רביעית, קבוצת התלמידים עם לקויות למידה אינה אחידה: היא כוללת סוגי לקות שונים ותלמידים עם הפרעת קשב נלווית ובלעדיה, וגודל המדגם אינו מאפשר ניתוח נפרד לכל תת-קבוצה. חמישית, סולם הישנוניות חובר לצורך המחקר ולא עבר תיקוף מלא. למרות המגבלות, המחקר מספק תיאור ראשון של שלוש ההתנהגויות יחד בקרב תלמידים עם לקויות למידה בישראל, ויכול לשמש בסיס למחקרי המשך במערך אורך ובמדידה אובייקטיבית.</w:t>
       </w:r>
     </w:p>
     <w:p>
@@ -1442,563 +1935,23 @@
           <w:szCs w:val="32"/>
           <w:rtl/>
         </w:rPr>
-        <w:t xml:space="preserve">פרק 2: שיטת המחקר</w:t>
-      </w:r>
-    </w:p>
-    <w:p>
-      <w:pPr>
-        <w:pStyle w:val="Heading2"/>
-        <w:bidi/>
-        <w:spacing w:after="120" w:before="240" w:line="360"/>
-        <w:jc w:val="right"/>
-      </w:pPr>
-      <w:r>
-        <w:rPr>
-          <w:rFonts w:ascii="Times New Roman" w:cs="David" w:eastAsia="David" w:hAnsi="Times New Roman"/>
-          <w:b/>
-          <w:bCs/>
-          <w:color w:val="000000"/>
-          <w:sz w:val="28"/>
-          <w:szCs w:val="28"/>
-          <w:rtl/>
-        </w:rPr>
-        <w:t xml:space="preserve">2.1 מערך המחקר</w:t>
-      </w:r>
-    </w:p>
-    <w:p>
-      <w:pPr>
-        <w:bidi/>
-        <w:spacing w:after="120" w:line="360"/>
-        <w:ind w:firstLine="709"/>
-        <w:jc w:val="both"/>
-      </w:pPr>
-      <w:r>
-        <w:rPr>
-          <w:rFonts w:ascii="Times New Roman" w:cs="David" w:eastAsia="David" w:hAnsi="Times New Roman"/>
-          <w:sz w:val="24"/>
-          <w:szCs w:val="24"/>
-          <w:rtl/>
-        </w:rPr>
-        <w:t xml:space="preserve">המחקר כמותי, במערך רוחבי (חתך) מתאמי-השוואתי. הנתונים נאספים בנקודת זמן אחת באמצעות שאלון דיווח עצמי אנונימי. המערך המתאמי משרת את שאלות המחקר השנייה עד הרביעית, העוסקות בקשרים בין משתנים, והמערך ההשוואתי משרת את השאלה החמישית, העוסקת בהבדלים בין שתי קבוצות. הבחירה במערך רוחבי נובעת ממסגרת הזמן של עבודה סמינריונית ומכך שהמחקר הראשון בתחום באוכלוסייה זו בישראל נועד לתאר ולמפות ולא להוכיח סיבתיות. המערך דומה לזה ששימש במחקרים המרכזיים שנסקרו (Howie et al., 2020; Korcz et al., 2023).</w:t>
-      </w:r>
-    </w:p>
-    <w:p>
-      <w:pPr>
-        <w:bidi/>
-        <w:spacing w:after="120" w:line="360"/>
-        <w:jc w:val="both"/>
-      </w:pPr>
-      <w:r>
-        <w:rPr>
-          <w:rFonts w:ascii="Times New Roman" w:cs="David" w:eastAsia="David" w:hAnsi="Times New Roman"/>
-          <w:sz w:val="24"/>
-          <w:szCs w:val="24"/>
-          <w:rtl/>
-        </w:rPr>
-        <w:t xml:space="preserve">משתני המחקר:</w:t>
-      </w:r>
-    </w:p>
-    <w:p>
-      <w:pPr>
-        <w:pStyle w:val="ListParagraph"/>
-        <w:numPr>
-          <w:ilvl w:val="0"/>
-          <w:numId w:val="5"/>
-        </w:numPr>
-        <w:bidi/>
-        <w:spacing w:after="60" w:line="360"/>
-        <w:jc w:val="both"/>
-      </w:pPr>
-      <w:r>
-        <w:rPr>
-          <w:rFonts w:ascii="Times New Roman" w:cs="David" w:eastAsia="David" w:hAnsi="Times New Roman"/>
-          <w:sz w:val="24"/>
-          <w:szCs w:val="24"/>
-          <w:rtl/>
-        </w:rPr>
-        <w:t xml:space="preserve">משתנים בלתי תלויים: היקף החשיפה למסכים (שעות ביום בימי חול ובסוף שבוע, ונוכחות מסכים בחדר השינה); משך השינה ושעת השינה; היקף הפעילות הגופנית.</w:t>
-      </w:r>
-    </w:p>
-    <w:p>
-      <w:pPr>
-        <w:pStyle w:val="ListParagraph"/>
-        <w:numPr>
-          <w:ilvl w:val="0"/>
-          <w:numId w:val="5"/>
-        </w:numPr>
-        <w:bidi/>
-        <w:spacing w:after="60" w:line="360"/>
-        <w:jc w:val="both"/>
-      </w:pPr>
-      <w:r>
-        <w:rPr>
-          <w:rFonts w:ascii="Times New Roman" w:cs="David" w:eastAsia="David" w:hAnsi="Times New Roman"/>
-          <w:sz w:val="24"/>
-          <w:szCs w:val="24"/>
-          <w:rtl/>
-        </w:rPr>
-        <w:t xml:space="preserve">משתנים תלויים: ישנוניות בשעות היום; תפקוד לימודי מדווח (ממוצע ציונים מדווח ותפקוד יומי בלמידה).</w:t>
-      </w:r>
-    </w:p>
-    <w:p>
-      <w:pPr>
-        <w:pStyle w:val="ListParagraph"/>
-        <w:numPr>
-          <w:ilvl w:val="0"/>
-          <w:numId w:val="5"/>
-        </w:numPr>
-        <w:bidi/>
-        <w:spacing w:after="60" w:line="360"/>
-        <w:jc w:val="both"/>
-      </w:pPr>
-      <w:r>
-        <w:rPr>
-          <w:rFonts w:ascii="Times New Roman" w:cs="David" w:eastAsia="David" w:hAnsi="Times New Roman"/>
-          <w:sz w:val="24"/>
-          <w:szCs w:val="24"/>
-          <w:rtl/>
-        </w:rPr>
-        <w:t xml:space="preserve">משתנה קבוצתי: קיום אבחנה של לקות למידה (קבוצת המחקר) לעומת היעדר אבחנה (קבוצת ההשוואה).</w:t>
-      </w:r>
-    </w:p>
-    <w:p>
-      <w:pPr>
-        <w:pStyle w:val="ListParagraph"/>
-        <w:numPr>
-          <w:ilvl w:val="0"/>
-          <w:numId w:val="5"/>
-        </w:numPr>
-        <w:bidi/>
-        <w:spacing w:after="60" w:line="360"/>
-        <w:jc w:val="both"/>
-      </w:pPr>
-      <w:r>
-        <w:rPr>
-          <w:rFonts w:ascii="Times New Roman" w:cs="David" w:eastAsia="David" w:hAnsi="Times New Roman"/>
-          <w:sz w:val="24"/>
-          <w:szCs w:val="24"/>
-          <w:rtl/>
-        </w:rPr>
-        <w:t xml:space="preserve">משתני רקע: מין, גיל, כיתה, מגזר, אבחנה נלווית של הפרעת קשב, נטילת טיפול תרופתי.</w:t>
-      </w:r>
-    </w:p>
-    <w:p>
-      <w:pPr>
-        <w:pStyle w:val="Heading2"/>
-        <w:bidi/>
-        <w:spacing w:after="120" w:before="240" w:line="360"/>
-        <w:jc w:val="right"/>
-      </w:pPr>
-      <w:r>
-        <w:rPr>
-          <w:rFonts w:ascii="Times New Roman" w:cs="David" w:eastAsia="David" w:hAnsi="Times New Roman"/>
-          <w:b/>
-          <w:bCs/>
-          <w:color w:val="000000"/>
-          <w:sz w:val="28"/>
-          <w:szCs w:val="28"/>
-          <w:rtl/>
-        </w:rPr>
-        <w:t xml:space="preserve">2.2 אוכלוסיית המחקר והמדגם</w:t>
-      </w:r>
-    </w:p>
-    <w:p>
-      <w:pPr>
-        <w:bidi/>
-        <w:spacing w:after="120" w:line="360"/>
-        <w:ind w:firstLine="709"/>
-        <w:jc w:val="both"/>
-      </w:pPr>
-      <w:r>
-        <w:rPr>
-          <w:rFonts w:ascii="Times New Roman" w:cs="David" w:eastAsia="David" w:hAnsi="Times New Roman"/>
-          <w:sz w:val="24"/>
-          <w:szCs w:val="24"/>
-          <w:rtl/>
-        </w:rPr>
-        <w:t xml:space="preserve">אוכלוסיית המחקר היא תלמידי כיתות ז' עד י"ב במערכת החינוך בישראל. קבוצת המחקר כוללת תלמידים בעלי אבחון תקף של לקות למידה (אבחון דידקטי או פסיכו-דידקטי) המקבלים התאמות בלמידה או בבחינות. קבוצת ההשוואה כוללת תלמידים מאותן שכבות גיל ללא אבחון של לקות למידה. גודל המדגם המתוכנן הוא 120 תלמידים: 60 בקבוצת המחקר ו-60 בקבוצת ההשוואה, בטווח הגילים 12 עד 18. חישוב מקדים באמצעות מחשבון עוצמה סטטיסטית מראה שמדגם של 60 בכל קבוצה מאפשר לזהות הבדל בגודל אפקט בינוני (d = 0.5) בעוצמה של כ-77 אחוזים ברמת מובהקות של 5 אחוזים, ומדגם של 60 בקבוצת המחקר מאפשר לזהות מתאם בינוני (r = 0.35) בעוצמה דומה. אם קבוצת ההשוואה לא תגויס במלואה, השערות המחקר הראשונה עד הרביעית ניתנות לבדיקה בקבוצת המחקר בלבד.</w:t>
-      </w:r>
-    </w:p>
-    <w:p>
-      <w:pPr>
-        <w:bidi/>
-        <w:spacing w:after="120" w:line="360"/>
-        <w:ind w:firstLine="709"/>
-        <w:jc w:val="both"/>
-      </w:pPr>
-      <w:r>
-        <w:rPr>
-          <w:rFonts w:ascii="Times New Roman" w:cs="David" w:eastAsia="David" w:hAnsi="Times New Roman"/>
-          <w:sz w:val="24"/>
-          <w:szCs w:val="24"/>
-          <w:rtl/>
-        </w:rPr>
-        <w:t xml:space="preserve">הדגימה היא דגימת נוחות. התלמידים יגויסו בשניים עד שלושה בתי ספר על-יסודיים שבהם פועל מרכז תמיכה או רכז לקויות למידה, באמצעות פנייה למנהלים וליועצות. קבוצת ההשוואה תגויס מאותם בתי ספר ומאותן שכבות גיל, כדי לצמצם הבדלים סביבתיים בין הקבוצות. קריטריוני הכללה לקבוצת המחקר: אבחון לקות למידה שתועד בבית הספר, גיל 12 עד 18, שליטה בשפת השאלון. קריטריוני אי-הכללה לשתי הקבוצות: מוגבלות שכלית, אבחנה של אוטיזם, לקות חושית שאינה מתוקנת, או מחלה כרונית שמגבילה פעילות גופנית. תלמידים עם הפרעת קשב נלווית ייכללו בקבוצת המחקר, ומשתנה זה יירשם ויבוקר בניתוח, בהתאם לממצאים על תחלואה כפולה (Saccani et al., 2022).</w:t>
-      </w:r>
-    </w:p>
-    <w:p>
-      <w:pPr>
-        <w:pStyle w:val="Heading2"/>
-        <w:bidi/>
-        <w:spacing w:after="120" w:before="240" w:line="360"/>
-        <w:jc w:val="right"/>
-      </w:pPr>
-      <w:r>
-        <w:rPr>
-          <w:rFonts w:ascii="Times New Roman" w:cs="David" w:eastAsia="David" w:hAnsi="Times New Roman"/>
-          <w:b/>
-          <w:bCs/>
-          <w:color w:val="000000"/>
-          <w:sz w:val="28"/>
-          <w:szCs w:val="28"/>
-          <w:rtl/>
-        </w:rPr>
-        <w:t xml:space="preserve">2.3 כלי המחקר</w:t>
-      </w:r>
-    </w:p>
-    <w:p>
-      <w:pPr>
-        <w:bidi/>
-        <w:spacing w:after="120" w:line="360"/>
-        <w:ind w:firstLine="709"/>
-        <w:jc w:val="both"/>
-      </w:pPr>
-      <w:r>
-        <w:rPr>
-          <w:rFonts w:ascii="Times New Roman" w:cs="David" w:eastAsia="David" w:hAnsi="Times New Roman"/>
-          <w:sz w:val="24"/>
-          <w:szCs w:val="24"/>
-          <w:rtl/>
-        </w:rPr>
-        <w:t xml:space="preserve">כלי המחקר הוא שאלון סגור לדיווח עצמי שמורכב מחמישה חלקים. השאלון המלא מובא בנספח א'. משך המילוי המשוער הוא 15 עד 20 דקות.</w:t>
-      </w:r>
-    </w:p>
-    <w:p>
-      <w:pPr>
-        <w:pStyle w:val="Heading3"/>
-        <w:bidi/>
-        <w:spacing w:after="100" w:before="200" w:line="360"/>
-        <w:jc w:val="right"/>
-      </w:pPr>
-      <w:r>
-        <w:rPr>
-          <w:rFonts w:ascii="Times New Roman" w:cs="David" w:eastAsia="David" w:hAnsi="Times New Roman"/>
-          <w:b/>
-          <w:bCs/>
-          <w:color w:val="000000"/>
-          <w:sz w:val="24"/>
-          <w:szCs w:val="24"/>
-          <w:rtl/>
-        </w:rPr>
-        <w:t xml:space="preserve">חלק א: שאלון פרטים אישיים</w:t>
-      </w:r>
-    </w:p>
-    <w:p>
-      <w:pPr>
-        <w:bidi/>
-        <w:spacing w:after="120" w:line="360"/>
-        <w:jc w:val="both"/>
-      </w:pPr>
-      <w:r>
-        <w:rPr>
-          <w:rFonts w:ascii="Times New Roman" w:cs="David" w:eastAsia="David" w:hAnsi="Times New Roman"/>
-          <w:sz w:val="24"/>
-          <w:szCs w:val="24"/>
-          <w:rtl/>
-        </w:rPr>
-        <w:t xml:space="preserve">שאלון שחובר לצורך המחקר וכולל מין, גיל, כיתה, מגזר, קיום אבחון של לקות למידה וסוגו, קיום אבחנה של הפרעת קשב, ונטילת טיפול תרופתי. השאלון אינו מבקש פרטים מזהים.</w:t>
-      </w:r>
-    </w:p>
-    <w:p>
-      <w:pPr>
-        <w:pStyle w:val="Heading3"/>
-        <w:bidi/>
-        <w:spacing w:after="100" w:before="200" w:line="360"/>
-        <w:jc w:val="right"/>
-      </w:pPr>
-      <w:r>
-        <w:rPr>
-          <w:rFonts w:ascii="Times New Roman" w:cs="David" w:eastAsia="David" w:hAnsi="Times New Roman"/>
-          <w:b/>
-          <w:bCs/>
-          <w:color w:val="000000"/>
-          <w:sz w:val="24"/>
-          <w:szCs w:val="24"/>
-          <w:rtl/>
-        </w:rPr>
-        <w:t xml:space="preserve">חלק ב: שאלון חשיפה למסכים</w:t>
-      </w:r>
-    </w:p>
-    <w:p>
-      <w:pPr>
-        <w:bidi/>
-        <w:spacing w:after="120" w:line="360"/>
-        <w:jc w:val="both"/>
-      </w:pPr>
-      <w:r>
-        <w:rPr>
-          <w:rFonts w:ascii="Times New Roman" w:cs="David" w:eastAsia="David" w:hAnsi="Times New Roman"/>
-          <w:sz w:val="24"/>
-          <w:szCs w:val="24"/>
-          <w:rtl/>
-        </w:rPr>
-        <w:t xml:space="preserve">שאלון שחובר לצורך המחקר על בסיס הפריטים ששימשו במחקר האוסטרלי (Howie et al., 2020) ובסקר HBSC בישראל (בק ואחרים, 2018). הנבדק מדווח על מספר השעות ביום מוקדשות לכל סוג פעילות מסך בנפרד, בימי חול ובסוף השבוע: צפייה בטלוויזיה ובסרטונים, משחקי מחשב וטלפון, רשתות חברתיות ושיחות, ושימוש במסך לצורכי לימודים. הפריטים מאפשרים לחשב זמן מסך פנאי כולל ולהבחין בינו לבין שימוש לימודי. פריטים נוספים בודקים נוכחות של טלפון או מסך אחר בחדר השינה, שימוש במסך בחצי השעה שלפני השינה ומספר ההתעוררויות בלילה בגלל הטלפון. עמידה בהמלצה מוגדרת כזמן מסך פנאי של עד שעתיים ביום בממוצע (Tremblay et al., 2016).</w:t>
-      </w:r>
-    </w:p>
-    <w:p>
-      <w:pPr>
-        <w:pStyle w:val="Heading3"/>
-        <w:bidi/>
-        <w:spacing w:after="100" w:before="200" w:line="360"/>
-        <w:jc w:val="right"/>
-      </w:pPr>
-      <w:r>
-        <w:rPr>
-          <w:rFonts w:ascii="Times New Roman" w:cs="David" w:eastAsia="David" w:hAnsi="Times New Roman"/>
-          <w:b/>
-          <w:bCs/>
-          <w:color w:val="000000"/>
-          <w:sz w:val="24"/>
-          <w:szCs w:val="24"/>
-          <w:rtl/>
-        </w:rPr>
-        <w:t xml:space="preserve">חלק ג: שאלון הרגלי שינה וישנוניות</w:t>
-      </w:r>
-    </w:p>
-    <w:p>
-      <w:pPr>
-        <w:bidi/>
-        <w:spacing w:after="120" w:line="360"/>
-        <w:jc w:val="both"/>
-      </w:pPr>
-      <w:r>
-        <w:rPr>
-          <w:rFonts w:ascii="Times New Roman" w:cs="David" w:eastAsia="David" w:hAnsi="Times New Roman"/>
-          <w:sz w:val="24"/>
-          <w:szCs w:val="24"/>
-          <w:rtl/>
-        </w:rPr>
-        <w:t xml:space="preserve">החלק כולל שני רכיבים. הרכיב הראשון הוא פריטי הרגלי שינה: שעת השינה ושעת הקימה בימי חול ובסוף השבוע, שמהן מחושבים משך השינה והפער בין ימי חול לסוף השבוע (Howie et al., 2020; Shochat et al., 2010). עמידה בהמלצה מוגדרת כתשע עד אחת עשרה שעות שינה לגיל 13 ומטה ושמונה עד עשר שעות לגיל 14 ומעלה (Tremblay et al., 2016). הרכיב השני הוא סולם הישנוניות היומית לילדים (Pediatric Daytime Sleepiness Scale), שפותח ותוקף בקרב תלמידי חטיבת ביניים ונמצא קשור להישגים לימודיים (Drake et al., 2003). הסולם כולל שמונה פריטים על ישנוניות במצבים שונים במהלך היום, בסולם של חמש דרגות מ-0 (אף פעם) עד 4 (תמיד). ציון הסולם הוא סכום הפריטים, בטווח 0 עד 32, וציון גבוה מעיד על ישנוניות רבה יותר. במחקר המקורי דווחה מהימנות פנימית של 0.80 (Drake et al., 2003). הסולם תורגם לעברית לצורך המחקר בתרגום ובתרגום חוזר, ומהימנותו תחושב על נתוני המדגם הנוכחי.</w:t>
-      </w:r>
-    </w:p>
-    <w:p>
-      <w:pPr>
-        <w:pStyle w:val="Heading3"/>
-        <w:bidi/>
-        <w:spacing w:after="100" w:before="200" w:line="360"/>
-        <w:jc w:val="right"/>
-      </w:pPr>
-      <w:r>
-        <w:rPr>
-          <w:rFonts w:ascii="Times New Roman" w:cs="David" w:eastAsia="David" w:hAnsi="Times New Roman"/>
-          <w:b/>
-          <w:bCs/>
-          <w:color w:val="000000"/>
-          <w:sz w:val="24"/>
-          <w:szCs w:val="24"/>
-          <w:rtl/>
-        </w:rPr>
-        <w:t xml:space="preserve">חלק ד: שאלון פעילות גופנית</w:t>
-      </w:r>
-    </w:p>
-    <w:p>
-      <w:pPr>
-        <w:bidi/>
-        <w:spacing w:after="120" w:line="360"/>
-        <w:jc w:val="both"/>
-      </w:pPr>
-      <w:r>
-        <w:rPr>
-          <w:rFonts w:ascii="Times New Roman" w:cs="David" w:eastAsia="David" w:hAnsi="Times New Roman"/>
-          <w:sz w:val="24"/>
-          <w:szCs w:val="24"/>
-          <w:rtl/>
-        </w:rPr>
-        <w:t xml:space="preserve">שאלון הפעילות הגופנית למתבגרים (Physical Activity Questionnaire for Adolescents, PAQ-A) הוא שאלון דיווח עצמי שמודד את רמת הפעילות הגופנית בשבעת הימים האחרונים בקרב בני 14 עד 19, ולו גרסה מקבילה לילדים בני 8 עד 14 (Kowalski et al., 2004). השאלון כולל שמונה פריטים: רשימת פעילויות ספורט ותדירותן, פעילות בשיעורי חינוך גופני, בהפסקות, אחרי בית הספר, בערבים, בסוף השבוע, ותיאור כללי של השבוע. הציון הכולל הוא ממוצע הפריטים בטווח 1 עד 5, וציון גבוה מעיד על פעילות רבה יותר. לשאלון נוסף פריט HBSC שבודק את מספר הימים בשבוע האחרון שבהם התלמיד היה פעיל 60 דקות לפחות, ופריט זה משמש להגדרת העמידה בהמלצה של 60 דקות ביום (Bull et al., 2020).</w:t>
-      </w:r>
-    </w:p>
-    <w:p>
-      <w:pPr>
-        <w:pStyle w:val="Heading3"/>
-        <w:bidi/>
-        <w:spacing w:after="100" w:before="200" w:line="360"/>
-        <w:jc w:val="right"/>
-      </w:pPr>
-      <w:r>
-        <w:rPr>
-          <w:rFonts w:ascii="Times New Roman" w:cs="David" w:eastAsia="David" w:hAnsi="Times New Roman"/>
-          <w:b/>
-          <w:bCs/>
-          <w:color w:val="000000"/>
-          <w:sz w:val="24"/>
-          <w:szCs w:val="24"/>
-          <w:rtl/>
-        </w:rPr>
-        <w:t xml:space="preserve">חלק ה: שאלון תפקוד לימודי מדווח</w:t>
-      </w:r>
-    </w:p>
-    <w:p>
-      <w:pPr>
-        <w:bidi/>
-        <w:spacing w:after="120" w:line="360"/>
-        <w:jc w:val="both"/>
-      </w:pPr>
-      <w:r>
-        <w:rPr>
-          <w:rFonts w:ascii="Times New Roman" w:cs="David" w:eastAsia="David" w:hAnsi="Times New Roman"/>
-          <w:sz w:val="24"/>
-          <w:szCs w:val="24"/>
-          <w:rtl/>
-        </w:rPr>
-        <w:t xml:space="preserve">שאלון שחובר לצורך המחקר. הוא כולל דיווח על ממוצע הציונים בתעודה האחרונה ועל הציון האחרון במתמטיקה ובאנגלית, שני המקצועות שנמצאו רגישים ביותר לזמן מסך במחקר האוסטרלי (Howie et al., 2020). בנוסף, חמישה פריטים בסולם של חמש דרגות בודקים תפקוד יומי בלמידה: ריכוז בשיעורים, הכנת שיעורי בית, איחורים, הרגשה של עייפות בשיעורים ותחושת מסוגלות בלמידה. ציון התפקוד היומי הוא ממוצע הפריטים. הבחירה בדיווח עצמי על ציונים, ולא בציונים מרשומות בית הספר, נובעת מהצורך לשמור על אנונימיות מלאה של תלמידים מאוכלוסייה רגישה.</w:t>
-      </w:r>
-    </w:p>
-    <w:p>
-      <w:pPr>
-        <w:pStyle w:val="Heading2"/>
-        <w:bidi/>
-        <w:spacing w:after="120" w:before="240" w:line="360"/>
-        <w:jc w:val="right"/>
-      </w:pPr>
-      <w:r>
-        <w:rPr>
-          <w:rFonts w:ascii="Times New Roman" w:cs="David" w:eastAsia="David" w:hAnsi="Times New Roman"/>
-          <w:b/>
-          <w:bCs/>
-          <w:color w:val="000000"/>
-          <w:sz w:val="28"/>
-          <w:szCs w:val="28"/>
-          <w:rtl/>
-        </w:rPr>
-        <w:t xml:space="preserve">2.4 הליך המחקר</w:t>
-      </w:r>
-    </w:p>
-    <w:p>
-      <w:pPr>
-        <w:bidi/>
-        <w:spacing w:after="120" w:line="360"/>
-        <w:ind w:firstLine="709"/>
-        <w:jc w:val="both"/>
-      </w:pPr>
-      <w:r>
-        <w:rPr>
-          <w:rFonts w:ascii="Times New Roman" w:cs="David" w:eastAsia="David" w:hAnsi="Times New Roman"/>
-          <w:sz w:val="24"/>
-          <w:szCs w:val="24"/>
-          <w:rtl/>
-        </w:rPr>
-        <w:t xml:space="preserve">בשלב הראשון תוגש בקשה לאישור המחקר לוועדת האתיקה של המוסד ולמנחה. במקביל תיערך פנייה למנהלי בתי הספר לקבלת הסכמתם ולזיהוי רכז לקויות הלמידה או היועצת שילוו את איסוף הנתונים. בשלב השני יועברו להורי התלמידים טופסי הסכמה מדעת, שבהם יוסבר נושא המחקר, אופי השאלון, האנונימיות והזכות לסרב או להפסיק בכל שלב. בשלב השלישי יועבר השאלון לתלמידים שהוריהם הסכימו, במסגרת שיעור או שעת חינוך, בנוכחות החוקרת ואיש צוות. השאלון יועבר על גבי טופס מקוון או בדפוס, לפי אפשרויות בית הספר. לתלמידים עם לקויות למידה יוצע להקריא את השאלות בקול או להאריך את זמן המילוי, כדי שהקושי בקריאה לא ישפיע על איכות הדיווח. לפני ההעברה הרחבה ייערך מחקר חלוץ בקרב עשרה תלמידים לבדיקת בהירות הניסוח ומשך המילוי, והשאלון יתוקן לפי הצורך. איסוף הנתונים מתוכנן לתקופה של שישה עד שמונה שבועות במהלך סמסטר לימודים רגיל, ולא בתקופת חופשות או בחינות.</w:t>
-      </w:r>
-    </w:p>
-    <w:p>
-      <w:pPr>
-        <w:pStyle w:val="Heading2"/>
-        <w:bidi/>
-        <w:spacing w:after="120" w:before="240" w:line="360"/>
-        <w:jc w:val="right"/>
-      </w:pPr>
-      <w:r>
-        <w:rPr>
-          <w:rFonts w:ascii="Times New Roman" w:cs="David" w:eastAsia="David" w:hAnsi="Times New Roman"/>
-          <w:b/>
-          <w:bCs/>
-          <w:color w:val="000000"/>
-          <w:sz w:val="28"/>
-          <w:szCs w:val="28"/>
-          <w:rtl/>
-        </w:rPr>
-        <w:t xml:space="preserve">2.5 ניתוח הנתונים</w:t>
-      </w:r>
-    </w:p>
-    <w:p>
-      <w:pPr>
-        <w:bidi/>
-        <w:spacing w:after="120" w:line="360"/>
-        <w:ind w:firstLine="709"/>
-        <w:jc w:val="both"/>
-      </w:pPr>
-      <w:r>
-        <w:rPr>
-          <w:rFonts w:ascii="Times New Roman" w:cs="David" w:eastAsia="David" w:hAnsi="Times New Roman"/>
-          <w:sz w:val="24"/>
-          <w:szCs w:val="24"/>
-          <w:rtl/>
-        </w:rPr>
-        <w:t xml:space="preserve">הנתונים ינותחו בתוכנת SPSS. תחילה יחושבו סטטיסטיקה תיאורית (ממוצעים, סטיות תקן, שכיחויות ואחוזים) לכל משתני המחקר ולשיעור העמידה בכל המלצה ובשלושתן יחד, בנפרד לכל קבוצה. מהימנות הסולמות תיבדק באמצעות אלפא של קרונבך. השערות המחקר הראשונה עד השלישית ייבדקו באמצעות מתאמי פירסון בין המשתנים הרציפים, וכאשר ההתפלגות אינה נורמלית באמצעות מתאם ספירמן. ההשערה הרביעית תיבדק באמצעות ניתוח שונות חד-כיווני להשוואת התפקוד הלימודי בין תלמידים העומדים באפס, באחת, בשתיים או בשלוש המלצות. ההשערה החמישית תיבדק באמצעות מבחני t למדגמים בלתי תלויים להשוואת ממוצעים ומבחני חי בריבוע להשוואת שיעורי העמידה בהמלצות בין הקבוצות. לבסוף תיערך רגרסיה לינארית מרובה שבה התפקוד הלימודי המדווח הוא המשתנה התלוי, ושלוש ההתנהגויות, לצד משתני הרקע והקבוצה, הן המנבאים, כדי לבחון את התרומה הייחודית של כל התנהגות. רמת המובהקות שתאומץ היא 5 אחוזים.</w:t>
-      </w:r>
-    </w:p>
-    <w:p>
-      <w:pPr>
-        <w:pStyle w:val="Heading2"/>
-        <w:bidi/>
-        <w:spacing w:after="120" w:before="240" w:line="360"/>
-        <w:jc w:val="right"/>
-      </w:pPr>
-      <w:r>
-        <w:rPr>
-          <w:rFonts w:ascii="Times New Roman" w:cs="David" w:eastAsia="David" w:hAnsi="Times New Roman"/>
-          <w:b/>
-          <w:bCs/>
-          <w:color w:val="000000"/>
-          <w:sz w:val="28"/>
-          <w:szCs w:val="28"/>
-          <w:rtl/>
-        </w:rPr>
-        <w:t xml:space="preserve">2.6 שיקולים אתיים</w:t>
-      </w:r>
-    </w:p>
-    <w:p>
-      <w:pPr>
-        <w:bidi/>
-        <w:spacing w:after="120" w:line="360"/>
-        <w:ind w:firstLine="709"/>
-        <w:jc w:val="both"/>
-      </w:pPr>
-      <w:r>
-        <w:rPr>
-          <w:rFonts w:ascii="Times New Roman" w:cs="David" w:eastAsia="David" w:hAnsi="Times New Roman"/>
-          <w:sz w:val="24"/>
-          <w:szCs w:val="24"/>
-          <w:rtl/>
-        </w:rPr>
-        <w:t xml:space="preserve">המחקר עוסק בקטינים מאוכלוסייה רגישה ולכן נדרשת הקפדה יתרה. השתתפות מותנית בהסכמה בכתב של ההורים ובהסכמה של התלמיד עצמו, והתלמיד רשאי להפסיק בכל שלב בלי הסבר ובלי שייפגע. השאלון אנונימי לחלוטין: אין בו שם, מספר זהות או פרט מזהה אחר, והשיוך לקבוצת המחקר נעשה על סמך דיווח עצמי ולא על סמך רשימות של בית הספר. השאלונים המודפסים יישמרו במקום נעול והקבצים המקוונים יישמרו בקובץ מוגן בסיסמה, והם יושמדו בתום העבודה. במהלך ההעברה תוסבר לתלמידים מטרת המחקר בשפה מותאמת, ותודגש העובדה שאין תשובות נכונות ולא נכונות. סוגיה ייחודית לאוכלוסייה זו היא הרגישות של תלמידים לסימון כ"מאובחנים" בפני חבריהם. לכן השאלון יועבר לכל תלמידי הכיתה יחד, ללא הפרדה בין הקבוצות, והשיוך ייקבע רק בניתוח. המחקר לא יבוצע לפני קבלת אישור ועדת האתיקה המוסדית ואישור מנהלי בתי הספר.</w:t>
-      </w:r>
-    </w:p>
-    <w:p>
-      <w:pPr>
-        <w:pStyle w:val="Heading2"/>
-        <w:bidi/>
-        <w:spacing w:after="120" w:before="240" w:line="360"/>
-        <w:jc w:val="right"/>
-      </w:pPr>
-      <w:r>
-        <w:rPr>
-          <w:rFonts w:ascii="Times New Roman" w:cs="David" w:eastAsia="David" w:hAnsi="Times New Roman"/>
-          <w:b/>
-          <w:bCs/>
-          <w:color w:val="000000"/>
-          <w:sz w:val="28"/>
-          <w:szCs w:val="28"/>
-          <w:rtl/>
-        </w:rPr>
-        <w:t xml:space="preserve">2.7 מגבלות המחקר</w:t>
-      </w:r>
-    </w:p>
-    <w:p>
-      <w:pPr>
-        <w:bidi/>
-        <w:spacing w:after="120" w:line="360"/>
-        <w:ind w:firstLine="709"/>
-        <w:jc w:val="both"/>
-      </w:pPr>
-      <w:r>
-        <w:rPr>
-          <w:rFonts w:ascii="Times New Roman" w:cs="David" w:eastAsia="David" w:hAnsi="Times New Roman"/>
-          <w:sz w:val="24"/>
-          <w:szCs w:val="24"/>
-          <w:rtl/>
-        </w:rPr>
-        <w:t xml:space="preserve">למחקר כמה מגבלות שיש להביא בחשבון בפירוש הממצאים. ראשית, המערך רוחבי, ולכן הוא יכול להצביע על קשרים אך לא על כיוון סיבתי: אין דרך לדעת אם המסכים פוגעים בשינה או אם תלמידים שמתקשים להירדם פונים למסך. שנית, כל המשתנים נמדדים בדיווח עצמי, ודיווח על זמן מסך ועל ציונים חשוף להטיות של זיכרון ושל רצייה חברתית. מדידה אובייקטיבית באמצעות אפליקציות מעקב או מד תאוצה לא הייתה אפשרית במסגרת העבודה. שלישית, הדגימה היא דגימת נוחות במספר קטן של בתי ספר, ולכן ההכללה לכלל התלמידים עם לקויות למידה בישראל מוגבלת. רביעית, קבוצת התלמידים עם לקויות למידה אינה אחידה: היא כוללת סוגי לקות שונים ותלמידים עם הפרעת קשב נלווית ובלעדיה, וגודל המדגם אינו מאפשר ניתוח נפרד לכל תת-קבוצה. חמישית, השאלונים המקוריים לישנוניות ולפעילות גופנית פותחו באנגלית, ותרגומם לעברית לצורך המחקר לא עבר תיקוף מלא. למרות המגבלות, המחקר מספק תיאור ראשון של שלוש ההתנהגויות יחד בקרב תלמידים עם לקויות למידה בישראל, ויכול לשמש בסיס למחקרי המשך במערך אורך ובמדידה אובייקטיבית.</w:t>
+        <w:t xml:space="preserve">פרק 3: ממצאים</w:t>
+      </w:r>
+    </w:p>
+    <w:p>
+      <w:pPr>
+        <w:bidi/>
+        <w:spacing w:after="120" w:line="360"/>
+        <w:jc w:val="both"/>
+      </w:pPr>
+      <w:r>
+        <w:rPr>
+          <w:rFonts w:ascii="Times New Roman" w:cs="David" w:eastAsia="David" w:hAnsi="Times New Roman"/>
+          <w:sz w:val="24"/>
+          <w:szCs w:val="24"/>
+          <w:rtl/>
+        </w:rPr>
+        <w:t xml:space="preserve">[פרק זה ייכתב לאחר איסוף הנתונים וניתוחם. הוא יכלול סטטיסטיקה תיאורית של המדגם, טבלאות ותרשימים של שיעורי העמידה בהמלצות, טבלת מתאמים בין משתני המחקר, תוצאות מבחני ההשוואה בין הקבוצות ותוצאות הרגרסיה, ובסופו תשובה לכל אחת משאלות המחקר ולכל אחת מההשערות.]</w:t>
       </w:r>
     </w:p>
     <w:p>
@@ -2023,23 +1976,23 @@
           <w:szCs w:val="32"/>
           <w:rtl/>
         </w:rPr>
-        <w:t xml:space="preserve">פרק 3: ממצאים</w:t>
-      </w:r>
-    </w:p>
-    <w:p>
-      <w:pPr>
-        <w:bidi/>
-        <w:spacing w:after="120" w:line="360"/>
-        <w:jc w:val="both"/>
-      </w:pPr>
-      <w:r>
-        <w:rPr>
-          <w:rFonts w:ascii="Times New Roman" w:cs="David" w:eastAsia="David" w:hAnsi="Times New Roman"/>
-          <w:sz w:val="24"/>
-          <w:szCs w:val="24"/>
-          <w:rtl/>
-        </w:rPr>
-        <w:t xml:space="preserve">[פרק זה ייכתב לאחר איסוף הנתונים וניתוחם. הוא יכלול סטטיסטיקה תיאורית של המדגם, טבלאות ותרשימים של שיעורי העמידה בהמלצות, טבלת מתאמים בין משתני המחקר, תוצאות מבחני ההשוואה בין הקבוצות ותוצאות הרגרסיה, ובסופו תשובה לכל אחת משאלות המחקר ולכל אחת מההשערות.]</w:t>
+        <w:t xml:space="preserve">פרק 4: דיון</w:t>
+      </w:r>
+    </w:p>
+    <w:p>
+      <w:pPr>
+        <w:bidi/>
+        <w:spacing w:after="120" w:line="360"/>
+        <w:jc w:val="both"/>
+      </w:pPr>
+      <w:r>
+        <w:rPr>
+          <w:rFonts w:ascii="Times New Roman" w:cs="David" w:eastAsia="David" w:hAnsi="Times New Roman"/>
+          <w:sz w:val="24"/>
+          <w:szCs w:val="24"/>
+          <w:rtl/>
+        </w:rPr>
+        <w:t xml:space="preserve">[ייכתב לאחר פרק הממצאים. הדיון יעמת את הממצאים עם המחקרים שנסקרו בפרק 1, ובמיוחד עם Howie et al. (2020), Saccani et al. (2022), Jeffcock &amp; Dimitriou (2025) והראל-פיש ואחרים (2024), יציע הסברים לממצאים צפויים ולא צפויים, ויתייחס לתרומת המחקר, להשלכות היישומיות לבתי ספר ולהורים ולכיווני מחקר עתידיים.]</w:t>
       </w:r>
     </w:p>
     <w:p>
@@ -2064,23 +2017,23 @@
           <w:szCs w:val="32"/>
           <w:rtl/>
         </w:rPr>
-        <w:t xml:space="preserve">פרק 4: דיון</w:t>
-      </w:r>
-    </w:p>
-    <w:p>
-      <w:pPr>
-        <w:bidi/>
-        <w:spacing w:after="120" w:line="360"/>
-        <w:jc w:val="both"/>
-      </w:pPr>
-      <w:r>
-        <w:rPr>
-          <w:rFonts w:ascii="Times New Roman" w:cs="David" w:eastAsia="David" w:hAnsi="Times New Roman"/>
-          <w:sz w:val="24"/>
-          <w:szCs w:val="24"/>
-          <w:rtl/>
-        </w:rPr>
-        <w:t xml:space="preserve">[ייכתב לאחר פרק הממצאים. הדיון יעמת את הממצאים עם המחקרים שנסקרו בפרק 1, ובמיוחד עם Howie et al. (2020), Saccani et al. (2022) ו-Jeffcock &amp; Dimitriou (2025), יציע הסברים לממצאים צפויים ולא צפויים, ויתייחס לתרומת המחקר, להשלכות היישומיות לבתי ספר ולהורים ולכיווני מחקר עתידיים.]</w:t>
+        <w:t xml:space="preserve">סיכום</w:t>
+      </w:r>
+    </w:p>
+    <w:p>
+      <w:pPr>
+        <w:bidi/>
+        <w:spacing w:after="120" w:line="360"/>
+        <w:jc w:val="both"/>
+      </w:pPr>
+      <w:r>
+        <w:rPr>
+          <w:rFonts w:ascii="Times New Roman" w:cs="David" w:eastAsia="David" w:hAnsi="Times New Roman"/>
+          <w:sz w:val="24"/>
+          <w:szCs w:val="24"/>
+          <w:rtl/>
+        </w:rPr>
+        <w:t xml:space="preserve">[ייכתב בסוף התהליך, בהתאמה למבוא ובלי תכנים חדשים, עם המלצות יישומיות.]</w:t>
       </w:r>
     </w:p>
     <w:p>
@@ -2105,47 +2058,6 @@
           <w:szCs w:val="32"/>
           <w:rtl/>
         </w:rPr>
-        <w:t xml:space="preserve">סיכום</w:t>
-      </w:r>
-    </w:p>
-    <w:p>
-      <w:pPr>
-        <w:bidi/>
-        <w:spacing w:after="120" w:line="360"/>
-        <w:jc w:val="both"/>
-      </w:pPr>
-      <w:r>
-        <w:rPr>
-          <w:rFonts w:ascii="Times New Roman" w:cs="David" w:eastAsia="David" w:hAnsi="Times New Roman"/>
-          <w:sz w:val="24"/>
-          <w:szCs w:val="24"/>
-          <w:rtl/>
-        </w:rPr>
-        <w:t xml:space="preserve">[ייכתב בסוף התהליך, בהתאמה למבוא ובלי תכנים חדשים, עם המלצות יישומיות.]</w:t>
-      </w:r>
-    </w:p>
-    <w:p>
-      <w:r>
-        <w:br w:type="page"/>
-      </w:r>
-    </w:p>
-    <w:p>
-      <w:pPr>
-        <w:pStyle w:val="Heading1"/>
-        <w:bidi/>
-        <w:spacing w:after="240" w:before="240" w:line="360"/>
-        <w:jc w:val="right"/>
-      </w:pPr>
-      <w:r>
-        <w:rPr>
-          <w:rFonts w:ascii="Times New Roman" w:cs="David" w:eastAsia="David" w:hAnsi="Times New Roman"/>
-          <w:b/>
-          <w:bCs/>
-          <w:color w:val="000000"/>
-          <w:sz w:val="32"/>
-          <w:szCs w:val="32"/>
-          <w:rtl/>
-        </w:rPr>
         <w:t xml:space="preserve">רשימת מקורות</w:t>
       </w:r>
     </w:p>
@@ -2248,6 +2160,74 @@
           <w:szCs w:val="24"/>
           <w:rtl/>
         </w:rPr>
+        <w:t xml:space="preserve">גספר, ל' ס', סנטוס, ב', בארוס-ויאגס, א' ת', קרדוזו, ז', אמרל, ס' ו', קרוואליאש-אלמיידה, ק', סנטוס-קרוואליו, א', קבדאש, ק', ואלוורו, א' ר' (2020). כוחות-העל של השינה שלנו. Frontiers for Young Minds. https://kids.frontiersin.org/he/articles/10.3389/frym.2020.540052-he</w:t>
+      </w:r>
+    </w:p>
+    <w:p>
+      <w:pPr>
+        <w:bidi/>
+        <w:spacing w:after="120" w:line="360"/>
+        <w:ind w:start="709" w:hanging="709"/>
+        <w:jc w:val="right"/>
+      </w:pPr>
+      <w:r>
+        <w:rPr>
+          <w:rFonts w:ascii="Times New Roman" w:cs="David" w:eastAsia="David" w:hAnsi="Times New Roman"/>
+          <w:sz w:val="24"/>
+          <w:szCs w:val="24"/>
+          <w:rtl/>
+        </w:rPr>
+        <w:t xml:space="preserve">דובנוב-רז, ג', בר-יוסף, ר', גולן, ר', נבות-מינצר, ד', נמט, ד', צוקר-טולדנו, מ', קונסטנטיני, נ', אריאלי, ר', דותן, ר', ופלק, ב' (2019). פעילות גופנית וספורט בילדים ובבני נוער: נייר עמדה. ההסתדרות הרפואית בישראל. https://www.ima.org.il/MainSiteNew/EditClinicalInstruction.aspx?ClinicalInstructionId=1437</w:t>
+      </w:r>
+    </w:p>
+    <w:p>
+      <w:pPr>
+        <w:bidi/>
+        <w:spacing w:after="120" w:line="360"/>
+        <w:ind w:start="709" w:hanging="709"/>
+        <w:jc w:val="right"/>
+      </w:pPr>
+      <w:r>
+        <w:rPr>
+          <w:rFonts w:ascii="Times New Roman" w:cs="David" w:eastAsia="David" w:hAnsi="Times New Roman"/>
+          <w:sz w:val="24"/>
+          <w:szCs w:val="24"/>
+          <w:rtl/>
+        </w:rPr>
+        <w:t xml:space="preserve">העמותה הישראלית לריפוי בעיסוק (2017). נייר עמדה: התערבות בריפוי בעיסוק לקידום השתתפות ואיכות החיים של ילדים, מתבגרים ומבוגרים עם הפרעת קשב. כתב עת ישראלי לריפוי בעיסוק, 26(3), 184-194.</w:t>
+      </w:r>
+    </w:p>
+    <w:p>
+      <w:pPr>
+        <w:bidi/>
+        <w:spacing w:after="120" w:line="360"/>
+        <w:ind w:start="709" w:hanging="709"/>
+        <w:jc w:val="right"/>
+      </w:pPr>
+      <w:r>
+        <w:rPr>
+          <w:rFonts w:ascii="Times New Roman" w:cs="David" w:eastAsia="David" w:hAnsi="Times New Roman"/>
+          <w:sz w:val="24"/>
+          <w:szCs w:val="24"/>
+          <w:rtl/>
+        </w:rPr>
+        <w:t xml:space="preserve">הראל-פיש, ה' (קזולה), טסלר, ר', והראל-פיש, י' (2024). הרגלי פעילות גופנית, התנהגויות סיכון, רווחה נפשית וגורמי חוסן: ניתוח משווה בקרב בני נוער עם וללא מוגבלויות הלומדים בבתי ספר בחינוך הכללי. בתנועה: כתב-עת למדעי החינוך הגופני והספורט, יד(2), 241-280.</w:t>
+      </w:r>
+    </w:p>
+    <w:p>
+      <w:pPr>
+        <w:bidi/>
+        <w:spacing w:after="120" w:line="360"/>
+        <w:ind w:start="709" w:hanging="709"/>
+        <w:jc w:val="right"/>
+      </w:pPr>
+      <w:r>
+        <w:rPr>
+          <w:rFonts w:ascii="Times New Roman" w:cs="David" w:eastAsia="David" w:hAnsi="Times New Roman"/>
+          <w:sz w:val="24"/>
+          <w:szCs w:val="24"/>
+          <w:rtl/>
+        </w:rPr>
         <w:t xml:space="preserve">משרד הבריאות (2026). על ילדים ובני נוער ומסכים: המלצות להורים. אפשריבריא. https://efsharibari.health.gov.il/well-being/rational-use-of-screens/children-and-screens/</w:t>
       </w:r>
     </w:p>
@@ -2266,6 +2246,74 @@
           <w:rtl/>
         </w:rPr>
         <w:t xml:space="preserve">משרד החינוך, השירות הפסיכולוגי-ייעוצי (ל.ת.). לקויות למידה: הגדרות ותיאוריה. שפ"ינט. https://shefi.education.gov.il/learning-disabilities/definitions-and-theory/</w:t>
+      </w:r>
+    </w:p>
+    <w:p>
+      <w:pPr>
+        <w:bidi/>
+        <w:spacing w:after="120" w:line="360"/>
+        <w:ind w:start="709" w:hanging="709"/>
+        <w:jc w:val="right"/>
+      </w:pPr>
+      <w:r>
+        <w:rPr>
+          <w:rFonts w:ascii="Times New Roman" w:cs="David" w:eastAsia="David" w:hAnsi="Times New Roman"/>
+          <w:sz w:val="24"/>
+          <w:szCs w:val="24"/>
+          <w:rtl/>
+        </w:rPr>
+        <w:t xml:space="preserve">ניסנהולץ-גנות, ר', מאור, ר', עופרי, ל', סלע, י', זיגדון, א', הראל-פיש, י', וטסלר, ר' (2021). החינוך הגופני כגורם מגן להתנהגויות סיכון בקרב בני נוער בישראל: הבדלי גיל ומגדר. בתנועה: כתב-עת למדעי החינוך הגופני והספורט, יג(1), 57-70.</w:t>
+      </w:r>
+    </w:p>
+    <w:p>
+      <w:pPr>
+        <w:bidi/>
+        <w:spacing w:after="120" w:line="360"/>
+        <w:ind w:start="709" w:hanging="709"/>
+        <w:jc w:val="right"/>
+      </w:pPr>
+      <w:r>
+        <w:rPr>
+          <w:rFonts w:ascii="Times New Roman" w:cs="David" w:eastAsia="David" w:hAnsi="Times New Roman"/>
+          <w:sz w:val="24"/>
+          <w:szCs w:val="24"/>
+          <w:rtl/>
+        </w:rPr>
+        <w:t xml:space="preserve">עוגב, א', ויזדי-עוגב, א' (2024). איתור מוקדם של ילדים עם הפרעה התפתחותית בקואורדינציה (DCD): השוואה בין דירוג ההורים לבין דירוג המורה לחינוך גופני בשאלוני האיתור. בתנועה: כתב-עת למדעי החינוך הגופני והספורט, יד(2).</w:t>
+      </w:r>
+    </w:p>
+    <w:p>
+      <w:pPr>
+        <w:bidi/>
+        <w:spacing w:after="120" w:line="360"/>
+        <w:ind w:start="709" w:hanging="709"/>
+        <w:jc w:val="right"/>
+      </w:pPr>
+      <w:r>
+        <w:rPr>
+          <w:rFonts w:ascii="Times New Roman" w:cs="David" w:eastAsia="David" w:hAnsi="Times New Roman"/>
+          <w:sz w:val="24"/>
+          <w:szCs w:val="24"/>
+          <w:rtl/>
+        </w:rPr>
+        <w:t xml:space="preserve">פחימה, ד', צווילינג, מ', ניסנהולץ-גנות, ר', גרין, ג', ברק, ש', רגב, ע', הלוי-הוכוולד, ע', הראל-פיש, י', וטסלר, ר' (2024). מגמות בתדירות ובמשך הפעילות הגופנית בקרב ילדים ובני נוער מבתי ספר ממלכתיים וממלכתיים-דתיים לאורך השנים 2010-2018. רוח הספורט, 10, 55-70. https://www.telhai.ac.il/sites/default/files/2024-01/4.pdf</w:t>
+      </w:r>
+    </w:p>
+    <w:p>
+      <w:pPr>
+        <w:bidi/>
+        <w:spacing w:after="120" w:line="360"/>
+        <w:ind w:start="709" w:hanging="709"/>
+        <w:jc w:val="right"/>
+      </w:pPr>
+      <w:r>
+        <w:rPr>
+          <w:rFonts w:ascii="Times New Roman" w:cs="David" w:eastAsia="David" w:hAnsi="Times New Roman"/>
+          <w:sz w:val="24"/>
+          <w:szCs w:val="24"/>
+          <w:rtl/>
+        </w:rPr>
+        <w:t xml:space="preserve">שחף, מ', כץ, י', ושובל, א' (2014). ספורט, הישגים לימודיים ומגדר: האומנם שילוש מנצח? רוח הספורט, 1, 89-98.</w:t>
       </w:r>
     </w:p>
     <w:p>
@@ -2283,7 +2331,7 @@
           <w:sz w:val="24"/>
           <w:szCs w:val="24"/>
         </w:rPr>
-        <w:t xml:space="preserve">American Psychiatric Association. (2022). </w:t>
+        <w:t xml:space="preserve">Blanchet, M., &amp; Assaiante, C. (2022). Specific learning disorder in children and adolescents, a scoping review on motor impairments and their potential impacts. </w:t>
       </w:r>
       <w:r>
         <w:rPr>
@@ -2293,7 +2341,7 @@
           <w:sz w:val="24"/>
           <w:szCs w:val="24"/>
         </w:rPr>
-        <w:t xml:space="preserve">Diagnostic and statistical manual of mental disorders</w:t>
+        <w:t xml:space="preserve">Children, 9</w:t>
       </w:r>
       <w:r>
         <w:rPr>
@@ -2303,7 +2351,7 @@
           <w:sz w:val="24"/>
           <w:szCs w:val="24"/>
         </w:rPr>
-        <w:t xml:space="preserve"> (5th ed., text rev.). https://doi.org/10.1176/appi.books.9780890425787</w:t>
+        <w:t xml:space="preserve">(6), 892. https://doi.org/10.3390/children9060892</w:t>
       </w:r>
     </w:p>
     <w:p>
@@ -2321,7 +2369,7 @@
           <w:sz w:val="24"/>
           <w:szCs w:val="24"/>
         </w:rPr>
-        <w:t xml:space="preserve">Blanchet, M., &amp; Assaiante, C. (2022). Specific learning disorder in children and adolescents, a scoping review on motor impairments and their potential impacts. </w:t>
+        <w:t xml:space="preserve">Chen, S., Liang, K., López-Gil, J. F., Drenowatz, C., &amp; Tremblay, M. S. (2024). Association between meeting 24-h movement guidelines and academic performance in a sample of 67,281 Chinese children and adolescents. </w:t>
       </w:r>
       <w:r>
         <w:rPr>
@@ -2331,7 +2379,7 @@
           <w:sz w:val="24"/>
           <w:szCs w:val="24"/>
         </w:rPr>
-        <w:t xml:space="preserve">Children, 9</w:t>
+        <w:t xml:space="preserve">European Journal of Sport Science, 24</w:t>
       </w:r>
       <w:r>
         <w:rPr>
@@ -2341,7 +2389,7 @@
           <w:sz w:val="24"/>
           <w:szCs w:val="24"/>
         </w:rPr>
-        <w:t xml:space="preserve">(6), 892. https://doi.org/10.3390/children9060892</w:t>
+        <w:t xml:space="preserve">(4), 487-498. https://doi.org/10.1002/ejsc.12034</w:t>
       </w:r>
     </w:p>
     <w:p>
@@ -2359,7 +2407,7 @@
           <w:sz w:val="24"/>
           <w:szCs w:val="24"/>
         </w:rPr>
-        <w:t xml:space="preserve">Bull, F. C., Al-Ansari, S. S., Biddle, S., Borodulin, K., Buman, M. P., Cardon, G., Carty, C., Chaput, J.-P., Chastin, S., Chou, R., Dempsey, P. C., DiPietro, L., Ekelund, U., Firth, J., Friedenreich, C. M., Garcia, L., Gichu, M., Jago, R., Katzmarzyk, P. T., ... Willumsen, J. F. (2020). World Health Organization 2020 guidelines on physical activity and sedentary behaviour. </w:t>
+        <w:t xml:space="preserve">Howie, E. K., Joosten, J., Harris, C. J., &amp; Straker, L. M. (2020). Associations between meeting sleep, physical activity or screen time behaviour guidelines and academic performance in Australian school children. </w:t>
       </w:r>
       <w:r>
         <w:rPr>
@@ -2369,7 +2417,7 @@
           <w:sz w:val="24"/>
           <w:szCs w:val="24"/>
         </w:rPr>
-        <w:t xml:space="preserve">British Journal of Sports Medicine, 54</w:t>
+        <w:t xml:space="preserve">BMC Public Health, 20</w:t>
       </w:r>
       <w:r>
         <w:rPr>
@@ -2379,7 +2427,7 @@
           <w:sz w:val="24"/>
           <w:szCs w:val="24"/>
         </w:rPr>
-        <w:t xml:space="preserve">(24), 1451-1462. https://doi.org/10.1136/bjsports-2020-102955</w:t>
+        <w:t xml:space="preserve">, 520. https://doi.org/10.1186/s12889-020-08620-w</w:t>
       </w:r>
     </w:p>
     <w:p>
@@ -2397,7 +2445,7 @@
           <w:sz w:val="24"/>
           <w:szCs w:val="24"/>
         </w:rPr>
-        <w:t xml:space="preserve">Chen, S., Liang, K., López-Gil, J. F., Drenowatz, C., &amp; Tremblay, M. S. (2024). Association between meeting 24-h movement guidelines and academic performance in a sample of 67,281 Chinese children and adolescents. </w:t>
+        <w:t xml:space="preserve">Jeffcock, K., &amp; Dimitriou, D. (2025). A community study on sleep characteristics and anxiety symptoms in children with dyslexia. </w:t>
       </w:r>
       <w:r>
         <w:rPr>
@@ -2407,7 +2455,7 @@
           <w:sz w:val="24"/>
           <w:szCs w:val="24"/>
         </w:rPr>
-        <w:t xml:space="preserve">European Journal of Sport Science, 24</w:t>
+        <w:t xml:space="preserve">Brain Sciences, 15</w:t>
       </w:r>
       <w:r>
         <w:rPr>
@@ -2417,7 +2465,7 @@
           <w:sz w:val="24"/>
           <w:szCs w:val="24"/>
         </w:rPr>
-        <w:t xml:space="preserve">(4), 487-498. https://doi.org/10.1002/ejsc.12034</w:t>
+        <w:t xml:space="preserve">(7), 711. https://doi.org/10.3390/brainsci15070711</w:t>
       </w:r>
     </w:p>
     <w:p>
@@ -2435,7 +2483,7 @@
           <w:sz w:val="24"/>
           <w:szCs w:val="24"/>
         </w:rPr>
-        <w:t xml:space="preserve">Dai, Y., &amp; Ouyang, N. (2026). Excessive screen time is associated with mental health problems in US children and adolescents: Physical activity and sleep as parallel mediators. </w:t>
+        <w:t xml:space="preserve">Kocabas, S., Adak, I., Karakus, O. B., &amp; Toksoy, Z. E. (2025). Learning disability as a determinant of digital behavior in adolescents with ADHD: A cross-sectional study. </w:t>
       </w:r>
       <w:r>
         <w:rPr>
@@ -2445,7 +2493,7 @@
           <w:sz w:val="24"/>
           <w:szCs w:val="24"/>
         </w:rPr>
-        <w:t xml:space="preserve">Humanities and Social Sciences Communications, 13</w:t>
+        <w:t xml:space="preserve">European Child &amp; Adolescent Psychiatry, 34</w:t>
       </w:r>
       <w:r>
         <w:rPr>
@@ -2455,7 +2503,7 @@
           <w:sz w:val="24"/>
           <w:szCs w:val="24"/>
         </w:rPr>
-        <w:t xml:space="preserve">, 256. https://doi.org/10.1057/s41599-026-06609-1</w:t>
+        <w:t xml:space="preserve">(12), 3999-4007. https://doi.org/10.1007/s00787-025-02802-w</w:t>
       </w:r>
     </w:p>
     <w:p>
@@ -2473,7 +2521,7 @@
           <w:sz w:val="24"/>
           <w:szCs w:val="24"/>
         </w:rPr>
-        <w:t xml:space="preserve">Drake, C., Nickel, C., Burduvali, E., Roth, T., Jefferson, C., &amp; Badia, P. (2003). The Pediatric Daytime Sleepiness Scale (PDSS): Sleep habits and school outcomes in middle-school children. </w:t>
+        <w:t xml:space="preserve">Lund, L., Sølvhøj, I. N., Danielsen, D., &amp; Andersen, S. (2021). Electronic media use and sleep in children and adolescents in western countries: A systematic review. </w:t>
       </w:r>
       <w:r>
         <w:rPr>
@@ -2483,7 +2531,7 @@
           <w:sz w:val="24"/>
           <w:szCs w:val="24"/>
         </w:rPr>
-        <w:t xml:space="preserve">Sleep, 26</w:t>
+        <w:t xml:space="preserve">BMC Public Health, 21</w:t>
       </w:r>
       <w:r>
         <w:rPr>
@@ -2493,7 +2541,7 @@
           <w:sz w:val="24"/>
           <w:szCs w:val="24"/>
         </w:rPr>
-        <w:t xml:space="preserve">(4), 455-458. https://doi.org/10.1093/sleep/26.4.455</w:t>
+        <w:t xml:space="preserve">, 1598. https://doi.org/10.1186/s12889-021-11640-9</w:t>
       </w:r>
     </w:p>
     <w:p>
@@ -2511,7 +2559,7 @@
           <w:sz w:val="24"/>
           <w:szCs w:val="24"/>
         </w:rPr>
-        <w:t xml:space="preserve">Ghanamah, R., Eghbaria-Ghanamah, H., Abu-Saleh, N., &amp; Kitany, S. (2023). Parents' perceptions of changes in sleep duration, physical activity, and sedentary behavior in Arab Israeli children during the COVID-19 outbreak. </w:t>
+        <w:t xml:space="preserve">Saccani, M. S., Ursumando, L., Di Vara, S., Lazzaro, G., Varuzza, C., Vicari, S., &amp; Menghini, D. (2022). Sleep disturbances in children with attentional deficit hyperactivity disorder and specific learning disorders. </w:t>
       </w:r>
       <w:r>
         <w:rPr>
@@ -2521,7 +2569,7 @@
           <w:sz w:val="24"/>
           <w:szCs w:val="24"/>
         </w:rPr>
-        <w:t xml:space="preserve">International Journal of Environmental Research and Public Health, 20</w:t>
+        <w:t xml:space="preserve">International Journal of Environmental Research and Public Health, 19</w:t>
       </w:r>
       <w:r>
         <w:rPr>
@@ -2531,577 +2579,7 @@
           <w:sz w:val="24"/>
           <w:szCs w:val="24"/>
         </w:rPr>
-        <w:t xml:space="preserve">(11), 6041. https://doi.org/10.3390/ijerph20116041</w:t>
-      </w:r>
-    </w:p>
-    <w:p>
-      <w:pPr>
-        <w:bidi w:val="false"/>
-        <w:spacing w:after="120" w:line="360"/>
-        <w:ind w:left="709" w:hanging="709"/>
-        <w:jc w:val="left"/>
-      </w:pPr>
-      <w:r>
-        <w:rPr>
-          <w:rFonts w:ascii="Times New Roman" w:cs="Times New Roman" w:hAnsi="Times New Roman"/>
-          <w:i w:val="false"/>
-          <w:iCs w:val="false"/>
-          <w:sz w:val="24"/>
-          <w:szCs w:val="24"/>
-        </w:rPr>
-        <w:t xml:space="preserve">Howie, E. K., Joosten, J., Harris, C. J., &amp; Straker, L. M. (2020). Associations between meeting sleep, physical activity or screen time behaviour guidelines and academic performance in Australian school children. </w:t>
-      </w:r>
-      <w:r>
-        <w:rPr>
-          <w:rFonts w:ascii="Times New Roman" w:cs="Times New Roman" w:hAnsi="Times New Roman"/>
-          <w:i/>
-          <w:iCs/>
-          <w:sz w:val="24"/>
-          <w:szCs w:val="24"/>
-        </w:rPr>
-        <w:t xml:space="preserve">BMC Public Health, 20</w:t>
-      </w:r>
-      <w:r>
-        <w:rPr>
-          <w:rFonts w:ascii="Times New Roman" w:cs="Times New Roman" w:hAnsi="Times New Roman"/>
-          <w:i w:val="false"/>
-          <w:iCs w:val="false"/>
-          <w:sz w:val="24"/>
-          <w:szCs w:val="24"/>
-        </w:rPr>
-        <w:t xml:space="preserve">, 520. https://doi.org/10.1186/s12889-020-08620-w</w:t>
-      </w:r>
-    </w:p>
-    <w:p>
-      <w:pPr>
-        <w:bidi w:val="false"/>
-        <w:spacing w:after="120" w:line="360"/>
-        <w:ind w:left="709" w:hanging="709"/>
-        <w:jc w:val="left"/>
-      </w:pPr>
-      <w:r>
-        <w:rPr>
-          <w:rFonts w:ascii="Times New Roman" w:cs="Times New Roman" w:hAnsi="Times New Roman"/>
-          <w:i w:val="false"/>
-          <w:iCs w:val="false"/>
-          <w:sz w:val="24"/>
-          <w:szCs w:val="24"/>
-        </w:rPr>
-        <w:t xml:space="preserve">Jeffcock, K., &amp; Dimitriou, D. (2025). A community study on sleep characteristics and anxiety symptoms in children with dyslexia. </w:t>
-      </w:r>
-      <w:r>
-        <w:rPr>
-          <w:rFonts w:ascii="Times New Roman" w:cs="Times New Roman" w:hAnsi="Times New Roman"/>
-          <w:i/>
-          <w:iCs/>
-          <w:sz w:val="24"/>
-          <w:szCs w:val="24"/>
-        </w:rPr>
-        <w:t xml:space="preserve">Brain Sciences, 15</w:t>
-      </w:r>
-      <w:r>
-        <w:rPr>
-          <w:rFonts w:ascii="Times New Roman" w:cs="Times New Roman" w:hAnsi="Times New Roman"/>
-          <w:i w:val="false"/>
-          <w:iCs w:val="false"/>
-          <w:sz w:val="24"/>
-          <w:szCs w:val="24"/>
-        </w:rPr>
-        <w:t xml:space="preserve">(7), 711. https://doi.org/10.3390/brainsci15070711</w:t>
-      </w:r>
-    </w:p>
-    <w:p>
-      <w:pPr>
-        <w:bidi w:val="false"/>
-        <w:spacing w:after="120" w:line="360"/>
-        <w:ind w:left="709" w:hanging="709"/>
-        <w:jc w:val="left"/>
-      </w:pPr>
-      <w:r>
-        <w:rPr>
-          <w:rFonts w:ascii="Times New Roman" w:cs="Times New Roman" w:hAnsi="Times New Roman"/>
-          <w:i w:val="false"/>
-          <w:iCs w:val="false"/>
-          <w:sz w:val="24"/>
-          <w:szCs w:val="24"/>
-        </w:rPr>
-        <w:t xml:space="preserve">Kocabas, S., Adak, I., Karakus, O. B., &amp; Toksoy, Z. E. (2025). Learning disability as a determinant of digital behavior in adolescents with ADHD: A cross-sectional study. </w:t>
-      </w:r>
-      <w:r>
-        <w:rPr>
-          <w:rFonts w:ascii="Times New Roman" w:cs="Times New Roman" w:hAnsi="Times New Roman"/>
-          <w:i/>
-          <w:iCs/>
-          <w:sz w:val="24"/>
-          <w:szCs w:val="24"/>
-        </w:rPr>
-        <w:t xml:space="preserve">European Child &amp; Adolescent Psychiatry, 34</w:t>
-      </w:r>
-      <w:r>
-        <w:rPr>
-          <w:rFonts w:ascii="Times New Roman" w:cs="Times New Roman" w:hAnsi="Times New Roman"/>
-          <w:i w:val="false"/>
-          <w:iCs w:val="false"/>
-          <w:sz w:val="24"/>
-          <w:szCs w:val="24"/>
-        </w:rPr>
-        <w:t xml:space="preserve">(12), 3999-4007. https://doi.org/10.1007/s00787-025-02802-w</w:t>
-      </w:r>
-    </w:p>
-    <w:p>
-      <w:pPr>
-        <w:bidi w:val="false"/>
-        <w:spacing w:after="120" w:line="360"/>
-        <w:ind w:left="709" w:hanging="709"/>
-        <w:jc w:val="left"/>
-      </w:pPr>
-      <w:r>
-        <w:rPr>
-          <w:rFonts w:ascii="Times New Roman" w:cs="Times New Roman" w:hAnsi="Times New Roman"/>
-          <w:i w:val="false"/>
-          <w:iCs w:val="false"/>
-          <w:sz w:val="24"/>
-          <w:szCs w:val="24"/>
-        </w:rPr>
-        <w:t xml:space="preserve">Korcz, A., Krzysztoszek, J., Bronikowski, M., Łopatka, M., &amp; Bojkowski, Ł. (2023). Associations between physical activity, screen time, sleep time and selected academic skills in 8/9-year-old children. </w:t>
-      </w:r>
-      <w:r>
-        <w:rPr>
-          <w:rFonts w:ascii="Times New Roman" w:cs="Times New Roman" w:hAnsi="Times New Roman"/>
-          <w:i/>
-          <w:iCs/>
-          <w:sz w:val="24"/>
-          <w:szCs w:val="24"/>
-        </w:rPr>
-        <w:t xml:space="preserve">BMC Public Health, 23</w:t>
-      </w:r>
-      <w:r>
-        <w:rPr>
-          <w:rFonts w:ascii="Times New Roman" w:cs="Times New Roman" w:hAnsi="Times New Roman"/>
-          <w:i w:val="false"/>
-          <w:iCs w:val="false"/>
-          <w:sz w:val="24"/>
-          <w:szCs w:val="24"/>
-        </w:rPr>
-        <w:t xml:space="preserve">, 1335. https://doi.org/10.1186/s12889-023-16230-5</w:t>
-      </w:r>
-    </w:p>
-    <w:p>
-      <w:pPr>
-        <w:bidi w:val="false"/>
-        <w:spacing w:after="120" w:line="360"/>
-        <w:ind w:left="709" w:hanging="709"/>
-        <w:jc w:val="left"/>
-      </w:pPr>
-      <w:r>
-        <w:rPr>
-          <w:rFonts w:ascii="Times New Roman" w:cs="Times New Roman" w:hAnsi="Times New Roman"/>
-          <w:i w:val="false"/>
-          <w:iCs w:val="false"/>
-          <w:sz w:val="24"/>
-          <w:szCs w:val="24"/>
-        </w:rPr>
-        <w:t xml:space="preserve">Kowalski, K. C., Crocker, P. R. E., &amp; Donen, R. M. (2004). </w:t>
-      </w:r>
-      <w:r>
-        <w:rPr>
-          <w:rFonts w:ascii="Times New Roman" w:cs="Times New Roman" w:hAnsi="Times New Roman"/>
-          <w:i/>
-          <w:iCs/>
-          <w:sz w:val="24"/>
-          <w:szCs w:val="24"/>
-        </w:rPr>
-        <w:t xml:space="preserve">The Physical Activity Questionnaire for Older Children (PAQ-C) and Adolescents (PAQ-A) manual</w:t>
-      </w:r>
-      <w:r>
-        <w:rPr>
-          <w:rFonts w:ascii="Times New Roman" w:cs="Times New Roman" w:hAnsi="Times New Roman"/>
-          <w:i w:val="false"/>
-          <w:iCs w:val="false"/>
-          <w:sz w:val="24"/>
-          <w:szCs w:val="24"/>
-        </w:rPr>
-        <w:t xml:space="preserve">. College of Kinesiology, University of Saskatchewan.</w:t>
-      </w:r>
-    </w:p>
-    <w:p>
-      <w:pPr>
-        <w:bidi w:val="false"/>
-        <w:spacing w:after="120" w:line="360"/>
-        <w:ind w:left="709" w:hanging="709"/>
-        <w:jc w:val="left"/>
-      </w:pPr>
-      <w:r>
-        <w:rPr>
-          <w:rFonts w:ascii="Times New Roman" w:cs="Times New Roman" w:hAnsi="Times New Roman"/>
-          <w:i w:val="false"/>
-          <w:iCs w:val="false"/>
-          <w:sz w:val="24"/>
-          <w:szCs w:val="24"/>
-        </w:rPr>
-        <w:t xml:space="preserve">Lund, L., Sølvhøj, I. N., Danielsen, D., &amp; Andersen, S. (2021). Electronic media use and sleep in children and adolescents in western countries: A systematic review. </w:t>
-      </w:r>
-      <w:r>
-        <w:rPr>
-          <w:rFonts w:ascii="Times New Roman" w:cs="Times New Roman" w:hAnsi="Times New Roman"/>
-          <w:i/>
-          <w:iCs/>
-          <w:sz w:val="24"/>
-          <w:szCs w:val="24"/>
-        </w:rPr>
-        <w:t xml:space="preserve">BMC Public Health, 21</w:t>
-      </w:r>
-      <w:r>
-        <w:rPr>
-          <w:rFonts w:ascii="Times New Roman" w:cs="Times New Roman" w:hAnsi="Times New Roman"/>
-          <w:i w:val="false"/>
-          <w:iCs w:val="false"/>
-          <w:sz w:val="24"/>
-          <w:szCs w:val="24"/>
-        </w:rPr>
-        <w:t xml:space="preserve">, 1598. https://doi.org/10.1186/s12889-021-11640-9</w:t>
-      </w:r>
-    </w:p>
-    <w:p>
-      <w:pPr>
-        <w:bidi w:val="false"/>
-        <w:spacing w:after="120" w:line="360"/>
-        <w:ind w:left="709" w:hanging="709"/>
-        <w:jc w:val="left"/>
-      </w:pPr>
-      <w:r>
-        <w:rPr>
-          <w:rFonts w:ascii="Times New Roman" w:cs="Times New Roman" w:hAnsi="Times New Roman"/>
-          <w:i w:val="false"/>
-          <w:iCs w:val="false"/>
-          <w:sz w:val="24"/>
-          <w:szCs w:val="24"/>
-        </w:rPr>
-        <w:t xml:space="preserve">Macchitella, L., Marinelli, C. V., Signore, F., Ciavolino, E., &amp; Angelelli, P. (2020). Sleepiness, neuropsychological skills, and scholastic learning in children. </w:t>
-      </w:r>
-      <w:r>
-        <w:rPr>
-          <w:rFonts w:ascii="Times New Roman" w:cs="Times New Roman" w:hAnsi="Times New Roman"/>
-          <w:i/>
-          <w:iCs/>
-          <w:sz w:val="24"/>
-          <w:szCs w:val="24"/>
-        </w:rPr>
-        <w:t xml:space="preserve">Brain Sciences, 10</w:t>
-      </w:r>
-      <w:r>
-        <w:rPr>
-          <w:rFonts w:ascii="Times New Roman" w:cs="Times New Roman" w:hAnsi="Times New Roman"/>
-          <w:i w:val="false"/>
-          <w:iCs w:val="false"/>
-          <w:sz w:val="24"/>
-          <w:szCs w:val="24"/>
-        </w:rPr>
-        <w:t xml:space="preserve">(8), 529. https://doi.org/10.3390/brainsci10080529</w:t>
-      </w:r>
-    </w:p>
-    <w:p>
-      <w:pPr>
-        <w:bidi w:val="false"/>
-        <w:spacing w:after="120" w:line="360"/>
-        <w:ind w:left="709" w:hanging="709"/>
-        <w:jc w:val="left"/>
-      </w:pPr>
-      <w:r>
-        <w:rPr>
-          <w:rFonts w:ascii="Times New Roman" w:cs="Times New Roman" w:hAnsi="Times New Roman"/>
-          <w:i w:val="false"/>
-          <w:iCs w:val="false"/>
-          <w:sz w:val="24"/>
-          <w:szCs w:val="24"/>
-        </w:rPr>
-        <w:t xml:space="preserve">Qu, G., Hu, W., Meng, J., Wang, X., Su, W., Liu, H., Ma, S., Sun, C., Huang, C., Lowe, S., &amp; Sun, Y. (2023). Association between screen time and developmental and behavioral problems among children in the United States: Evidence from 2018 to 2020 NSCH. </w:t>
-      </w:r>
-      <w:r>
-        <w:rPr>
-          <w:rFonts w:ascii="Times New Roman" w:cs="Times New Roman" w:hAnsi="Times New Roman"/>
-          <w:i/>
-          <w:iCs/>
-          <w:sz w:val="24"/>
-          <w:szCs w:val="24"/>
-        </w:rPr>
-        <w:t xml:space="preserve">Journal of Psychiatric Research, 161</w:t>
-      </w:r>
-      <w:r>
-        <w:rPr>
-          <w:rFonts w:ascii="Times New Roman" w:cs="Times New Roman" w:hAnsi="Times New Roman"/>
-          <w:i w:val="false"/>
-          <w:iCs w:val="false"/>
-          <w:sz w:val="24"/>
-          <w:szCs w:val="24"/>
-        </w:rPr>
-        <w:t xml:space="preserve">, 140-149. https://doi.org/10.1016/j.jpsychires.2023.03.014</w:t>
-      </w:r>
-    </w:p>
-    <w:p>
-      <w:pPr>
-        <w:bidi w:val="false"/>
-        <w:spacing w:after="120" w:line="360"/>
-        <w:ind w:left="709" w:hanging="709"/>
-        <w:jc w:val="left"/>
-      </w:pPr>
-      <w:r>
-        <w:rPr>
-          <w:rFonts w:ascii="Times New Roman" w:cs="Times New Roman" w:hAnsi="Times New Roman"/>
-          <w:i w:val="false"/>
-          <w:iCs w:val="false"/>
-          <w:sz w:val="24"/>
-          <w:szCs w:val="24"/>
-        </w:rPr>
-        <w:t xml:space="preserve">Saccani, M. S., Ursumando, L., Di Vara, S., Lazzaro, G., Varuzza, C., Vicari, S., &amp; Menghini, D. (2022). Sleep disturbances in children with attentional deficit hyperactivity disorder and specific learning disorders. </w:t>
-      </w:r>
-      <w:r>
-        <w:rPr>
-          <w:rFonts w:ascii="Times New Roman" w:cs="Times New Roman" w:hAnsi="Times New Roman"/>
-          <w:i/>
-          <w:iCs/>
-          <w:sz w:val="24"/>
-          <w:szCs w:val="24"/>
-        </w:rPr>
-        <w:t xml:space="preserve">International Journal of Environmental Research and Public Health, 19</w:t>
-      </w:r>
-      <w:r>
-        <w:rPr>
-          <w:rFonts w:ascii="Times New Roman" w:cs="Times New Roman" w:hAnsi="Times New Roman"/>
-          <w:i w:val="false"/>
-          <w:iCs w:val="false"/>
-          <w:sz w:val="24"/>
-          <w:szCs w:val="24"/>
-        </w:rPr>
         <w:t xml:space="preserve">(11), 6411. https://doi.org/10.3390/ijerph19116411</w:t>
-      </w:r>
-    </w:p>
-    <w:p>
-      <w:pPr>
-        <w:bidi w:val="false"/>
-        <w:spacing w:after="120" w:line="360"/>
-        <w:ind w:left="709" w:hanging="709"/>
-        <w:jc w:val="left"/>
-      </w:pPr>
-      <w:r>
-        <w:rPr>
-          <w:rFonts w:ascii="Times New Roman" w:cs="Times New Roman" w:hAnsi="Times New Roman"/>
-          <w:i w:val="false"/>
-          <w:iCs w:val="false"/>
-          <w:sz w:val="24"/>
-          <w:szCs w:val="24"/>
-        </w:rPr>
-        <w:t xml:space="preserve">Santos, R. M. S., Mendes, C. G., Bressani, G. Y. S., Ventura, S. A., Nogueira, Y. J. A., Miranda, D. M., &amp; Romano-Silva, M. A. (2023). The associations between screen time and mental health in adolescents: A systematic review. </w:t>
-      </w:r>
-      <w:r>
-        <w:rPr>
-          <w:rFonts w:ascii="Times New Roman" w:cs="Times New Roman" w:hAnsi="Times New Roman"/>
-          <w:i/>
-          <w:iCs/>
-          <w:sz w:val="24"/>
-          <w:szCs w:val="24"/>
-        </w:rPr>
-        <w:t xml:space="preserve">BMC Psychology, 11</w:t>
-      </w:r>
-      <w:r>
-        <w:rPr>
-          <w:rFonts w:ascii="Times New Roman" w:cs="Times New Roman" w:hAnsi="Times New Roman"/>
-          <w:i w:val="false"/>
-          <w:iCs w:val="false"/>
-          <w:sz w:val="24"/>
-          <w:szCs w:val="24"/>
-        </w:rPr>
-        <w:t xml:space="preserve">, 127. https://doi.org/10.1186/s40359-023-01166-7</w:t>
-      </w:r>
-    </w:p>
-    <w:p>
-      <w:pPr>
-        <w:bidi w:val="false"/>
-        <w:spacing w:after="120" w:line="360"/>
-        <w:ind w:left="709" w:hanging="709"/>
-        <w:jc w:val="left"/>
-      </w:pPr>
-      <w:r>
-        <w:rPr>
-          <w:rFonts w:ascii="Times New Roman" w:cs="Times New Roman" w:hAnsi="Times New Roman"/>
-          <w:i w:val="false"/>
-          <w:iCs w:val="false"/>
-          <w:sz w:val="24"/>
-          <w:szCs w:val="24"/>
-        </w:rPr>
-        <w:t xml:space="preserve">Shochat, T., Flint-Bretler, O., &amp; Tzischinsky, O. (2010). Sleep patterns, electronic media exposure and daytime sleep-related behaviours among Israeli adolescents. </w:t>
-      </w:r>
-      <w:r>
-        <w:rPr>
-          <w:rFonts w:ascii="Times New Roman" w:cs="Times New Roman" w:hAnsi="Times New Roman"/>
-          <w:i/>
-          <w:iCs/>
-          <w:sz w:val="24"/>
-          <w:szCs w:val="24"/>
-        </w:rPr>
-        <w:t xml:space="preserve">Acta Paediatrica, 99</w:t>
-      </w:r>
-      <w:r>
-        <w:rPr>
-          <w:rFonts w:ascii="Times New Roman" w:cs="Times New Roman" w:hAnsi="Times New Roman"/>
-          <w:i w:val="false"/>
-          <w:iCs w:val="false"/>
-          <w:sz w:val="24"/>
-          <w:szCs w:val="24"/>
-        </w:rPr>
-        <w:t xml:space="preserve">(9), 1396-1400. https://doi.org/10.1111/j.1651-2227.2010.01821.x</w:t>
-      </w:r>
-    </w:p>
-    <w:p>
-      <w:pPr>
-        <w:bidi w:val="false"/>
-        <w:spacing w:after="120" w:line="360"/>
-        <w:ind w:left="709" w:hanging="709"/>
-        <w:jc w:val="left"/>
-      </w:pPr>
-      <w:r>
-        <w:rPr>
-          <w:rFonts w:ascii="Times New Roman" w:cs="Times New Roman" w:hAnsi="Times New Roman"/>
-          <w:i w:val="false"/>
-          <w:iCs w:val="false"/>
-          <w:sz w:val="24"/>
-          <w:szCs w:val="24"/>
-        </w:rPr>
-        <w:t xml:space="preserve">Tapia-Serrano, M. A., Sevil-Serrano, J., Sánchez-Miguel, P. A., López-Gil, J. F., Tremblay, M. S., &amp; García-Hermoso, A. (2022). Prevalence of meeting 24-hour movement guidelines from pre-school to adolescence: A systematic review and meta-analysis including 387,437 participants and 23 countries. </w:t>
-      </w:r>
-      <w:r>
-        <w:rPr>
-          <w:rFonts w:ascii="Times New Roman" w:cs="Times New Roman" w:hAnsi="Times New Roman"/>
-          <w:i/>
-          <w:iCs/>
-          <w:sz w:val="24"/>
-          <w:szCs w:val="24"/>
-        </w:rPr>
-        <w:t xml:space="preserve">Journal of Sport and Health Science, 11</w:t>
-      </w:r>
-      <w:r>
-        <w:rPr>
-          <w:rFonts w:ascii="Times New Roman" w:cs="Times New Roman" w:hAnsi="Times New Roman"/>
-          <w:i w:val="false"/>
-          <w:iCs w:val="false"/>
-          <w:sz w:val="24"/>
-          <w:szCs w:val="24"/>
-        </w:rPr>
-        <w:t xml:space="preserve">(4), 427-437. https://doi.org/10.1016/j.jshs.2022.01.005</w:t>
-      </w:r>
-    </w:p>
-    <w:p>
-      <w:pPr>
-        <w:bidi w:val="false"/>
-        <w:spacing w:after="120" w:line="360"/>
-        <w:ind w:left="709" w:hanging="709"/>
-        <w:jc w:val="left"/>
-      </w:pPr>
-      <w:r>
-        <w:rPr>
-          <w:rFonts w:ascii="Times New Roman" w:cs="Times New Roman" w:hAnsi="Times New Roman"/>
-          <w:i w:val="false"/>
-          <w:iCs w:val="false"/>
-          <w:sz w:val="24"/>
-          <w:szCs w:val="24"/>
-        </w:rPr>
-        <w:t xml:space="preserve">Tremblay, M. S., Carson, V., Chaput, J.-P., Connor Gorber, S., Dinh, T., Duggan, M., Faulkner, G., Gray, C. E., Gruber, R., Janson, K., Janssen, I., Katzmarzyk, P. T., Kho, M. E., Latimer-Cheung, A. E., LeBlanc, C., Okely, A. D., Olds, T., Pate, R. R., Phillips, A., ... Zehr, L. (2016). Canadian 24-hour movement guidelines for children and youth: An integration of physical activity, sedentary behaviour, and sleep. </w:t>
-      </w:r>
-      <w:r>
-        <w:rPr>
-          <w:rFonts w:ascii="Times New Roman" w:cs="Times New Roman" w:hAnsi="Times New Roman"/>
-          <w:i/>
-          <w:iCs/>
-          <w:sz w:val="24"/>
-          <w:szCs w:val="24"/>
-        </w:rPr>
-        <w:t xml:space="preserve">Applied Physiology, Nutrition, and Metabolism, 41</w:t>
-      </w:r>
-      <w:r>
-        <w:rPr>
-          <w:rFonts w:ascii="Times New Roman" w:cs="Times New Roman" w:hAnsi="Times New Roman"/>
-          <w:i w:val="false"/>
-          <w:iCs w:val="false"/>
-          <w:sz w:val="24"/>
-          <w:szCs w:val="24"/>
-        </w:rPr>
-        <w:t xml:space="preserve">(6, Suppl. 3), S311-S327. https://doi.org/10.1139/apnm-2016-0151</w:t>
-      </w:r>
-    </w:p>
-    <w:p>
-      <w:pPr>
-        <w:bidi w:val="false"/>
-        <w:spacing w:after="120" w:line="360"/>
-        <w:ind w:left="709" w:hanging="709"/>
-        <w:jc w:val="left"/>
-      </w:pPr>
-      <w:r>
-        <w:rPr>
-          <w:rFonts w:ascii="Times New Roman" w:cs="Times New Roman" w:hAnsi="Times New Roman"/>
-          <w:i w:val="false"/>
-          <w:iCs w:val="false"/>
-          <w:sz w:val="24"/>
-          <w:szCs w:val="24"/>
-        </w:rPr>
-        <w:t xml:space="preserve">Vanderloo, L. M., et al. (2025). Screen time among children and youth with disabilities: A systematic review and meta-analysis. </w:t>
-      </w:r>
-      <w:r>
-        <w:rPr>
-          <w:rFonts w:ascii="Times New Roman" w:cs="Times New Roman" w:hAnsi="Times New Roman"/>
-          <w:i/>
-          <w:iCs/>
-          <w:sz w:val="24"/>
-          <w:szCs w:val="24"/>
-        </w:rPr>
-        <w:t xml:space="preserve">Child: Care, Health and Development, 51</w:t>
-      </w:r>
-      <w:r>
-        <w:rPr>
-          <w:rFonts w:ascii="Times New Roman" w:cs="Times New Roman" w:hAnsi="Times New Roman"/>
-          <w:i w:val="false"/>
-          <w:iCs w:val="false"/>
-          <w:sz w:val="24"/>
-          <w:szCs w:val="24"/>
-        </w:rPr>
-        <w:t xml:space="preserve">(4), e70136. https://doi.org/10.1111/cch.70136 [להשלים את רשימת המחברים המלאה מהמאמר]</w:t>
-      </w:r>
-    </w:p>
-    <w:p>
-      <w:pPr>
-        <w:bidi w:val="false"/>
-        <w:spacing w:after="120" w:line="360"/>
-        <w:ind w:left="709" w:hanging="709"/>
-        <w:jc w:val="left"/>
-      </w:pPr>
-      <w:r>
-        <w:rPr>
-          <w:rFonts w:ascii="Times New Roman" w:cs="Times New Roman" w:hAnsi="Times New Roman"/>
-          <w:i w:val="false"/>
-          <w:iCs w:val="false"/>
-          <w:sz w:val="24"/>
-          <w:szCs w:val="24"/>
-        </w:rPr>
-        <w:t xml:space="preserve">Wang, T., Li, W., Deng, J., Zhang, Q., Liu, Y., &amp; Zheng, H. (2024). The impact of the physical activity intervention on sleep in children and adolescents with neurodevelopmental disorders: A systematic review and meta-analysis. </w:t>
-      </w:r>
-      <w:r>
-        <w:rPr>
-          <w:rFonts w:ascii="Times New Roman" w:cs="Times New Roman" w:hAnsi="Times New Roman"/>
-          <w:i/>
-          <w:iCs/>
-          <w:sz w:val="24"/>
-          <w:szCs w:val="24"/>
-        </w:rPr>
-        <w:t xml:space="preserve">Frontiers in Neurology, 15</w:t>
-      </w:r>
-      <w:r>
-        <w:rPr>
-          <w:rFonts w:ascii="Times New Roman" w:cs="Times New Roman" w:hAnsi="Times New Roman"/>
-          <w:i w:val="false"/>
-          <w:iCs w:val="false"/>
-          <w:sz w:val="24"/>
-          <w:szCs w:val="24"/>
-        </w:rPr>
-        <w:t xml:space="preserve">, 1438786. https://doi.org/10.3389/fneur.2024.1438786</w:t>
       </w:r>
     </w:p>
     <w:p>
@@ -3979,7 +3457,7 @@
           <w:szCs w:val="24"/>
           <w:rtl/>
         </w:rPr>
-        <w:t xml:space="preserve">סולם הישנוניות היומית (Drake et al., 2003), תרגום לעברית לצורך המחקר. לכל שאלה סמן/י: 0 = אף פעם, 1 = לעיתים רחוקות, 2 = לפעמים, 3 = לעיתים קרובות, 4 = תמיד.</w:t>
+        <w:t xml:space="preserve">סולם ישנוניות יומית. לכל שאלה סמן/י: 0 = אף פעם, 1 = לעיתים רחוקות, 2 = לפעמים, 3 = לעיתים קרובות, 4 = תמיד.</w:t>
       </w:r>
     </w:p>
     <w:p>
@@ -4183,7 +3661,7 @@
           <w:szCs w:val="24"/>
           <w:rtl/>
         </w:rPr>
-        <w:t xml:space="preserve">שאלון הפעילות הגופנית למתבגרים (Kowalski et al., 2004), תרגום לעברית לצורך המחקר. השאלות מתייחסות לשבעת הימים האחרונים.</w:t>
+        <w:t xml:space="preserve">פעילות גופנית היא כל פעילות שמעלה את הדופק ומקשה על הנשימה, למשל ריצה, הליכה מהירה, רכיבה על אופניים, ריקוד, משחקי כדור, שחייה או אימון.</w:t>
       </w:r>
     </w:p>
     <w:p>
@@ -4204,7 +3682,7 @@
           <w:szCs w:val="24"/>
           <w:rtl/>
         </w:rPr>
-        <w:t xml:space="preserve">בשבוע האחרון, כמה פעמים עסקת בכל אחת מהפעילויות הבאות: ריצה, הליכה מהירה, רכיבה על אופניים, כדורגל, כדורסל, שחייה, ריקוד, חדר כושר, אומנויות לחימה, אחר? (לכל פעילות: אף פעם / 1-2 / 3-4 / 5-6 / 7 ומעלה)</w:t>
+        <w:t xml:space="preserve">בשבוע האחרון, כמה ימים היית פעיל/ה גופנית במשך 60 דקות לפחות ביום (בסך הכול)? 0 / 1 / 2 / 3 / 4 / 5 / 6 / 7</w:t>
       </w:r>
     </w:p>
     <w:p>
@@ -4225,7 +3703,7 @@
           <w:szCs w:val="24"/>
           <w:rtl/>
         </w:rPr>
-        <w:t xml:space="preserve">בשבוע האחרון, בשיעורי חינוך גופני, באיזו מידה היית פעיל/ה מאוד (משחק, ריצה, קפיצה)? לא השתתפתי / כמעט אף פעם / לפעמים / לעיתים קרובות / תמיד</w:t>
+        <w:t xml:space="preserve">מחוץ לשעות הלימודים, באיזו תדירות את/ה עוסק/ת בפעילות גופנית נמרצת שגורמת לך להתנשף או להזיע? כל יום / 4-6 פעמים בשבוע / 2-3 פעמים בשבוע / פעם בשבוע / פעם בחודש / פחות מפעם בחודש / אף פעם</w:t>
       </w:r>
     </w:p>
     <w:p>
@@ -4246,7 +3724,7 @@
           <w:szCs w:val="24"/>
           <w:rtl/>
         </w:rPr>
-        <w:t xml:space="preserve">בשבוע האחרון, מה עשית בדרך כלל בהפסקות? ישבתי / עמדתי או הסתובבתי / רצתי או שיחקתי מעט / רצתי או שיחקתי די הרבה / רצתי או שיחקתי רוב הזמן</w:t>
+        <w:t xml:space="preserve">מחוץ לשעות הלימודים, כמה שעות בשבוע את/ה עוסק/ת בפעילות גופנית נמרצת? אף שעה / כחצי שעה / כשעה / 2-3 שעות / 4-6 שעות / 7 שעות ומעלה</w:t>
       </w:r>
     </w:p>
     <w:p>
@@ -4267,7 +3745,7 @@
           <w:szCs w:val="24"/>
           <w:rtl/>
         </w:rPr>
-        <w:t xml:space="preserve">בשבוע האחרון, כמה ימים אחרי בית הספר עסקת בספורט, במשחק או בפעילות שבה היית פעיל/ה מאוד? 0 / 1 / 2-3 / 4 / 5</w:t>
+        <w:t xml:space="preserve">האם את/ה משתתף/ת בחוג ספורט, בקבוצה או באימונים קבועים? לא / כן, לא תחרותי (חוג או פעילות להנאה) / כן, תחרותי (קבוצה או תחרויות)</w:t>
       </w:r>
     </w:p>
     <w:p>
@@ -4288,7 +3766,7 @@
           <w:szCs w:val="24"/>
           <w:rtl/>
         </w:rPr>
-        <w:t xml:space="preserve">בשבוע האחרון, כמה ערבים עסקת בספורט, במשחק או בפעילות שבה היית פעיל/ה מאוד? 0 / 1 / 2-3 / 4-5 / 6-7</w:t>
+        <w:t xml:space="preserve">בשיעורי חינוך גופני, באיזו מידה את/ה פעיל/ה מאוד (משחק, ריצה, קפיצה)? לא משתתף/ת / כמעט אף פעם / לפעמים / לעיתים קרובות / תמיד</w:t>
       </w:r>
     </w:p>
     <w:p>
@@ -4309,49 +3787,7 @@
           <w:szCs w:val="24"/>
           <w:rtl/>
         </w:rPr>
-        <w:t xml:space="preserve">בסוף השבוע האחרון, כמה פעמים עסקת בספורט, במשחק או בפעילות שבה היית פעיל/ה מאוד? 0 / 1 / 2-3 / 4-5 / 6 ומעלה</w:t>
-      </w:r>
-    </w:p>
-    <w:p>
-      <w:pPr>
-        <w:pStyle w:val="ListParagraph"/>
-        <w:numPr>
-          <w:ilvl w:val="0"/>
-          <w:numId w:val="10"/>
-        </w:numPr>
-        <w:bidi/>
-        <w:spacing w:after="60" w:line="360"/>
-        <w:jc w:val="both"/>
-      </w:pPr>
-      <w:r>
-        <w:rPr>
-          <w:rFonts w:ascii="Times New Roman" w:cs="David" w:eastAsia="David" w:hAnsi="Times New Roman"/>
-          <w:sz w:val="24"/>
-          <w:szCs w:val="24"/>
-          <w:rtl/>
-        </w:rPr>
-        <w:t xml:space="preserve">איזה מהמשפטים מתאר אותך בצורה הטובה ביותר בשבוע האחרון? רוב זמני הפנוי שלי עבר בפעילויות עם מעט מאמץ גופני / לפעמים (1-2 פעמים) עשיתי פעילות גופנית בזמני הפנוי / לעיתים קרובות (3-4 פעמים) / די הרבה (5-6 פעמים) / לעיתים קרובות מאוד (7 פעמים ומעלה)</w:t>
-      </w:r>
-    </w:p>
-    <w:p>
-      <w:pPr>
-        <w:pStyle w:val="ListParagraph"/>
-        <w:numPr>
-          <w:ilvl w:val="0"/>
-          <w:numId w:val="10"/>
-        </w:numPr>
-        <w:bidi/>
-        <w:spacing w:after="60" w:line="360"/>
-        <w:jc w:val="both"/>
-      </w:pPr>
-      <w:r>
-        <w:rPr>
-          <w:rFonts w:ascii="Times New Roman" w:cs="David" w:eastAsia="David" w:hAnsi="Times New Roman"/>
-          <w:sz w:val="24"/>
-          <w:szCs w:val="24"/>
-          <w:rtl/>
-        </w:rPr>
-        <w:t xml:space="preserve">בשבוע האחרון, כמה ימים היית פעיל/ה גופנית במשך 60 דקות לפחות ביום (בסך הכול, כולל הליכה מהירה, ספורט ומשחקים)? 0 / 1 / 2 / 3 / 4 / 5 / 6 / 7</w:t>
+        <w:t xml:space="preserve">עד כמה את/ה אוהב/ת את שיעורי החינוך הגופני? כלל לא / במידה מועטה / במידה בינונית / במידה רבה / במידה רבה מאוד</w:t>
       </w:r>
     </w:p>
     <w:p>

</xml_diff>